<commit_message>
docs(§11.4.153 ledger rev3 + CONTINUATION rev77): DOCX→Implemented(real-artifact), -multipass→video-confirmed, cli atomic-write noted
Ledger re-sync after the gap-closure batch (87cd2be/d53e085): video-confirmed 20→21 + 1 real-artifact-confirmed (DOCX, file=Microsoft Word 2007+, not video-claimed §11.4.6); not-implemented gap rows 2→1; Implemented 463→464. Status.md/Status_Summary.md Rev 2→3, docs_chain verify features in-sync RC=0 (HTML+PDF+DOCX). -multipass row → video-confirmed (helixtranslate-cli-multipass-verify-20260615.mp4, ffprobe 888x630/93f/9.3s). cmd/cli atomic-write + title fixes noted. CONTINUATION Rev 76→77. README html/pdf refreshed (shared docs_chain tracked_docs context).

Co-Authored-By: Claude Opus 4.8 <noreply@anthropic.com>
</commit_message>
<xml_diff>
--- a/docs/features/Status.docx
+++ b/docs/features/Status.docx
@@ -34,7 +34,7 @@
         <w:t xml:space="preserve"> </w:t>
       </w:r>
       <w:r>
-        <w:t xml:space="preserve">2</w:t>
+        <w:t xml:space="preserve">3</w:t>
       </w:r>
       <w:r>
         <w:t xml:space="preserve"> </w:t>
@@ -50,7 +50,7 @@
         <w:t xml:space="preserve"> </w:t>
       </w:r>
       <w:r>
-        <w:t xml:space="preserve">2026-06-15T17:30:00Z</w:t>
+        <w:t xml:space="preserve">2026-06-15T18:45:00Z</w:t>
       </w:r>
       <w:r>
         <w:t xml:space="preserve"> </w:t>
@@ -192,7 +192,7 @@
           <w:b/>
           <w:bCs/>
         </w:rPr>
-        <w:t xml:space="preserve">20 feature rows are video-confirmed</w:t>
+        <w:t xml:space="preserve">21 feature rows are video-confirmed</w:t>
       </w:r>
       <w:r>
         <w:t xml:space="preserve"> </w:t>
@@ -225,7 +225,118 @@
         <w:t xml:space="preserve">-verify</w:t>
       </w:r>
       <w:r>
+        <w:t xml:space="preserve">,</w:t>
+      </w:r>
+      <w:r>
+        <w:t xml:space="preserve"> </w:t>
+      </w:r>
+      <w:r>
+        <w:rPr>
+          <w:rStyle w:val="VerbatimChar"/>
+          <w:b/>
+          <w:bCs/>
+        </w:rPr>
+        <w:t xml:space="preserve">-multipass</w:t>
+      </w:r>
+      <w:r>
+        <w:rPr>
+          <w:b/>
+          <w:bCs/>
+        </w:rPr>
+        <w:t xml:space="preserve"> </w:t>
+      </w:r>
+      <w:r>
+        <w:rPr>
+          <w:b/>
+          <w:bCs/>
+        </w:rPr>
+        <w:t xml:space="preserve">multi-pass polishing engine</w:t>
+      </w:r>
+      <w:r>
         <w:t xml:space="preserve">), the REST API server (POST /api/v1/translate real DeepSeek + target_lang FIXED, TLS startup FIXED, /health · /api/v1/version · /api/v1/providers), the gRPC server (real EN→ES), markdown-translator (EPUB↔MD round-trip), preparation-translator (FIXED real analysis), cmd/cli (real DeepSeek), monitor-server (live WS hub), and the DeepSeek library client.</w:t>
+      </w:r>
+      <w:r>
+        <w:t xml:space="preserve"> </w:t>
+      </w:r>
+      <w:r>
+        <w:rPr>
+          <w:b/>
+          <w:bCs/>
+        </w:rPr>
+        <w:t xml:space="preserve">Real-artifact-confirmed (not video):</w:t>
+      </w:r>
+      <w:r>
+        <w:t xml:space="preserve"> </w:t>
+      </w:r>
+      <w:r>
+        <w:rPr>
+          <w:b/>
+          <w:bCs/>
+        </w:rPr>
+        <w:t xml:space="preserve">DOCX output</w:t>
+      </w:r>
+      <w:r>
+        <w:t xml:space="preserve"> </w:t>
+      </w:r>
+      <w:r>
+        <w:t xml:space="preserve">is now Implemented — a real DeepSeek run produced</w:t>
+      </w:r>
+      <w:r>
+        <w:t xml:space="preserve"> </w:t>
+      </w:r>
+      <w:r>
+        <w:rPr>
+          <w:rStyle w:val="VerbatimChar"/>
+        </w:rPr>
+        <w:t xml:space="preserve">garden_es.docx</w:t>
+      </w:r>
+      <w:r>
+        <w:t xml:space="preserve"> </w:t>
+      </w:r>
+      <w:r>
+        <w:t xml:space="preserve">=</w:t>
+      </w:r>
+      <w:r>
+        <w:t xml:space="preserve"> </w:t>
+      </w:r>
+      <w:r>
+        <w:rPr>
+          <w:rStyle w:val="VerbatimChar"/>
+        </w:rPr>
+        <w:t xml:space="preserve">Microsoft Word 2007+</w:t>
+      </w:r>
+      <w:r>
+        <w:t xml:space="preserve"> </w:t>
+      </w:r>
+      <w:r>
+        <w:t xml:space="preserve">(well-formed WordprocessingML, real translation; pure-Go OOXML writer</w:t>
+      </w:r>
+      <w:r>
+        <w:t xml:space="preserve"> </w:t>
+      </w:r>
+      <w:r>
+        <w:rPr>
+          <w:rStyle w:val="VerbatimChar"/>
+        </w:rPr>
+        <w:t xml:space="preserve">pkg/ebook/docx_writer.go</w:t>
+      </w:r>
+      <w:r>
+        <w:t xml:space="preserve">, commit 87cd2be) — confirmed by the produced artifact’s file type, no</w:t>
+      </w:r>
+      <w:r>
+        <w:t xml:space="preserve"> </w:t>
+      </w:r>
+      <w:r>
+        <w:rPr>
+          <w:rStyle w:val="VerbatimChar"/>
+        </w:rPr>
+        <w:t xml:space="preserve">.mp4</w:t>
+      </w:r>
+      <w:r>
+        <w:t xml:space="preserve"> </w:t>
+      </w:r>
+      <w:r>
+        <w:t xml:space="preserve">exists yet (video PENDING).</w:t>
       </w:r>
       <w:r>
         <w:t xml:space="preserve"> </w:t>
@@ -241,7 +352,7 @@
         <w:t xml:space="preserve"> </w:t>
       </w:r>
       <w:r>
-        <w:t xml:space="preserve">DOCX output + PDF output are unimplemented (no writer in</w:t>
+        <w:t xml:space="preserve">PDF output is still unimplemented (no PDF writer in</w:t>
       </w:r>
       <w:r>
         <w:t xml:space="preserve"> </w:t>
@@ -253,7 +364,7 @@
         <w:t xml:space="preserve">pkg/ebook</w:t>
       </w:r>
       <w:r>
-        <w:t xml:space="preserve">; unified-translator rejects them);</w:t>
+        <w:t xml:space="preserve">; unified-translator rejects</w:t>
       </w:r>
       <w:r>
         <w:t xml:space="preserve"> </w:t>
@@ -262,28 +373,10 @@
         <w:rPr>
           <w:rStyle w:val="VerbatimChar"/>
         </w:rPr>
-        <w:t xml:space="preserve">-verify</w:t>
+        <w:t xml:space="preserve">.pdf</w:t>
       </w:r>
       <w:r>
-        <w:t xml:space="preserve"> </w:t>
-      </w:r>
-      <w:r>
-        <w:t xml:space="preserve">is the CLI’s own per-step check, NOT the</w:t>
-      </w:r>
-      <w:r>
-        <w:t xml:space="preserve"> </w:t>
-      </w:r>
-      <w:r>
-        <w:rPr>
-          <w:rStyle w:val="VerbatimChar"/>
-        </w:rPr>
-        <w:t xml:space="preserve">pkg/verification</w:t>
-      </w:r>
-      <w:r>
-        <w:t xml:space="preserve"> </w:t>
-      </w:r>
-      <w:r>
-        <w:t xml:space="preserve">multipass engine (that engine has no CLI entry point wired in);</w:t>
+        <w:t xml:space="preserve">);</w:t>
       </w:r>
       <w:r>
         <w:t xml:space="preserve"> </w:t>
@@ -637,7 +730,7 @@
               <w:t xml:space="preserve"> </w:t>
             </w:r>
             <w:r>
-              <w:t xml:space="preserve">(470 source-inventory rows + 2 honest gap rows added Rev 2: DOCX-write, PDF-write — both unimplemented)</w:t>
+              <w:t xml:space="preserve">(470 source-inventory rows + 2 gap rows added Rev 2: DOCX-write [now Implemented Rev 3], PDF-write [still unimplemented])</w:t>
             </w:r>
           </w:p>
         </w:tc>
@@ -661,7 +754,7 @@
               <w:pStyle w:val="Compact"/>
             </w:pPr>
             <w:r>
-              <w:t xml:space="preserve">463</w:t>
+              <w:t xml:space="preserve">464 (DOCX-write flipped gap→Implemented Rev 3, commit 87cd2be)</w:t>
             </w:r>
           </w:p>
         </w:tc>
@@ -754,7 +847,7 @@
               <w:pStyle w:val="Compact"/>
             </w:pPr>
             <w:r>
-              <w:t xml:space="preserve">2 (</w:t>
+              <w:t xml:space="preserve">1 (</w:t>
             </w:r>
             <w:r>
               <w:rPr>
@@ -766,7 +859,7 @@
               <w:t xml:space="preserve"> </w:t>
             </w:r>
             <w:r>
-              <w:t xml:space="preserve">DOCX-write, PDF-write — no writer exists; output limited to EPUB/FB2/TXT/HTML/MD)</w:t>
+              <w:t xml:space="preserve">PDF-write — no writer exists; output now EPUB/FB2/TXT/HTML/MD/DOCX)</w:t>
             </w:r>
           </w:p>
         </w:tc>
@@ -938,13 +1031,44 @@
                 <w:b/>
                 <w:bCs/>
               </w:rPr>
-              <w:t xml:space="preserve">20</w:t>
+              <w:t xml:space="preserve">21</w:t>
             </w:r>
             <w:r>
               <w:t xml:space="preserve"> </w:t>
             </w:r>
             <w:r>
-              <w:t xml:space="preserve">(real, content-verified recordings this session — see Anti-bluff note) — ≈ 4.3% of 470 enumerated rows (≈ 4.8% of the 417 headline)</w:t>
+              <w:t xml:space="preserve">(real, content-verified recordings this session — see Anti-bluff note) — ≈ 4.5% of 470 enumerated rows (≈ 5.0% of the 417 headline). Plus</w:t>
+            </w:r>
+            <w:r>
+              <w:t xml:space="preserve"> </w:t>
+            </w:r>
+            <w:r>
+              <w:rPr>
+                <w:b/>
+                <w:bCs/>
+              </w:rPr>
+              <w:t xml:space="preserve">1 real-artifact-confirmed</w:t>
+            </w:r>
+            <w:r>
+              <w:t xml:space="preserve"> </w:t>
+            </w:r>
+            <w:r>
+              <w:t xml:space="preserve">(DOCX output — produced</w:t>
+            </w:r>
+            <w:r>
+              <w:t xml:space="preserve"> </w:t>
+            </w:r>
+            <w:r>
+              <w:rPr>
+                <w:rStyle w:val="VerbatimChar"/>
+              </w:rPr>
+              <w:t xml:space="preserve">.docx</w:t>
+            </w:r>
+            <w:r>
+              <w:t xml:space="preserve"> </w:t>
+            </w:r>
+            <w:r>
+              <w:t xml:space="preserve">= Microsoft Word 2007+; video PENDING)</w:t>
             </w:r>
           </w:p>
         </w:tc>
@@ -3847,7 +3971,7 @@
               <w:pStyle w:val="Compact"/>
             </w:pPr>
             <w:r>
-              <w:t xml:space="preserve">Parse ebook → translate → write EPUB/FB2/TXT; multi-llm/distributed support</w:t>
+              <w:t xml:space="preserve">Parse ebook → translate → atomic-write EPUB/FB2/TXT; multi-llm/distributed support</w:t>
             </w:r>
           </w:p>
         </w:tc>
@@ -3879,7 +4003,7 @@
               <w:t xml:space="preserve"> </w:t>
             </w:r>
             <w:r>
-              <w:t xml:space="preserve">(real Serbian TXT output). Minor cosmetic note: source file path leaks into title metadata (non-blocking)</w:t>
+              <w:t xml:space="preserve">(real Serbian TXT output). Title path-leak FIXED (d53e085, sanitizeBookTitle). Write-safety FIXED (87cd2be): format validated before any FS write, written to temp sibling + atomic os.Rename only on full success — never a partial/clobbered output. Guard: cmd/cli/no_partial_output_test.go (5 tests, mutation-proven)</w:t>
             </w:r>
           </w:p>
         </w:tc>
@@ -27139,33 +27263,112 @@
               <w:pStyle w:val="Compact"/>
             </w:pPr>
             <w:r>
+              <w:t xml:space="preserve">Implemented</w:t>
+            </w:r>
+          </w:p>
+        </w:tc>
+        <w:tc>
+          <w:tcPr/>
+          <w:p>
+            <w:pPr>
+              <w:pStyle w:val="Compact"/>
+            </w:pPr>
+            <w:r>
+              <w:t xml:space="preserve">Wired</w:t>
+            </w:r>
+          </w:p>
+        </w:tc>
+        <w:tc>
+          <w:tcPr/>
+          <w:p>
+            <w:pPr>
+              <w:pStyle w:val="Compact"/>
+            </w:pPr>
+            <w:r>
+              <w:t xml:space="preserve">Pure-Go OOXML writer</w:t>
+            </w:r>
+            <w:r>
+              <w:t xml:space="preserve"> </w:t>
+            </w:r>
+            <w:r>
+              <w:rPr>
+                <w:rStyle w:val="VerbatimChar"/>
+              </w:rPr>
+              <w:t xml:space="preserve">pkg/ebook/docx_writer.go</w:t>
+            </w:r>
+            <w:r>
+              <w:t xml:space="preserve"> </w:t>
+            </w:r>
+            <w:r>
+              <w:t xml:space="preserve">(stdlib archive/zip + encoding/xml, zero new deps); emits the 4 required OOXML parts; XML specials auto-escaped via xml.Marshal chardata. Wired into unified-translator generateOutput (</w:t>
+            </w:r>
+            <w:r>
+              <w:rPr>
+                <w:rStyle w:val="VerbatimChar"/>
+              </w:rPr>
+              <w:t xml:space="preserve">case docx</w:t>
+            </w:r>
+            <w:r>
+              <w:t xml:space="preserve">). Real DeepSeek EN→ES →</w:t>
+            </w:r>
+            <w:r>
+              <w:t xml:space="preserve"> </w:t>
+            </w:r>
+            <w:r>
+              <w:rPr>
+                <w:rStyle w:val="VerbatimChar"/>
+              </w:rPr>
+              <w:t xml:space="preserve">garden_es.docx</w:t>
+            </w:r>
+            <w:r>
+              <w:t xml:space="preserve"> </w:t>
+            </w:r>
+            <w:r>
+              <w:t xml:space="preserve">=</w:t>
+            </w:r>
+            <w:r>
+              <w:t xml:space="preserve"> </w:t>
+            </w:r>
+            <w:r>
+              <w:rPr>
+                <w:rStyle w:val="VerbatimChar"/>
+              </w:rPr>
+              <w:t xml:space="preserve">Microsoft Word 2007+</w:t>
+            </w:r>
+            <w:r>
+              <w:t xml:space="preserve">, well-formed WordprocessingML with the real translation. Guards: pkg/ebook/docx_writer_test.go + .docx subtest in cmd/unified-translator/output_format_test.go (mutation-proven)</w:t>
+            </w:r>
+          </w:p>
+        </w:tc>
+        <w:tc>
+          <w:tcPr/>
+          <w:p>
+            <w:pPr>
+              <w:pStyle w:val="Compact"/>
+            </w:pPr>
+            <w:r>
+              <w:t xml:space="preserve">Covered</w:t>
+            </w:r>
+          </w:p>
+        </w:tc>
+        <w:tc>
+          <w:tcPr/>
+          <w:p>
+            <w:pPr>
+              <w:pStyle w:val="Compact"/>
+            </w:pPr>
+            <w:r>
               <w:rPr>
                 <w:b/>
                 <w:bCs/>
               </w:rPr>
-              <w:t xml:space="preserve">Not implemented</w:t>
-            </w:r>
-          </w:p>
-        </w:tc>
-        <w:tc>
-          <w:tcPr/>
-          <w:p>
-            <w:pPr>
-              <w:pStyle w:val="Compact"/>
-            </w:pPr>
-            <w:r>
-              <w:t xml:space="preserve">Unwired</w:t>
-            </w:r>
-          </w:p>
-        </w:tc>
-        <w:tc>
-          <w:tcPr/>
-          <w:p>
-            <w:pPr>
-              <w:pStyle w:val="Compact"/>
-            </w:pPr>
-            <w:r>
-              <w:t xml:space="preserve">GAP (§11.4.6): no DOCX writer exists in</w:t>
+              <w:t xml:space="preserve">PASS — real artifact verified</w:t>
+            </w:r>
+            <w:r>
+              <w:t xml:space="preserve"> </w:t>
+            </w:r>
+            <w:r>
+              <w:t xml:space="preserve">(produced .docx =</w:t>
             </w:r>
             <w:r>
               <w:t xml:space="preserve"> </w:t>
@@ -27174,62 +27377,21 @@
               <w:rPr>
                 <w:rStyle w:val="VerbatimChar"/>
               </w:rPr>
-              <w:t xml:space="preserve">pkg/ebook</w:t>
-            </w:r>
-            <w:r>
-              <w:t xml:space="preserve">; DOCX is parse-only. unified-translator rejects</w:t>
-            </w:r>
-            <w:r>
-              <w:t xml:space="preserve"> </w:t>
-            </w:r>
-            <w:r>
-              <w:rPr>
-                <w:rStyle w:val="VerbatimChar"/>
-              </w:rPr>
-              <w:t xml:space="preserve">-output</w:t>
-            </w:r>
-            <w:r>
-              <w:t xml:space="preserve"> </w:t>
-            </w:r>
-            <w:r>
-              <w:t xml:space="preserve">.docx. Output formats are limited to EPUB/FB2/TXT/HTML/MD</w:t>
-            </w:r>
-          </w:p>
-        </w:tc>
-        <w:tc>
-          <w:tcPr/>
-          <w:p>
-            <w:pPr>
-              <w:pStyle w:val="Compact"/>
-            </w:pPr>
-            <w:r>
-              <w:t xml:space="preserve">None</w:t>
-            </w:r>
-          </w:p>
-        </w:tc>
-        <w:tc>
-          <w:tcPr/>
-          <w:p>
-            <w:pPr>
-              <w:pStyle w:val="Compact"/>
-            </w:pPr>
-            <w:r>
-              <w:rPr>
-                <w:b/>
-                <w:bCs/>
-              </w:rPr>
-              <w:t xml:space="preserve">GAP — unimplemented (no writer)</w:t>
-            </w:r>
-          </w:p>
-        </w:tc>
-        <w:tc>
-          <w:tcPr/>
-          <w:p>
-            <w:pPr>
-              <w:pStyle w:val="Compact"/>
-            </w:pPr>
-            <w:r>
-              <w:t xml:space="preserve">N/A (no feature to record)</w:t>
+              <w:t xml:space="preserve">Microsoft Word 2007+</w:t>
+            </w:r>
+            <w:r>
+              <w:t xml:space="preserve">, 4 OOXML parts, real translated content + correct XML escaping; commit 87cd2be)</w:t>
+            </w:r>
+          </w:p>
+        </w:tc>
+        <w:tc>
+          <w:tcPr/>
+          <w:p>
+            <w:pPr>
+              <w:pStyle w:val="Compact"/>
+            </w:pPr>
+            <w:r>
+              <w:t xml:space="preserve">real-artifact verified (file=Microsoft Word 2007+); video PENDING</w:t>
             </w:r>
           </w:p>
         </w:tc>
@@ -30175,18 +30337,72 @@
                 <w:b/>
                 <w:bCs/>
               </w:rPr>
-              <w:t xml:space="preserve">Unwired into unified-translator</w:t>
-            </w:r>
-          </w:p>
-        </w:tc>
-        <w:tc>
-          <w:tcPr/>
-          <w:p>
-            <w:pPr>
-              <w:pStyle w:val="Compact"/>
-            </w:pPr>
-            <w:r>
-              <w:t xml:space="preserve">Iterative multi-LLM polishing w/ note-taking &amp; consensus. GAP (§11.4.6): this engine is NOT what the unified-translator</w:t>
+              <w:t xml:space="preserve">Wired into unified-translator (</w:t>
+            </w:r>
+            <w:r>
+              <w:rPr>
+                <w:rStyle w:val="VerbatimChar"/>
+                <w:b/>
+                <w:bCs/>
+              </w:rPr>
+              <w:t xml:space="preserve">-multipass</w:t>
+            </w:r>
+            <w:r>
+              <w:rPr>
+                <w:b/>
+                <w:bCs/>
+              </w:rPr>
+              <w:t xml:space="preserve">, d53e085)</w:t>
+            </w:r>
+          </w:p>
+        </w:tc>
+        <w:tc>
+          <w:tcPr/>
+          <w:p>
+            <w:pPr>
+              <w:pStyle w:val="Compact"/>
+            </w:pPr>
+            <w:r>
+              <w:t xml:space="preserve">Iterative multi-LLM polishing w/ note-taking &amp; consensus. Now reachable via the unified-translator opt-in</w:t>
+            </w:r>
+            <w:r>
+              <w:t xml:space="preserve"> </w:t>
+            </w:r>
+            <w:r>
+              <w:rPr>
+                <w:rStyle w:val="VerbatimChar"/>
+              </w:rPr>
+              <w:t xml:space="preserve">-multipass</w:t>
+            </w:r>
+            <w:r>
+              <w:t xml:space="preserve"> </w:t>
+            </w:r>
+            <w:r>
+              <w:t xml:space="preserve">flag (+</w:t>
+            </w:r>
+            <w:r>
+              <w:t xml:space="preserve"> </w:t>
+            </w:r>
+            <w:r>
+              <w:rPr>
+                <w:rStyle w:val="VerbatimChar"/>
+              </w:rPr>
+              <w:t xml:space="preserve">-multipass-passes</w:t>
+            </w:r>
+            <w:r>
+              <w:t xml:space="preserve">,</w:t>
+            </w:r>
+            <w:r>
+              <w:t xml:space="preserve"> </w:t>
+            </w:r>
+            <w:r>
+              <w:rPr>
+                <w:rStyle w:val="VerbatimChar"/>
+              </w:rPr>
+              <w:t xml:space="preserve">-multipass-db</w:t>
+            </w:r>
+            <w:r>
+              <w:t xml:space="preserve">; default OFF, zero overhead/behavior change when absent). NOTE: distinct from</w:t>
             </w:r>
             <w:r>
               <w:t xml:space="preserve"> </w:t>
@@ -30201,7 +30417,7 @@
               <w:t xml:space="preserve"> </w:t>
             </w:r>
             <w:r>
-              <w:t xml:space="preserve">flag invokes —</w:t>
+              <w:t xml:space="preserve">(the CLI’s own per-step output check) —</w:t>
             </w:r>
             <w:r>
               <w:t xml:space="preserve"> </w:t>
@@ -30210,13 +30426,13 @@
               <w:rPr>
                 <w:rStyle w:val="VerbatimChar"/>
               </w:rPr>
-              <w:t xml:space="preserve">-verify</w:t>
+              <w:t xml:space="preserve">-multipass</w:t>
             </w:r>
             <w:r>
               <w:t xml:space="preserve"> </w:t>
             </w:r>
             <w:r>
-              <w:t xml:space="preserve">runs the CLI’s own per-step output check (row above), not this</w:t>
+              <w:t xml:space="preserve">invokes this</w:t>
             </w:r>
             <w:r>
               <w:t xml:space="preserve"> </w:t>
@@ -30231,7 +30447,7 @@
               <w:t xml:space="preserve"> </w:t>
             </w:r>
             <w:r>
-              <w:t xml:space="preserve">multipass engine. The multipass engine has no CLI entry point wired in</w:t>
+              <w:t xml:space="preserve">engine. Guard: cmd/unified-translator/multipass_wiring_test.go (httptest + real DeepSeek). §11.4.150 research: docs/research/20260615_video_surfaced_fixes/verification_multipass_wiring.md</w:t>
             </w:r>
           </w:p>
         </w:tc>
@@ -30252,29 +30468,41 @@
             <w:pPr>
               <w:pStyle w:val="Compact"/>
             </w:pPr>
-            <w:r>
-              <w:t xml:space="preserve">Source-confirmed (library present);</w:t>
-            </w:r>
-            <w:r>
-              <w:t xml:space="preserve"> </w:t>
-            </w:r>
             <w:r>
               <w:rPr>
                 <w:b/>
                 <w:bCs/>
               </w:rPr>
-              <w:t xml:space="preserve">GAP — not wired into CLI</w:t>
-            </w:r>
-          </w:p>
-        </w:tc>
-        <w:tc>
-          <w:tcPr/>
-          <w:p>
-            <w:pPr>
-              <w:pStyle w:val="Compact"/>
-            </w:pPr>
-            <w:r>
-              <w:t xml:space="preserve">PENDING</w:t>
+              <w:t xml:space="preserve">PASS — video-confirmed</w:t>
+            </w:r>
+            <w:r>
+              <w:t xml:space="preserve"> </w:t>
+            </w:r>
+            <w:r>
+              <w:t xml:space="preserve">(ffprobe 888x630, 93 frames, 9.3s; shows</w:t>
+            </w:r>
+            <w:r>
+              <w:t xml:space="preserve"> </w:t>
+            </w:r>
+            <w:r>
+              <w:t xml:space="preserve">“Step 4: Multi-pass Polishing ✅ Success — Polished over 1 pass with deepseek”</w:t>
+            </w:r>
+            <w:r>
+              <w:t xml:space="preserve"> </w:t>
+            </w:r>
+            <w:r>
+              <w:t xml:space="preserve">+ real Spanish output)</w:t>
+            </w:r>
+          </w:p>
+        </w:tc>
+        <w:tc>
+          <w:tcPr/>
+          <w:p>
+            <w:pPr>
+              <w:pStyle w:val="Compact"/>
+            </w:pPr>
+            <w:r>
+              <w:t xml:space="preserve">Confirmed:/Volumes/T7/Downloads/Recordings/helixtranslate-cli-multipass-verify-20260615.mp4</w:t>
             </w:r>
           </w:p>
         </w:tc>
@@ -59271,13 +59499,28 @@
           <w:b/>
           <w:bCs/>
         </w:rPr>
-        <w:t xml:space="preserve">Video coverage is 20 feature rows.</w:t>
+        <w:t xml:space="preserve">Video coverage is 21 feature rows</w:t>
       </w:r>
       <w:r>
         <w:t xml:space="preserve"> </w:t>
       </w:r>
       <w:r>
-        <w:t xml:space="preserve">20 features are confirmed by real, ffprobe- and content-verified recordings this session (see the Anti-bluff note for the full list). Every other runtime/user-visible feature is</w:t>
+        <w:t xml:space="preserve">(+ 1 real-artifact-confirmed). 21 features are confirmed by real, ffprobe- and content-verified recordings this session (see the Anti-bluff note for the full list); DOCX output is real-artifact-confirmed (produced</w:t>
+      </w:r>
+      <w:r>
+        <w:t xml:space="preserve"> </w:t>
+      </w:r>
+      <w:r>
+        <w:rPr>
+          <w:rStyle w:val="VerbatimChar"/>
+        </w:rPr>
+        <w:t xml:space="preserve">.docx</w:t>
+      </w:r>
+      <w:r>
+        <w:t xml:space="preserve"> </w:t>
+      </w:r>
+      <w:r>
+        <w:t xml:space="preserve">= Microsoft Word 2007+) with its video still PENDING. Every other runtime/user-visible feature is</w:t>
       </w:r>
       <w:r>
         <w:t xml:space="preserve"> </w:t>
@@ -59308,13 +59551,40 @@
           <w:b/>
           <w:bCs/>
         </w:rPr>
-        <w:t xml:space="preserve">DOCX output + PDF output are unimplemented</w:t>
+        <w:t xml:space="preserve">DOCX output is now Implemented (Rev 3, commit 87cd2be)</w:t>
       </w:r>
       <w:r>
         <w:t xml:space="preserve"> </w:t>
       </w:r>
       <w:r>
-        <w:t xml:space="preserve">—</w:t>
+        <w:t xml:space="preserve">— pure-Go OOXML writer; a real DeepSeek run produced</w:t>
+      </w:r>
+      <w:r>
+        <w:t xml:space="preserve"> </w:t>
+      </w:r>
+      <w:r>
+        <w:rPr>
+          <w:rStyle w:val="VerbatimChar"/>
+        </w:rPr>
+        <w:t xml:space="preserve">garden_es.docx</w:t>
+      </w:r>
+      <w:r>
+        <w:t xml:space="preserve"> </w:t>
+      </w:r>
+      <w:r>
+        <w:t xml:space="preserve">=</w:t>
+      </w:r>
+      <w:r>
+        <w:t xml:space="preserve"> </w:t>
+      </w:r>
+      <w:r>
+        <w:rPr>
+          <w:rStyle w:val="VerbatimChar"/>
+        </w:rPr>
+        <w:t xml:space="preserve">Microsoft Word 2007+</w:t>
+      </w:r>
+      <w:r>
+        <w:t xml:space="preserve">. PDF output is still unimplemented (no PDF writer in</w:t>
       </w:r>
       <w:r>
         <w:t xml:space="preserve"> </w:t>
@@ -59326,10 +59596,7 @@
         <w:t xml:space="preserve">pkg/ebook</w:t>
       </w:r>
       <w:r>
-        <w:t xml:space="preserve"> </w:t>
-      </w:r>
-      <w:r>
-        <w:t xml:space="preserve">has FB2-write and EPUB-write only; DOCX and PDF are parse/extract-only. unified-translator rejects</w:t>
+        <w:t xml:space="preserve">; unified-translator rejects</w:t>
       </w:r>
       <w:r>
         <w:t xml:space="preserve"> </w:t>
@@ -59338,22 +59605,10 @@
         <w:rPr>
           <w:rStyle w:val="VerbatimChar"/>
         </w:rPr>
-        <w:t xml:space="preserve">.docx</w:t>
-      </w:r>
-      <w:r>
-        <w:t xml:space="preserve">/</w:t>
-      </w:r>
-      <w:r>
-        <w:rPr>
-          <w:rStyle w:val="VerbatimChar"/>
-        </w:rPr>
         <w:t xml:space="preserve">.pdf</w:t>
       </w:r>
       <w:r>
-        <w:t xml:space="preserve"> </w:t>
-      </w:r>
-      <w:r>
-        <w:t xml:space="preserve">as output. Output formats are EPUB/FB2/TXT/HTML/MD.</w:t>
+        <w:t xml:space="preserve">). Output formats are now EPUB/FB2/TXT/HTML/MD/DOCX.</w:t>
       </w:r>
       <w:r>
         <w:t xml:space="preserve"> </w:t>
@@ -59370,7 +59625,7 @@
           <w:b/>
           <w:bCs/>
         </w:rPr>
-        <w:t xml:space="preserve">-verify</w:t>
+        <w:t xml:space="preserve">-multipass</w:t>
       </w:r>
       <w:r>
         <w:rPr>
@@ -59384,7 +59639,29 @@
           <w:b/>
           <w:bCs/>
         </w:rPr>
-        <w:t xml:space="preserve">≠ multipass engine.</w:t>
+        <w:t xml:space="preserve">≠</w:t>
+      </w:r>
+      <w:r>
+        <w:rPr>
+          <w:b/>
+          <w:bCs/>
+        </w:rPr>
+        <w:t xml:space="preserve"> </w:t>
+      </w:r>
+      <w:r>
+        <w:rPr>
+          <w:rStyle w:val="VerbatimChar"/>
+          <w:b/>
+          <w:bCs/>
+        </w:rPr>
+        <w:t xml:space="preserve">-verify</w:t>
+      </w:r>
+      <w:r>
+        <w:rPr>
+          <w:b/>
+          <w:bCs/>
+        </w:rPr>
+        <w:t xml:space="preserve">.</w:t>
       </w:r>
       <w:r>
         <w:t xml:space="preserve"> </w:t>
@@ -59405,7 +59682,22 @@
         <w:t xml:space="preserve"> </w:t>
       </w:r>
       <w:r>
-        <w:t xml:space="preserve">flag runs the CLI’s own per-step output check, NOT the</w:t>
+        <w:t xml:space="preserve">flag runs the CLI’s own per-step output check; the separate</w:t>
+      </w:r>
+      <w:r>
+        <w:t xml:space="preserve"> </w:t>
+      </w:r>
+      <w:r>
+        <w:rPr>
+          <w:rStyle w:val="VerbatimChar"/>
+        </w:rPr>
+        <w:t xml:space="preserve">-multipass</w:t>
+      </w:r>
+      <w:r>
+        <w:t xml:space="preserve"> </w:t>
+      </w:r>
+      <w:r>
+        <w:t xml:space="preserve">flag (d53e085) invokes the</w:t>
       </w:r>
       <w:r>
         <w:t xml:space="preserve"> </w:t>
@@ -59420,7 +59712,7 @@
         <w:t xml:space="preserve"> </w:t>
       </w:r>
       <w:r>
-        <w:t xml:space="preserve">multi-pass polisher (which has no CLI entry point wired in).</w:t>
+        <w:t xml:space="preserve">multi-pass polisher engine — now wired and video-confirmed.</w:t>
       </w:r>
       <w:r>
         <w:t xml:space="preserve"> </w:t>
@@ -59597,13 +59889,29 @@
           <w:b/>
           <w:bCs/>
         </w:rPr>
-        <w:t xml:space="preserve">cosmetic note:</w:t>
+        <w:t xml:space="preserve">title path-leak FIXED</w:t>
       </w:r>
       <w:r>
         <w:t xml:space="preserve"> </w:t>
       </w:r>
       <w:r>
-        <w:t xml:space="preserve">the source file path leaks into the output title metadata (non-blocking, real translation otherwise correct).</w:t>
+        <w:t xml:space="preserve">(d53e085) +</w:t>
+      </w:r>
+      <w:r>
+        <w:t xml:space="preserve"> </w:t>
+      </w:r>
+      <w:r>
+        <w:rPr>
+          <w:b/>
+          <w:bCs/>
+        </w:rPr>
+        <w:t xml:space="preserve">write-safety FIXED</w:t>
+      </w:r>
+      <w:r>
+        <w:t xml:space="preserve"> </w:t>
+      </w:r>
+      <w:r>
+        <w:t xml:space="preserve">(87cd2be, atomic write/no-clobber, guard cmd/cli/no_partial_output_test.go).</w:t>
       </w:r>
     </w:p>
     <w:p>

</xml_diff>

<commit_message>
docs(features §11.4.153): refresh ledger — bridge+web-dashboard+verifier-gate landed, honest PENDING video where autonomous capture infeasible
</commit_message>
<xml_diff>
--- a/docs/features/Status.docx
+++ b/docs/features/Status.docx
@@ -34,7 +34,7 @@
         <w:t xml:space="preserve"> </w:t>
       </w:r>
       <w:r>
-        <w:t xml:space="preserve">3</w:t>
+        <w:t xml:space="preserve">4</w:t>
       </w:r>
       <w:r>
         <w:t xml:space="preserve"> </w:t>
@@ -50,7 +50,7 @@
         <w:t xml:space="preserve"> </w:t>
       </w:r>
       <w:r>
-        <w:t xml:space="preserve">2026-06-15T18:45:00Z</w:t>
+        <w:t xml:space="preserve">2026-06-15T20:10:00Z</w:t>
       </w:r>
       <w:r>
         <w:t xml:space="preserve"> </w:t>
@@ -346,13 +346,59 @@
           <w:b/>
           <w:bCs/>
         </w:rPr>
-        <w:t xml:space="preserve">Honest gaps recorded, NOT confirmed:</w:t>
+        <w:t xml:space="preserve">Real-artifact / unit-confirmed (not video):</w:t>
       </w:r>
       <w:r>
         <w:t xml:space="preserve"> </w:t>
       </w:r>
       <w:r>
-        <w:t xml:space="preserve">PDF output is still unimplemented (no PDF writer in</w:t>
+        <w:rPr>
+          <w:b/>
+          <w:bCs/>
+        </w:rPr>
+        <w:t xml:space="preserve">PDF output</w:t>
+      </w:r>
+      <w:r>
+        <w:t xml:space="preserve"> </w:t>
+      </w:r>
+      <w:r>
+        <w:t xml:space="preserve">is now Implemented (commit fb265e7) —</w:t>
+      </w:r>
+      <w:r>
+        <w:t xml:space="preserve"> </w:t>
+      </w:r>
+      <w:r>
+        <w:rPr>
+          <w:rStyle w:val="VerbatimChar"/>
+        </w:rPr>
+        <w:t xml:space="preserve">pkg/ebook/pdf_writer.go</w:t>
+      </w:r>
+      <w:r>
+        <w:t xml:space="preserve"> </w:t>
+      </w:r>
+      <w:r>
+        <w:t xml:space="preserve">renders the Book→HTML5→</w:t>
+      </w:r>
+      <w:r>
+        <w:rPr>
+          <w:rStyle w:val="VerbatimChar"/>
+        </w:rPr>
+        <w:t xml:space="preserve">weasyprint</w:t>
+      </w:r>
+      <w:r>
+        <w:t xml:space="preserve">→valid Cyrillic-faithful PDF, wired into unified-translator (</w:t>
+      </w:r>
+      <w:r>
+        <w:rPr>
+          <w:rStyle w:val="VerbatimChar"/>
+        </w:rPr>
+        <w:t xml:space="preserve">.pdf</w:t>
+      </w:r>
+      <w:r>
+        <w:t xml:space="preserve"> </w:t>
+      </w:r>
+      <w:r>
+        <w:t xml:space="preserve">output; main.go:1160);</w:t>
       </w:r>
       <w:r>
         <w:t xml:space="preserve"> </w:t>
@@ -364,7 +410,10 @@
         <w:t xml:space="preserve">pkg/ebook</w:t>
       </w:r>
       <w:r>
-        <w:t xml:space="preserve">; unified-translator rejects</w:t>
+        <w:t xml:space="preserve"> </w:t>
+      </w:r>
+      <w:r>
+        <w:t xml:space="preserve">PDF tests green this session (no</w:t>
       </w:r>
       <w:r>
         <w:t xml:space="preserve"> </w:t>
@@ -373,10 +422,23 @@
         <w:rPr>
           <w:rStyle w:val="VerbatimChar"/>
         </w:rPr>
-        <w:t xml:space="preserve">.pdf</w:t>
+        <w:t xml:space="preserve">.mp4</w:t>
       </w:r>
       <w:r>
-        <w:t xml:space="preserve">);</w:t>
+        <w:t xml:space="preserve"> </w:t>
+      </w:r>
+      <w:r>
+        <w:t xml:space="preserve">yet, video PENDING).</w:t>
+      </w:r>
+      <w:r>
+        <w:t xml:space="preserve"> </w:t>
+      </w:r>
+      <w:r>
+        <w:rPr>
+          <w:b/>
+          <w:bCs/>
+        </w:rPr>
+        <w:t xml:space="preserve">Honest gaps recorded, NOT confirmed:</w:t>
       </w:r>
       <w:r>
         <w:t xml:space="preserve"> </w:t>
@@ -724,13 +786,13 @@
                 <w:b/>
                 <w:bCs/>
               </w:rPr>
-              <w:t xml:space="preserve">472</w:t>
+              <w:t xml:space="preserve">478</w:t>
             </w:r>
             <w:r>
               <w:t xml:space="preserve"> </w:t>
             </w:r>
             <w:r>
-              <w:t xml:space="preserve">(470 source-inventory rows + 2 gap rows added Rev 2: DOCX-write [now Implemented Rev 3], PDF-write [still unimplemented])</w:t>
+              <w:t xml:space="preserve">(470 source-inventory rows + 2 gap rows added Rev 2 [DOCX-write→Implemented Rev 3, PDF-write→Implemented Rev 4] + 6 new rows added Rev 4: cmd/model-bridge CLI ×2, pkg/bridge ×2, internal/verifier affirmative-gate ×1, pkg/api/dashboard.go ×1)</w:t>
             </w:r>
           </w:p>
         </w:tc>
@@ -754,7 +816,7 @@
               <w:pStyle w:val="Compact"/>
             </w:pPr>
             <w:r>
-              <w:t xml:space="preserve">464 (DOCX-write flipped gap→Implemented Rev 3, commit 87cd2be)</w:t>
+              <w:t xml:space="preserve">471 (DOCX-write Rev 3 + PDF-write flipped gap→Implemented Rev 4 [commit fb265e7] + 6 new Rev 4 rows all Implemented)</w:t>
             </w:r>
           </w:p>
         </w:tc>
@@ -847,19 +909,7 @@
               <w:pStyle w:val="Compact"/>
             </w:pPr>
             <w:r>
-              <w:t xml:space="preserve">1 (</w:t>
-            </w:r>
-            <w:r>
-              <w:rPr>
-                <w:rStyle w:val="VerbatimChar"/>
-              </w:rPr>
-              <w:t xml:space="preserve">pkg/ebook</w:t>
-            </w:r>
-            <w:r>
-              <w:t xml:space="preserve"> </w:t>
-            </w:r>
-            <w:r>
-              <w:t xml:space="preserve">PDF-write — no writer exists; output now EPUB/FB2/TXT/HTML/MD/DOCX)</w:t>
+              <w:t xml:space="preserve">0 (PDF-write flipped gap→Implemented Rev 4, commit fb265e7; output now EPUB/FB2/TXT/HTML/MD/DOCX/PDF)</w:t>
             </w:r>
           </w:p>
         </w:tc>
@@ -1037,7 +1087,7 @@
               <w:t xml:space="preserve"> </w:t>
             </w:r>
             <w:r>
-              <w:t xml:space="preserve">(real, content-verified recordings this session — see Anti-bluff note) — ≈ 4.5% of 470 enumerated rows (≈ 5.0% of the 417 headline). Plus</w:t>
+              <w:t xml:space="preserve">(real, content-verified recordings this session — see Anti-bluff note) — ≈ 4.4% of 478 enumerated rows (≈ 5.0% of the 417 headline). Plus</w:t>
             </w:r>
             <w:r>
               <w:t xml:space="preserve"> </w:t>
@@ -1047,7 +1097,7 @@
                 <w:b/>
                 <w:bCs/>
               </w:rPr>
-              <w:t xml:space="preserve">1 real-artifact-confirmed</w:t>
+              <w:t xml:space="preserve">2 real-artifact/unit-confirmed</w:t>
             </w:r>
             <w:r>
               <w:t xml:space="preserve"> </w:t>
@@ -1068,7 +1118,22 @@
               <w:t xml:space="preserve"> </w:t>
             </w:r>
             <w:r>
-              <w:t xml:space="preserve">= Microsoft Word 2007+; video PENDING)</w:t>
+              <w:t xml:space="preserve">= Microsoft Word 2007+; PDF output —</w:t>
+            </w:r>
+            <w:r>
+              <w:t xml:space="preserve"> </w:t>
+            </w:r>
+            <w:r>
+              <w:rPr>
+                <w:rStyle w:val="VerbatimChar"/>
+              </w:rPr>
+              <w:t xml:space="preserve">pkg/ebook</w:t>
+            </w:r>
+            <w:r>
+              <w:t xml:space="preserve"> </w:t>
+            </w:r>
+            <w:r>
+              <w:t xml:space="preserve">tests green + weasyprint present; both video PENDING). Rev-4 additions (bridge CLI+MCP, pkg/bridge, internal/verifier gate, pkg/api/dashboard.go) are PASS at unit/integration/live-run level with video PENDING (terminal-surface recordings owed) or SKIP (web dashboard — needs HelixQA web/video backend) or N/A (internal logic) — none claim a video that doesn’t exist</w:t>
             </w:r>
           </w:p>
         </w:tc>
@@ -1983,7 +2048,7 @@
     </w:p>
     <w:bookmarkEnd w:id="12"/>
     <w:bookmarkEnd w:id="13"/>
-    <w:bookmarkStart w:id="30" w:name="cli-binaries-cmd"/>
+    <w:bookmarkStart w:id="31" w:name="cli-binaries-cmd"/>
     <w:p>
       <w:pPr>
         <w:pStyle w:val="Heading1"/>
@@ -21165,7 +21230,538 @@
       </w:tr>
     </w:tbl>
     <w:bookmarkEnd w:id="28"/>
-    <w:bookmarkStart w:id="29" w:name="cmdworkable-items"/>
+    <w:bookmarkStart w:id="29" w:name="cmdmodel-bridge"/>
+    <w:p>
+      <w:pPr>
+        <w:pStyle w:val="Heading2"/>
+      </w:pPr>
+      <w:r>
+        <w:t xml:space="preserve">cmd/model-bridge</w:t>
+      </w:r>
+    </w:p>
+    <w:p>
+      <w:pPr>
+        <w:pStyle w:val="FirstParagraph"/>
+      </w:pPr>
+      <w:r>
+        <w:t xml:space="preserve">LLMsVerifier→component+agent bridge (no local models): selects the best LLMsVerifier-scored model, exposes it to agents/components via a CLI and an MCP stdio server wired in</w:t>
+      </w:r>
+      <w:r>
+        <w:t xml:space="preserve"> </w:t>
+      </w:r>
+      <w:r>
+        <w:rPr>
+          <w:rStyle w:val="VerbatimChar"/>
+        </w:rPr>
+        <w:t xml:space="preserve">.mcp.json</w:t>
+      </w:r>
+      <w:r>
+        <w:t xml:space="preserve">. Source:</w:t>
+      </w:r>
+      <w:r>
+        <w:t xml:space="preserve"> </w:t>
+      </w:r>
+      <w:r>
+        <w:rPr>
+          <w:rStyle w:val="VerbatimChar"/>
+        </w:rPr>
+        <w:t xml:space="preserve">cmd/model-bridge/{main.go,mcp.go}</w:t>
+      </w:r>
+      <w:r>
+        <w:t xml:space="preserve">,</w:t>
+      </w:r>
+      <w:r>
+        <w:t xml:space="preserve"> </w:t>
+      </w:r>
+      <w:r>
+        <w:rPr>
+          <w:rStyle w:val="VerbatimChar"/>
+        </w:rPr>
+        <w:t xml:space="preserve">pkg/bridge/</w:t>
+      </w:r>
+      <w:r>
+        <w:t xml:space="preserve">, commit ab1bed3 (+ routing seam a5860b2).</w:t>
+      </w:r>
+    </w:p>
+    <w:tbl>
+      <w:tblPr>
+        <w:tblStyle w:val="Table"/>
+        <w:tblW w:type="pct" w:w="5000"/>
+        <w:tblLayout w:type="fixed"/>
+        <w:tblLook w:firstRow="1" w:lastRow="0" w:firstColumn="0" w:lastColumn="0" w:noHBand="0" w:noVBand="0" w:val="0020"/>
+      </w:tblPr>
+      <w:tblGrid>
+        <w:gridCol w:w="879"/>
+        <w:gridCol w:w="879"/>
+        <w:gridCol w:w="879"/>
+        <w:gridCol w:w="879"/>
+        <w:gridCol w:w="879"/>
+        <w:gridCol w:w="879"/>
+        <w:gridCol w:w="879"/>
+        <w:gridCol w:w="879"/>
+        <w:gridCol w:w="879"/>
+      </w:tblGrid>
+      <w:tr>
+        <w:trPr>
+          <w:tblHeader w:val="on"/>
+        </w:trPr>
+        <w:tc>
+          <w:tcPr/>
+          <w:p>
+            <w:pPr>
+              <w:pStyle w:val="Compact"/>
+            </w:pPr>
+            <w:r>
+              <w:t xml:space="preserve">Component</w:t>
+            </w:r>
+          </w:p>
+        </w:tc>
+        <w:tc>
+          <w:tcPr/>
+          <w:p>
+            <w:pPr>
+              <w:pStyle w:val="Compact"/>
+            </w:pPr>
+            <w:r>
+              <w:t xml:space="preserve">Feature</w:t>
+            </w:r>
+          </w:p>
+        </w:tc>
+        <w:tc>
+          <w:tcPr/>
+          <w:p>
+            <w:pPr>
+              <w:pStyle w:val="Compact"/>
+            </w:pPr>
+            <w:r>
+              <w:t xml:space="preserve">Category</w:t>
+            </w:r>
+          </w:p>
+        </w:tc>
+        <w:tc>
+          <w:tcPr/>
+          <w:p>
+            <w:pPr>
+              <w:pStyle w:val="Compact"/>
+            </w:pPr>
+            <w:r>
+              <w:t xml:space="preserve">Implementation</w:t>
+            </w:r>
+          </w:p>
+        </w:tc>
+        <w:tc>
+          <w:tcPr/>
+          <w:p>
+            <w:pPr>
+              <w:pStyle w:val="Compact"/>
+            </w:pPr>
+            <w:r>
+              <w:t xml:space="preserve">Wiring</w:t>
+            </w:r>
+          </w:p>
+        </w:tc>
+        <w:tc>
+          <w:tcPr/>
+          <w:p>
+            <w:pPr>
+              <w:pStyle w:val="Compact"/>
+            </w:pPr>
+            <w:r>
+              <w:t xml:space="preserve">Real-use</w:t>
+            </w:r>
+          </w:p>
+        </w:tc>
+        <w:tc>
+          <w:tcPr/>
+          <w:p>
+            <w:pPr>
+              <w:pStyle w:val="Compact"/>
+            </w:pPr>
+            <w:r>
+              <w:t xml:space="preserve">Tests</w:t>
+            </w:r>
+          </w:p>
+        </w:tc>
+        <w:tc>
+          <w:tcPr/>
+          <w:p>
+            <w:pPr>
+              <w:pStyle w:val="Compact"/>
+            </w:pPr>
+            <w:r>
+              <w:t xml:space="preserve">Validation</w:t>
+            </w:r>
+          </w:p>
+        </w:tc>
+        <w:tc>
+          <w:tcPr/>
+          <w:p>
+            <w:pPr>
+              <w:pStyle w:val="Compact"/>
+            </w:pPr>
+            <w:r>
+              <w:t xml:space="preserve">Video-confirmation</w:t>
+            </w:r>
+          </w:p>
+        </w:tc>
+      </w:tr>
+      <w:tr>
+        <w:tc>
+          <w:tcPr/>
+          <w:p>
+            <w:pPr>
+              <w:pStyle w:val="Compact"/>
+            </w:pPr>
+            <w:r>
+              <w:t xml:space="preserve">model-bridge</w:t>
+            </w:r>
+          </w:p>
+        </w:tc>
+        <w:tc>
+          <w:tcPr/>
+          <w:p>
+            <w:pPr>
+              <w:pStyle w:val="Compact"/>
+            </w:pPr>
+            <w:r>
+              <w:t xml:space="preserve">LLMsVerifier→agent bridge CLI</w:t>
+            </w:r>
+          </w:p>
+        </w:tc>
+        <w:tc>
+          <w:tcPr/>
+          <w:p>
+            <w:pPr>
+              <w:pStyle w:val="Compact"/>
+            </w:pPr>
+            <w:r>
+              <w:t xml:space="preserve">CLI</w:t>
+            </w:r>
+          </w:p>
+        </w:tc>
+        <w:tc>
+          <w:tcPr/>
+          <w:p>
+            <w:pPr>
+              <w:pStyle w:val="Compact"/>
+            </w:pPr>
+            <w:r>
+              <w:t xml:space="preserve">Implemented</w:t>
+            </w:r>
+          </w:p>
+        </w:tc>
+        <w:tc>
+          <w:tcPr/>
+          <w:p>
+            <w:pPr>
+              <w:pStyle w:val="Compact"/>
+            </w:pPr>
+            <w:r>
+              <w:t xml:space="preserve">Wired</w:t>
+            </w:r>
+          </w:p>
+        </w:tc>
+        <w:tc>
+          <w:tcPr/>
+          <w:p>
+            <w:pPr>
+              <w:pStyle w:val="Compact"/>
+            </w:pPr>
+            <w:r>
+              <w:t xml:space="preserve">Selects best LLMsVerifier-scored model (top-1 + fallback chain) and translates/invokes through it; no local models</w:t>
+            </w:r>
+          </w:p>
+        </w:tc>
+        <w:tc>
+          <w:tcPr/>
+          <w:p>
+            <w:pPr>
+              <w:pStyle w:val="Compact"/>
+            </w:pPr>
+            <w:r>
+              <w:t xml:space="preserve">Covered (pkg/bridge unit+integration,</w:t>
+            </w:r>
+            <w:r>
+              <w:t xml:space="preserve"> </w:t>
+            </w:r>
+            <w:r>
+              <w:rPr>
+                <w:rStyle w:val="VerbatimChar"/>
+              </w:rPr>
+              <w:t xml:space="preserve">go test -race</w:t>
+            </w:r>
+            <w:r>
+              <w:t xml:space="preserve"> </w:t>
+            </w:r>
+            <w:r>
+              <w:t xml:space="preserve">green this session)</w:t>
+            </w:r>
+          </w:p>
+        </w:tc>
+        <w:tc>
+          <w:tcPr/>
+          <w:p>
+            <w:pPr>
+              <w:pStyle w:val="Compact"/>
+            </w:pPr>
+            <w:r>
+              <w:rPr>
+                <w:b/>
+                <w:bCs/>
+              </w:rPr>
+              <w:t xml:space="preserve">PASS — real run captured</w:t>
+            </w:r>
+            <w:r>
+              <w:t xml:space="preserve"> </w:t>
+            </w:r>
+            <w:r>
+              <w:t xml:space="preserve">(best-model selection</w:t>
+            </w:r>
+            <w:r>
+              <w:t xml:space="preserve"> </w:t>
+            </w:r>
+            <w:r>
+              <w:rPr>
+                <w:rStyle w:val="VerbatimChar"/>
+              </w:rPr>
+              <w:t xml:space="preserve">groq/allam-2-7b</w:t>
+            </w:r>
+            <w:r>
+              <w:t xml:space="preserve"> </w:t>
+            </w:r>
+            <w:r>
+              <w:t xml:space="preserve">score 0.906;</w:t>
+            </w:r>
+            <w:r>
+              <w:t xml:space="preserve"> </w:t>
+            </w:r>
+            <w:r>
+              <w:rPr>
+                <w:rStyle w:val="VerbatimChar"/>
+              </w:rPr>
+              <w:t xml:space="preserve">Invoke</w:t>
+            </w:r>
+            <w:r>
+              <w:t xml:space="preserve">→</w:t>
+            </w:r>
+            <w:r>
+              <w:t xml:space="preserve">“Buenos días, amigo.”</w:t>
+            </w:r>
+            <w:r>
+              <w:t xml:space="preserve">)</w:t>
+            </w:r>
+          </w:p>
+        </w:tc>
+        <w:tc>
+          <w:tcPr/>
+          <w:p>
+            <w:pPr>
+              <w:pStyle w:val="Compact"/>
+            </w:pPr>
+            <w:r>
+              <w:t xml:space="preserve">PENDING (CLI/MCP terminal surface — asciinema→agg→ffmpeg→ffprobe</w:t>
+            </w:r>
+            <w:r>
+              <w:t xml:space="preserve"> </w:t>
+            </w:r>
+            <w:r>
+              <w:rPr>
+                <w:rStyle w:val="VerbatimChar"/>
+              </w:rPr>
+              <w:t xml:space="preserve">helixtranslate-bridge-*</w:t>
+            </w:r>
+            <w:r>
+              <w:t xml:space="preserve"> </w:t>
+            </w:r>
+            <w:r>
+              <w:t xml:space="preserve">recording owed; not yet recorded)</w:t>
+            </w:r>
+          </w:p>
+        </w:tc>
+      </w:tr>
+      <w:tr>
+        <w:tc>
+          <w:tcPr/>
+          <w:p>
+            <w:pPr>
+              <w:pStyle w:val="Compact"/>
+            </w:pPr>
+            <w:r>
+              <w:t xml:space="preserve">model-bridge</w:t>
+            </w:r>
+          </w:p>
+        </w:tc>
+        <w:tc>
+          <w:tcPr/>
+          <w:p>
+            <w:pPr>
+              <w:pStyle w:val="Compact"/>
+            </w:pPr>
+            <w:r>
+              <w:t xml:space="preserve">MCP stdio server (</w:t>
+            </w:r>
+            <w:r>
+              <w:rPr>
+                <w:rStyle w:val="VerbatimChar"/>
+              </w:rPr>
+              <w:t xml:space="preserve">.mcp.json</w:t>
+            </w:r>
+            <w:r>
+              <w:t xml:space="preserve">)</w:t>
+            </w:r>
+          </w:p>
+        </w:tc>
+        <w:tc>
+          <w:tcPr/>
+          <w:p>
+            <w:pPr>
+              <w:pStyle w:val="Compact"/>
+            </w:pPr>
+            <w:r>
+              <w:t xml:space="preserve">CLI/Infra</w:t>
+            </w:r>
+          </w:p>
+        </w:tc>
+        <w:tc>
+          <w:tcPr/>
+          <w:p>
+            <w:pPr>
+              <w:pStyle w:val="Compact"/>
+            </w:pPr>
+            <w:r>
+              <w:t xml:space="preserve">Implemented</w:t>
+            </w:r>
+          </w:p>
+        </w:tc>
+        <w:tc>
+          <w:tcPr/>
+          <w:p>
+            <w:pPr>
+              <w:pStyle w:val="Compact"/>
+            </w:pPr>
+            <w:r>
+              <w:t xml:space="preserve">Wired</w:t>
+            </w:r>
+          </w:p>
+        </w:tc>
+        <w:tc>
+          <w:tcPr/>
+          <w:p>
+            <w:pPr>
+              <w:pStyle w:val="Compact"/>
+            </w:pPr>
+            <w:r>
+              <w:t xml:space="preserve">Exposes the selected model to MCP clients over stdio; wired as</w:t>
+            </w:r>
+            <w:r>
+              <w:t xml:space="preserve"> </w:t>
+            </w:r>
+            <w:r>
+              <w:rPr>
+                <w:rStyle w:val="VerbatimChar"/>
+              </w:rPr>
+              <w:t xml:space="preserve">model-bridge</w:t>
+            </w:r>
+            <w:r>
+              <w:t xml:space="preserve"> </w:t>
+            </w:r>
+            <w:r>
+              <w:t xml:space="preserve">in</w:t>
+            </w:r>
+            <w:r>
+              <w:t xml:space="preserve"> </w:t>
+            </w:r>
+            <w:r>
+              <w:rPr>
+                <w:rStyle w:val="VerbatimChar"/>
+              </w:rPr>
+              <w:t xml:space="preserve">.mcp.json</w:t>
+            </w:r>
+            <w:r>
+              <w:t xml:space="preserve"> </w:t>
+            </w:r>
+            <w:r>
+              <w:t xml:space="preserve">(</w:t>
+            </w:r>
+            <w:r>
+              <w:rPr>
+                <w:rStyle w:val="VerbatimChar"/>
+              </w:rPr>
+              <w:t xml:space="preserve">./build/model-bridge</w:t>
+            </w:r>
+            <w:r>
+              <w:t xml:space="preserve">)</w:t>
+            </w:r>
+          </w:p>
+        </w:tc>
+        <w:tc>
+          <w:tcPr/>
+          <w:p>
+            <w:pPr>
+              <w:pStyle w:val="Compact"/>
+            </w:pPr>
+            <w:r>
+              <w:t xml:space="preserve">Covered (</w:t>
+            </w:r>
+            <w:r>
+              <w:rPr>
+                <w:rStyle w:val="VerbatimChar"/>
+              </w:rPr>
+              <w:t xml:space="preserve">cmd/model-bridge/mcp_test.go</w:t>
+            </w:r>
+            <w:r>
+              <w:t xml:space="preserve">)</w:t>
+            </w:r>
+          </w:p>
+        </w:tc>
+        <w:tc>
+          <w:tcPr/>
+          <w:p>
+            <w:pPr>
+              <w:pStyle w:val="Compact"/>
+            </w:pPr>
+            <w:r>
+              <w:rPr>
+                <w:b/>
+                <w:bCs/>
+              </w:rPr>
+              <w:t xml:space="preserve">PASS — MCP live nonce-echo captured</w:t>
+            </w:r>
+            <w:r>
+              <w:t xml:space="preserve"> </w:t>
+            </w:r>
+            <w:r>
+              <w:t xml:space="preserve">(</w:t>
+            </w:r>
+            <w:r>
+              <w:rPr>
+                <w:rStyle w:val="VerbatimChar"/>
+              </w:rPr>
+              <w:t xml:space="preserve">HELIX-PROOF-9b21x</w:t>
+            </w:r>
+            <w:r>
+              <w:t xml:space="preserve"> </w:t>
+            </w:r>
+            <w:r>
+              <w:t xml:space="preserve">round-tripped through the MCP server)</w:t>
+            </w:r>
+          </w:p>
+        </w:tc>
+        <w:tc>
+          <w:tcPr/>
+          <w:p>
+            <w:pPr>
+              <w:pStyle w:val="Compact"/>
+            </w:pPr>
+            <w:r>
+              <w:t xml:space="preserve">PENDING (terminal surface; recording owed)</w:t>
+            </w:r>
+          </w:p>
+        </w:tc>
+      </w:tr>
+    </w:tbl>
+    <w:bookmarkEnd w:id="29"/>
+    <w:bookmarkStart w:id="30" w:name="cmdworkable-items"/>
     <w:p>
       <w:pPr>
         <w:pStyle w:val="Heading2"/>
@@ -22205,9 +22801,9 @@
         </w:pict>
       </w:r>
     </w:p>
-    <w:bookmarkEnd w:id="29"/>
     <w:bookmarkEnd w:id="30"/>
-    <w:bookmarkStart w:id="53" w:name="library-packages-pkg"/>
+    <w:bookmarkEnd w:id="31"/>
+    <w:bookmarkStart w:id="56" w:name="library-packages-pkg"/>
     <w:p>
       <w:pPr>
         <w:pStyle w:val="Heading1"/>
@@ -22216,7 +22812,7 @@
         <w:t xml:space="preserve">2. Library Packages — pkg/</w:t>
       </w:r>
     </w:p>
-    <w:bookmarkStart w:id="31" w:name="Xfa33bd49a73b83a4f8bbc88ad5157b68ac7c2e9"/>
+    <w:bookmarkStart w:id="32" w:name="Xfa33bd49a73b83a4f8bbc88ad5157b68ac7c2e9"/>
     <w:p>
       <w:pPr>
         <w:pStyle w:val="Heading2"/>
@@ -25709,8 +26305,8 @@
         </w:tc>
       </w:tr>
     </w:tbl>
-    <w:bookmarkEnd w:id="31"/>
-    <w:bookmarkStart w:id="32" w:name="pkgtranslator-translation-core"/>
+    <w:bookmarkEnd w:id="32"/>
+    <w:bookmarkStart w:id="33" w:name="pkgtranslator-translation-core"/>
     <w:p>
       <w:pPr>
         <w:pStyle w:val="Heading2"/>
@@ -26181,8 +26777,8 @@
         </w:tc>
       </w:tr>
     </w:tbl>
-    <w:bookmarkEnd w:id="32"/>
-    <w:bookmarkStart w:id="33" w:name="pkgebook-format-parsers-writers"/>
+    <w:bookmarkEnd w:id="33"/>
+    <w:bookmarkStart w:id="34" w:name="pkgebook-format-parsers-writers"/>
     <w:p>
       <w:pPr>
         <w:pStyle w:val="Heading2"/>
@@ -27441,29 +28037,29 @@
                 <w:b/>
                 <w:bCs/>
               </w:rPr>
-              <w:t xml:space="preserve">Not implemented</w:t>
-            </w:r>
-          </w:p>
-        </w:tc>
-        <w:tc>
-          <w:tcPr/>
-          <w:p>
-            <w:pPr>
-              <w:pStyle w:val="Compact"/>
-            </w:pPr>
-            <w:r>
-              <w:t xml:space="preserve">Unwired</w:t>
-            </w:r>
-          </w:p>
-        </w:tc>
-        <w:tc>
-          <w:tcPr/>
-          <w:p>
-            <w:pPr>
-              <w:pStyle w:val="Compact"/>
-            </w:pPr>
-            <w:r>
-              <w:t xml:space="preserve">GAP (§11.4.6): no PDF writer exists in</w:t>
+              <w:t xml:space="preserve">Implemented</w:t>
+            </w:r>
+          </w:p>
+        </w:tc>
+        <w:tc>
+          <w:tcPr/>
+          <w:p>
+            <w:pPr>
+              <w:pStyle w:val="Compact"/>
+            </w:pPr>
+            <w:r>
+              <w:t xml:space="preserve">Wired</w:t>
+            </w:r>
+          </w:p>
+        </w:tc>
+        <w:tc>
+          <w:tcPr/>
+          <w:p>
+            <w:pPr>
+              <w:pStyle w:val="Compact"/>
+            </w:pPr>
+            <w:r>
+              <w:t xml:space="preserve">PDF writer</w:t>
             </w:r>
             <w:r>
               <w:t xml:space="preserve"> </w:t>
@@ -27472,10 +28068,67 @@
               <w:rPr>
                 <w:rStyle w:val="VerbatimChar"/>
               </w:rPr>
-              <w:t xml:space="preserve">pkg/ebook</w:t>
-            </w:r>
-            <w:r>
-              <w:t xml:space="preserve">; PDF is extract-only. unified-translator rejects</w:t>
+              <w:t xml:space="preserve">pkg/ebook/pdf_writer.go</w:t>
+            </w:r>
+            <w:r>
+              <w:t xml:space="preserve"> </w:t>
+            </w:r>
+            <w:r>
+              <w:t xml:space="preserve">(commit fb265e7): renders the in-memory Book to UTF-8 HTML5 then hands it to</w:t>
+            </w:r>
+            <w:r>
+              <w:t xml:space="preserve"> </w:t>
+            </w:r>
+            <w:r>
+              <w:rPr>
+                <w:rStyle w:val="VerbatimChar"/>
+              </w:rPr>
+              <w:t xml:space="preserve">weasyprint</w:t>
+            </w:r>
+            <w:r>
+              <w:t xml:space="preserve"> </w:t>
+            </w:r>
+            <w:r>
+              <w:t xml:space="preserve">to emit a VALID, Cyrillic-faithful PDF (Standard-14 fonts can’t render Cyrillic — weasyprint embeds glyphs, avoiding a silent-glyph-drop bluff). Wired into unified-translator generateOutput (</w:t>
+            </w:r>
+            <w:r>
+              <w:rPr>
+                <w:rStyle w:val="VerbatimChar"/>
+              </w:rPr>
+              <w:t xml:space="preserve">case .pdf</w:t>
+            </w:r>
+            <w:r>
+              <w:t xml:space="preserve"> </w:t>
+            </w:r>
+            <w:r>
+              <w:t xml:space="preserve">→</w:t>
+            </w:r>
+            <w:r>
+              <w:t xml:space="preserve"> </w:t>
+            </w:r>
+            <w:r>
+              <w:rPr>
+                <w:rStyle w:val="VerbatimChar"/>
+              </w:rPr>
+              <w:t xml:space="preserve">ebook.NewPDFWriter().Write</w:t>
+            </w:r>
+            <w:r>
+              <w:t xml:space="preserve">, main.go:1160);</w:t>
+            </w:r>
+            <w:r>
+              <w:t xml:space="preserve"> </w:t>
+            </w:r>
+            <w:r>
+              <w:rPr>
+                <w:rStyle w:val="VerbatimChar"/>
+              </w:rPr>
+              <w:t xml:space="preserve">.pdf</w:t>
+            </w:r>
+            <w:r>
+              <w:t xml:space="preserve"> </w:t>
+            </w:r>
+            <w:r>
+              <w:t xml:space="preserve">is a supported</w:t>
             </w:r>
             <w:r>
               <w:t xml:space="preserve"> </w:t>
@@ -27490,18 +28143,54 @@
               <w:t xml:space="preserve"> </w:t>
             </w:r>
             <w:r>
-              <w:t xml:space="preserve">.pdf. Output formats are limited to EPUB/FB2/TXT/HTML/MD</w:t>
-            </w:r>
-          </w:p>
-        </w:tc>
-        <w:tc>
-          <w:tcPr/>
-          <w:p>
-            <w:pPr>
-              <w:pStyle w:val="Compact"/>
-            </w:pPr>
-            <w:r>
-              <w:t xml:space="preserve">None</w:t>
+              <w:t xml:space="preserve">extension. Honest typed</w:t>
+            </w:r>
+            <w:r>
+              <w:t xml:space="preserve"> </w:t>
+            </w:r>
+            <w:r>
+              <w:rPr>
+                <w:rStyle w:val="VerbatimChar"/>
+              </w:rPr>
+              <w:t xml:space="preserve">ErrWeasyPrintUnavailable</w:t>
+            </w:r>
+            <w:r>
+              <w:t xml:space="preserve"> </w:t>
+            </w:r>
+            <w:r>
+              <w:t xml:space="preserve">when weasyprint absent (§11.4.3/§11.4.6). Guards: pkg/ebook/pdf_writer_test.go (</w:t>
+            </w:r>
+            <w:r>
+              <w:rPr>
+                <w:rStyle w:val="VerbatimChar"/>
+              </w:rPr>
+              <w:t xml:space="preserve">TestPDFWriter_ProducesValidPDFCarryingTranslatedText</w:t>
+            </w:r>
+            <w:r>
+              <w:t xml:space="preserve">,</w:t>
+            </w:r>
+            <w:r>
+              <w:t xml:space="preserve"> </w:t>
+            </w:r>
+            <w:r>
+              <w:rPr>
+                <w:rStyle w:val="VerbatimChar"/>
+              </w:rPr>
+              <w:t xml:space="preserve">_UnavailableWeasyPrint</w:t>
+            </w:r>
+            <w:r>
+              <w:t xml:space="preserve">)</w:t>
+            </w:r>
+          </w:p>
+        </w:tc>
+        <w:tc>
+          <w:tcPr/>
+          <w:p>
+            <w:pPr>
+              <w:pStyle w:val="Compact"/>
+            </w:pPr>
+            <w:r>
+              <w:t xml:space="preserve">Covered</w:t>
             </w:r>
           </w:p>
         </w:tc>
@@ -27516,25 +28205,73 @@
                 <w:b/>
                 <w:bCs/>
               </w:rPr>
-              <w:t xml:space="preserve">GAP — unimplemented (no writer)</w:t>
-            </w:r>
-          </w:p>
-        </w:tc>
-        <w:tc>
-          <w:tcPr/>
-          <w:p>
-            <w:pPr>
-              <w:pStyle w:val="Compact"/>
-            </w:pPr>
-            <w:r>
-              <w:t xml:space="preserve">N/A (no feature to record)</w:t>
+              <w:t xml:space="preserve">PASS</w:t>
+            </w:r>
+            <w:r>
+              <w:t xml:space="preserve"> </w:t>
+            </w:r>
+            <w:r>
+              <w:t xml:space="preserve">—</w:t>
+            </w:r>
+            <w:r>
+              <w:t xml:space="preserve"> </w:t>
+            </w:r>
+            <w:r>
+              <w:rPr>
+                <w:rStyle w:val="VerbatimChar"/>
+              </w:rPr>
+              <w:t xml:space="preserve">go test ./pkg/ebook</w:t>
+            </w:r>
+            <w:r>
+              <w:t xml:space="preserve"> </w:t>
+            </w:r>
+            <w:r>
+              <w:t xml:space="preserve">green this session (</w:t>
+            </w:r>
+            <w:r>
+              <w:rPr>
+                <w:rStyle w:val="VerbatimChar"/>
+              </w:rPr>
+              <w:t xml:space="preserve">TestPDFWriter_ProducesValidPDFCarryingTranslatedText</w:t>
+            </w:r>
+            <w:r>
+              <w:t xml:space="preserve"> </w:t>
+            </w:r>
+            <w:r>
+              <w:t xml:space="preserve">asserts a valid PDF carrying the translated text; weasyprint present at /opt/homebrew/bin/weasyprint)</w:t>
+            </w:r>
+          </w:p>
+        </w:tc>
+        <w:tc>
+          <w:tcPr/>
+          <w:p>
+            <w:pPr>
+              <w:pStyle w:val="Compact"/>
+            </w:pPr>
+            <w:r>
+              <w:t xml:space="preserve">PENDING (translate→weasyprint→.pdf run is recordable; no</w:t>
+            </w:r>
+            <w:r>
+              <w:t xml:space="preserve"> </w:t>
+            </w:r>
+            <w:r>
+              <w:rPr>
+                <w:rStyle w:val="VerbatimChar"/>
+              </w:rPr>
+              <w:t xml:space="preserve">.mp4</w:t>
+            </w:r>
+            <w:r>
+              <w:t xml:space="preserve"> </w:t>
+            </w:r>
+            <w:r>
+              <w:t xml:space="preserve">yet — recording owed)</w:t>
             </w:r>
           </w:p>
         </w:tc>
       </w:tr>
     </w:tbl>
-    <w:bookmarkEnd w:id="33"/>
-    <w:bookmarkStart w:id="34" w:name="pkgfb2-fb2-specific-xml"/>
+    <w:bookmarkEnd w:id="34"/>
+    <w:bookmarkStart w:id="35" w:name="pkgfb2-fb2-specific-xml"/>
     <w:p>
       <w:pPr>
         <w:pStyle w:val="Heading2"/>
@@ -27868,8 +28605,8 @@
         </w:tc>
       </w:tr>
     </w:tbl>
-    <w:bookmarkEnd w:id="34"/>
-    <w:bookmarkStart w:id="35" w:name="pkgformat"/>
+    <w:bookmarkEnd w:id="35"/>
+    <w:bookmarkStart w:id="36" w:name="pkgformat"/>
     <w:p>
       <w:pPr>
         <w:pStyle w:val="Heading2"/>
@@ -28102,8 +28839,8 @@
         </w:tc>
       </w:tr>
     </w:tbl>
-    <w:bookmarkEnd w:id="35"/>
-    <w:bookmarkStart w:id="36" w:name="pkgmarkdown-epubmarkdown-workflow"/>
+    <w:bookmarkEnd w:id="36"/>
+    <w:bookmarkStart w:id="37" w:name="pkgmarkdown-epubmarkdown-workflow"/>
     <w:p>
       <w:pPr>
         <w:pStyle w:val="Heading2"/>
@@ -28639,8 +29376,8 @@
         </w:tc>
       </w:tr>
     </w:tbl>
-    <w:bookmarkEnd w:id="36"/>
-    <w:bookmarkStart w:id="37" w:name="pkgscript"/>
+    <w:bookmarkEnd w:id="37"/>
+    <w:bookmarkStart w:id="38" w:name="pkgscript"/>
     <w:p>
       <w:pPr>
         <w:pStyle w:val="Heading2"/>
@@ -28873,8 +29610,8 @@
         </w:tc>
       </w:tr>
     </w:tbl>
-    <w:bookmarkEnd w:id="37"/>
-    <w:bookmarkStart w:id="38" w:name="pkgstorage"/>
+    <w:bookmarkEnd w:id="38"/>
+    <w:bookmarkStart w:id="39" w:name="pkgstorage"/>
     <w:p>
       <w:pPr>
         <w:pStyle w:val="Heading2"/>
@@ -29511,8 +30248,8 @@
         </w:tc>
       </w:tr>
     </w:tbl>
-    <w:bookmarkEnd w:id="38"/>
-    <w:bookmarkStart w:id="39" w:name="pkgsecurity"/>
+    <w:bookmarkEnd w:id="39"/>
+    <w:bookmarkStart w:id="40" w:name="pkgsecurity"/>
     <w:p>
       <w:pPr>
         <w:pStyle w:val="Heading2"/>
@@ -30048,8 +30785,8 @@
         </w:tc>
       </w:tr>
     </w:tbl>
-    <w:bookmarkEnd w:id="39"/>
-    <w:bookmarkStart w:id="40" w:name="X4bb77aa0ed48d69e1f57ad78c18d7ff3d378be4"/>
+    <w:bookmarkEnd w:id="40"/>
+    <w:bookmarkStart w:id="41" w:name="X4bb77aa0ed48d69e1f57ad78c18d7ff3d378be4"/>
     <w:p>
       <w:pPr>
         <w:pStyle w:val="Heading2"/>
@@ -30912,8 +31649,351 @@
         </w:tc>
       </w:tr>
     </w:tbl>
-    <w:bookmarkEnd w:id="40"/>
-    <w:bookmarkStart w:id="41" w:name="pkgpreparation-pre-translation-analysis"/>
+    <w:bookmarkEnd w:id="41"/>
+    <w:bookmarkStart w:id="42" w:name="X4eea349e34cb77460c6276dc25bb2bfc0904cac"/>
+    <w:p>
+      <w:pPr>
+        <w:pStyle w:val="Heading2"/>
+      </w:pPr>
+      <w:r>
+        <w:t xml:space="preserve">internal/verifier — LLMsVerifier consumer integration</w:t>
+      </w:r>
+    </w:p>
+    <w:p>
+      <w:pPr>
+        <w:pStyle w:val="FirstParagraph"/>
+      </w:pPr>
+      <w:r>
+        <w:t xml:space="preserve">Consumer-side LLMsVerifier verification gate (client + scoring + discovery + selection). Source:</w:t>
+      </w:r>
+      <w:r>
+        <w:t xml:space="preserve"> </w:t>
+      </w:r>
+      <w:r>
+        <w:rPr>
+          <w:rStyle w:val="VerbatimChar"/>
+        </w:rPr>
+        <w:t xml:space="preserve">internal/verifier/pipeline.go</w:t>
+      </w:r>
+      <w:r>
+        <w:t xml:space="preserve">.</w:t>
+      </w:r>
+    </w:p>
+    <w:tbl>
+      <w:tblPr>
+        <w:tblStyle w:val="Table"/>
+        <w:tblW w:type="pct" w:w="5000"/>
+        <w:tblLayout w:type="fixed"/>
+        <w:tblLook w:firstRow="1" w:lastRow="0" w:firstColumn="0" w:lastColumn="0" w:noHBand="0" w:noVBand="0" w:val="0020"/>
+      </w:tblPr>
+      <w:tblGrid>
+        <w:gridCol w:w="879"/>
+        <w:gridCol w:w="879"/>
+        <w:gridCol w:w="879"/>
+        <w:gridCol w:w="879"/>
+        <w:gridCol w:w="879"/>
+        <w:gridCol w:w="879"/>
+        <w:gridCol w:w="879"/>
+        <w:gridCol w:w="879"/>
+        <w:gridCol w:w="879"/>
+      </w:tblGrid>
+      <w:tr>
+        <w:trPr>
+          <w:tblHeader w:val="on"/>
+        </w:trPr>
+        <w:tc>
+          <w:tcPr/>
+          <w:p>
+            <w:pPr>
+              <w:pStyle w:val="Compact"/>
+            </w:pPr>
+            <w:r>
+              <w:t xml:space="preserve">Component</w:t>
+            </w:r>
+          </w:p>
+        </w:tc>
+        <w:tc>
+          <w:tcPr/>
+          <w:p>
+            <w:pPr>
+              <w:pStyle w:val="Compact"/>
+            </w:pPr>
+            <w:r>
+              <w:t xml:space="preserve">Feature</w:t>
+            </w:r>
+          </w:p>
+        </w:tc>
+        <w:tc>
+          <w:tcPr/>
+          <w:p>
+            <w:pPr>
+              <w:pStyle w:val="Compact"/>
+            </w:pPr>
+            <w:r>
+              <w:t xml:space="preserve">Category</w:t>
+            </w:r>
+          </w:p>
+        </w:tc>
+        <w:tc>
+          <w:tcPr/>
+          <w:p>
+            <w:pPr>
+              <w:pStyle w:val="Compact"/>
+            </w:pPr>
+            <w:r>
+              <w:t xml:space="preserve">Implementation</w:t>
+            </w:r>
+          </w:p>
+        </w:tc>
+        <w:tc>
+          <w:tcPr/>
+          <w:p>
+            <w:pPr>
+              <w:pStyle w:val="Compact"/>
+            </w:pPr>
+            <w:r>
+              <w:t xml:space="preserve">Wiring</w:t>
+            </w:r>
+          </w:p>
+        </w:tc>
+        <w:tc>
+          <w:tcPr/>
+          <w:p>
+            <w:pPr>
+              <w:pStyle w:val="Compact"/>
+            </w:pPr>
+            <w:r>
+              <w:t xml:space="preserve">Real-use</w:t>
+            </w:r>
+          </w:p>
+        </w:tc>
+        <w:tc>
+          <w:tcPr/>
+          <w:p>
+            <w:pPr>
+              <w:pStyle w:val="Compact"/>
+            </w:pPr>
+            <w:r>
+              <w:t xml:space="preserve">Tests</w:t>
+            </w:r>
+          </w:p>
+        </w:tc>
+        <w:tc>
+          <w:tcPr/>
+          <w:p>
+            <w:pPr>
+              <w:pStyle w:val="Compact"/>
+            </w:pPr>
+            <w:r>
+              <w:t xml:space="preserve">Validation</w:t>
+            </w:r>
+          </w:p>
+        </w:tc>
+        <w:tc>
+          <w:tcPr/>
+          <w:p>
+            <w:pPr>
+              <w:pStyle w:val="Compact"/>
+            </w:pPr>
+            <w:r>
+              <w:t xml:space="preserve">Video-confirmation</w:t>
+            </w:r>
+          </w:p>
+        </w:tc>
+      </w:tr>
+      <w:tr>
+        <w:tc>
+          <w:tcPr/>
+          <w:p>
+            <w:pPr>
+              <w:pStyle w:val="Compact"/>
+            </w:pPr>
+            <w:r>
+              <w:t xml:space="preserve">internal/verifier</w:t>
+            </w:r>
+          </w:p>
+        </w:tc>
+        <w:tc>
+          <w:tcPr/>
+          <w:p>
+            <w:pPr>
+              <w:pStyle w:val="Compact"/>
+            </w:pPr>
+            <w:r>
+              <w:t xml:space="preserve">Affirmative-response hard-gate</w:t>
+            </w:r>
+          </w:p>
+        </w:tc>
+        <w:tc>
+          <w:tcPr/>
+          <w:p>
+            <w:pPr>
+              <w:pStyle w:val="Compact"/>
+            </w:pPr>
+            <w:r>
+              <w:t xml:space="preserve">Library</w:t>
+            </w:r>
+          </w:p>
+        </w:tc>
+        <w:tc>
+          <w:tcPr/>
+          <w:p>
+            <w:pPr>
+              <w:pStyle w:val="Compact"/>
+            </w:pPr>
+            <w:r>
+              <w:t xml:space="preserve">Implemented</w:t>
+            </w:r>
+          </w:p>
+        </w:tc>
+        <w:tc>
+          <w:tcPr/>
+          <w:p>
+            <w:pPr>
+              <w:pStyle w:val="Compact"/>
+            </w:pPr>
+            <w:r>
+              <w:t xml:space="preserve">Wired (verification pipeline)</w:t>
+            </w:r>
+          </w:p>
+        </w:tc>
+        <w:tc>
+          <w:tcPr/>
+          <w:p>
+            <w:pPr>
+              <w:pStyle w:val="Compact"/>
+            </w:pPr>
+            <w:r>
+              <w:t xml:space="preserve">Correctness fix (commit 97a8afd): a model with</w:t>
+            </w:r>
+            <w:r>
+              <w:t xml:space="preserve"> </w:t>
+            </w:r>
+            <w:r>
+              <w:rPr>
+                <w:rStyle w:val="VerbatimChar"/>
+              </w:rPr>
+              <w:t xml:space="preserve">affirmative_response=0</w:t>
+            </w:r>
+            <w:r>
+              <w:t xml:space="preserve"> </w:t>
+            </w:r>
+            <w:r>
+              <w:t xml:space="preserve">is now a HARD disqualifier — rejected by the verification gate regardless of other scores</w:t>
+            </w:r>
+          </w:p>
+        </w:tc>
+        <w:tc>
+          <w:tcPr/>
+          <w:p>
+            <w:pPr>
+              <w:pStyle w:val="Compact"/>
+            </w:pPr>
+            <w:r>
+              <w:t xml:space="preserve">Covered +</w:t>
+            </w:r>
+            <w:r>
+              <w:t xml:space="preserve"> </w:t>
+            </w:r>
+            <w:r>
+              <w:rPr>
+                <w:b/>
+                <w:bCs/>
+              </w:rPr>
+              <w:t xml:space="preserve">§11.4.115 polarity guard</w:t>
+            </w:r>
+            <w:r>
+              <w:t xml:space="preserve"> </w:t>
+            </w:r>
+            <w:r>
+              <w:rPr>
+                <w:rStyle w:val="VerbatimChar"/>
+              </w:rPr>
+              <w:t xml:space="preserve">pipeline_affirmative_gate_test.go</w:t>
+            </w:r>
+            <w:r>
+              <w:t xml:space="preserve"> </w:t>
+            </w:r>
+            <w:r>
+              <w:t xml:space="preserve">(default RED reproduces pre-fix defect;</w:t>
+            </w:r>
+            <w:r>
+              <w:t xml:space="preserve"> </w:t>
+            </w:r>
+            <w:r>
+              <w:rPr>
+                <w:rStyle w:val="VerbatimChar"/>
+              </w:rPr>
+              <w:t xml:space="preserve">RED_MODE=0</w:t>
+            </w:r>
+            <w:r>
+              <w:t xml:space="preserve"> </w:t>
+            </w:r>
+            <w:r>
+              <w:t xml:space="preserve">GREEN guard asserts ABSENT)</w:t>
+            </w:r>
+          </w:p>
+        </w:tc>
+        <w:tc>
+          <w:tcPr/>
+          <w:p>
+            <w:pPr>
+              <w:pStyle w:val="Compact"/>
+            </w:pPr>
+            <w:r>
+              <w:rPr>
+                <w:b/>
+                <w:bCs/>
+              </w:rPr>
+              <w:t xml:space="preserve">PASS</w:t>
+            </w:r>
+            <w:r>
+              <w:t xml:space="preserve"> </w:t>
+            </w:r>
+            <w:r>
+              <w:t xml:space="preserve">— observed this session: default RED correctly FAILs on pre-fix defect;</w:t>
+            </w:r>
+            <w:r>
+              <w:t xml:space="preserve"> </w:t>
+            </w:r>
+            <w:r>
+              <w:rPr>
+                <w:rStyle w:val="VerbatimChar"/>
+              </w:rPr>
+              <w:t xml:space="preserve">RED_MODE=0 go test -race</w:t>
+            </w:r>
+            <w:r>
+              <w:t xml:space="preserve"> </w:t>
+            </w:r>
+            <w:r>
+              <w:t xml:space="preserve">GREEN (</w:t>
+            </w:r>
+            <w:r>
+              <w:rPr>
+                <w:rStyle w:val="VerbatimChar"/>
+              </w:rPr>
+              <w:t xml:space="preserve">ok internal/verifier</w:t>
+            </w:r>
+            <w:r>
+              <w:t xml:space="preserve">)</w:t>
+            </w:r>
+          </w:p>
+        </w:tc>
+        <w:tc>
+          <w:tcPr/>
+          <w:p>
+            <w:pPr>
+              <w:pStyle w:val="Compact"/>
+            </w:pPr>
+            <w:r>
+              <w:t xml:space="preserve">N/A (§11.4.6 — internal verification gate, no user-visible surface)</w:t>
+            </w:r>
+          </w:p>
+        </w:tc>
+      </w:tr>
+    </w:tbl>
+    <w:bookmarkEnd w:id="42"/>
+    <w:bookmarkStart w:id="43" w:name="pkgpreparation-pre-translation-analysis"/>
     <w:p>
       <w:pPr>
         <w:pStyle w:val="Heading2"/>
@@ -31550,8 +32630,8 @@
         </w:tc>
       </w:tr>
     </w:tbl>
-    <w:bookmarkEnd w:id="41"/>
-    <w:bookmarkStart w:id="42" w:name="pkgcoordination-multi-llm-coordination"/>
+    <w:bookmarkEnd w:id="43"/>
+    <w:bookmarkStart w:id="44" w:name="pkgcoordination-multi-llm-coordination"/>
     <w:p>
       <w:pPr>
         <w:pStyle w:val="Heading2"/>
@@ -31900,8 +32980,8 @@
         </w:tc>
       </w:tr>
     </w:tbl>
-    <w:bookmarkEnd w:id="42"/>
-    <w:bookmarkStart w:id="43" w:name="pkgdistributed-ssh-distributed-workers"/>
+    <w:bookmarkEnd w:id="44"/>
+    <w:bookmarkStart w:id="45" w:name="pkgdistributed-ssh-distributed-workers"/>
     <w:p>
       <w:pPr>
         <w:pStyle w:val="Heading2"/>
@@ -32841,8 +33921,8 @@
         </w:tc>
       </w:tr>
     </w:tbl>
-    <w:bookmarkEnd w:id="43"/>
-    <w:bookmarkStart w:id="44" w:name="pkgsshworker"/>
+    <w:bookmarkEnd w:id="45"/>
+    <w:bookmarkStart w:id="46" w:name="pkgsshworker"/>
     <w:p>
       <w:pPr>
         <w:pStyle w:val="Heading2"/>
@@ -33176,8 +34256,8 @@
         </w:tc>
       </w:tr>
     </w:tbl>
-    <w:bookmarkEnd w:id="44"/>
-    <w:bookmarkStart w:id="45" w:name="pkgdeployment"/>
+    <w:bookmarkEnd w:id="46"/>
+    <w:bookmarkStart w:id="47" w:name="pkgdeployment"/>
     <w:p>
       <w:pPr>
         <w:pStyle w:val="Heading2"/>
@@ -33915,8 +34995,8 @@
         </w:tc>
       </w:tr>
     </w:tbl>
-    <w:bookmarkEnd w:id="45"/>
-    <w:bookmarkStart w:id="46" w:name="pkggrpc"/>
+    <w:bookmarkEnd w:id="47"/>
+    <w:bookmarkStart w:id="48" w:name="pkggrpc"/>
     <w:p>
       <w:pPr>
         <w:pStyle w:val="Heading2"/>
@@ -34250,8 +35330,8 @@
         </w:tc>
       </w:tr>
     </w:tbl>
-    <w:bookmarkEnd w:id="46"/>
-    <w:bookmarkStart w:id="47" w:name="pkgapi-library-layer"/>
+    <w:bookmarkEnd w:id="48"/>
+    <w:bookmarkStart w:id="49" w:name="pkgapi-library-layer"/>
     <w:p>
       <w:pPr>
         <w:pStyle w:val="Heading2"/>
@@ -34787,8 +35867,8 @@
         </w:tc>
       </w:tr>
     </w:tbl>
-    <w:bookmarkEnd w:id="47"/>
-    <w:bookmarkStart w:id="48" w:name="Xf05fe8b785bf319a92402d40b2067a9d7e1784d"/>
+    <w:bookmarkEnd w:id="49"/>
+    <w:bookmarkStart w:id="50" w:name="Xf05fe8b785bf319a92402d40b2067a9d7e1784d"/>
     <w:p>
       <w:pPr>
         <w:pStyle w:val="Heading2"/>
@@ -35728,8 +36808,8 @@
         </w:tc>
       </w:tr>
     </w:tbl>
-    <w:bookmarkEnd w:id="48"/>
-    <w:bookmarkStart w:id="49" w:name="pkglanguage"/>
+    <w:bookmarkEnd w:id="50"/>
+    <w:bookmarkStart w:id="51" w:name="pkglanguage"/>
     <w:p>
       <w:pPr>
         <w:pStyle w:val="Heading2"/>
@@ -36063,8 +37143,8 @@
         </w:tc>
       </w:tr>
     </w:tbl>
-    <w:bookmarkEnd w:id="49"/>
-    <w:bookmarkStart w:id="50" w:name="pkgmodels-modelsbridge"/>
+    <w:bookmarkEnd w:id="51"/>
+    <w:bookmarkStart w:id="52" w:name="pkgmodels-modelsbridge"/>
     <w:p>
       <w:pPr>
         <w:pStyle w:val="Heading2"/>
@@ -36802,8 +37882,474 @@
         </w:tc>
       </w:tr>
     </w:tbl>
-    <w:bookmarkEnd w:id="50"/>
-    <w:bookmarkStart w:id="51" w:name="pkgversion"/>
+    <w:bookmarkEnd w:id="52"/>
+    <w:bookmarkStart w:id="53" w:name="Xb329a3181bcf6089c6a68f38f54da14cf4334e4"/>
+    <w:p>
+      <w:pPr>
+        <w:pStyle w:val="Heading2"/>
+      </w:pPr>
+      <w:r>
+        <w:t xml:space="preserve">pkg/bridge — LLMsVerifier→component+agent bridge</w:t>
+      </w:r>
+    </w:p>
+    <w:p>
+      <w:pPr>
+        <w:pStyle w:val="FirstParagraph"/>
+      </w:pPr>
+      <w:r>
+        <w:t xml:space="preserve">In-process bridge (no local models) that selects the best LLMsVerifier-scored model and routes component/agent calls to it; backs</w:t>
+      </w:r>
+      <w:r>
+        <w:t xml:space="preserve"> </w:t>
+      </w:r>
+      <w:r>
+        <w:rPr>
+          <w:rStyle w:val="VerbatimChar"/>
+        </w:rPr>
+        <w:t xml:space="preserve">cmd/model-bridge</w:t>
+      </w:r>
+      <w:r>
+        <w:t xml:space="preserve"> </w:t>
+      </w:r>
+      <w:r>
+        <w:t xml:space="preserve">CLI + MCP. Source:</w:t>
+      </w:r>
+      <w:r>
+        <w:t xml:space="preserve"> </w:t>
+      </w:r>
+      <w:r>
+        <w:rPr>
+          <w:rStyle w:val="VerbatimChar"/>
+        </w:rPr>
+        <w:t xml:space="preserve">pkg/bridge/bridge.go</w:t>
+      </w:r>
+      <w:r>
+        <w:t xml:space="preserve">, commit ab1bed3 (+ routing mutation seam a5860b2).</w:t>
+      </w:r>
+    </w:p>
+    <w:tbl>
+      <w:tblPr>
+        <w:tblStyle w:val="Table"/>
+        <w:tblW w:type="pct" w:w="5000"/>
+        <w:tblLayout w:type="fixed"/>
+        <w:tblLook w:firstRow="1" w:lastRow="0" w:firstColumn="0" w:lastColumn="0" w:noHBand="0" w:noVBand="0" w:val="0020"/>
+      </w:tblPr>
+      <w:tblGrid>
+        <w:gridCol w:w="879"/>
+        <w:gridCol w:w="879"/>
+        <w:gridCol w:w="879"/>
+        <w:gridCol w:w="879"/>
+        <w:gridCol w:w="879"/>
+        <w:gridCol w:w="879"/>
+        <w:gridCol w:w="879"/>
+        <w:gridCol w:w="879"/>
+        <w:gridCol w:w="879"/>
+      </w:tblGrid>
+      <w:tr>
+        <w:trPr>
+          <w:tblHeader w:val="on"/>
+        </w:trPr>
+        <w:tc>
+          <w:tcPr/>
+          <w:p>
+            <w:pPr>
+              <w:pStyle w:val="Compact"/>
+            </w:pPr>
+            <w:r>
+              <w:t xml:space="preserve">Component</w:t>
+            </w:r>
+          </w:p>
+        </w:tc>
+        <w:tc>
+          <w:tcPr/>
+          <w:p>
+            <w:pPr>
+              <w:pStyle w:val="Compact"/>
+            </w:pPr>
+            <w:r>
+              <w:t xml:space="preserve">Feature</w:t>
+            </w:r>
+          </w:p>
+        </w:tc>
+        <w:tc>
+          <w:tcPr/>
+          <w:p>
+            <w:pPr>
+              <w:pStyle w:val="Compact"/>
+            </w:pPr>
+            <w:r>
+              <w:t xml:space="preserve">Category</w:t>
+            </w:r>
+          </w:p>
+        </w:tc>
+        <w:tc>
+          <w:tcPr/>
+          <w:p>
+            <w:pPr>
+              <w:pStyle w:val="Compact"/>
+            </w:pPr>
+            <w:r>
+              <w:t xml:space="preserve">Implementation</w:t>
+            </w:r>
+          </w:p>
+        </w:tc>
+        <w:tc>
+          <w:tcPr/>
+          <w:p>
+            <w:pPr>
+              <w:pStyle w:val="Compact"/>
+            </w:pPr>
+            <w:r>
+              <w:t xml:space="preserve">Wiring</w:t>
+            </w:r>
+          </w:p>
+        </w:tc>
+        <w:tc>
+          <w:tcPr/>
+          <w:p>
+            <w:pPr>
+              <w:pStyle w:val="Compact"/>
+            </w:pPr>
+            <w:r>
+              <w:t xml:space="preserve">Real-use</w:t>
+            </w:r>
+          </w:p>
+        </w:tc>
+        <w:tc>
+          <w:tcPr/>
+          <w:p>
+            <w:pPr>
+              <w:pStyle w:val="Compact"/>
+            </w:pPr>
+            <w:r>
+              <w:t xml:space="preserve">Tests</w:t>
+            </w:r>
+          </w:p>
+        </w:tc>
+        <w:tc>
+          <w:tcPr/>
+          <w:p>
+            <w:pPr>
+              <w:pStyle w:val="Compact"/>
+            </w:pPr>
+            <w:r>
+              <w:t xml:space="preserve">Validation</w:t>
+            </w:r>
+          </w:p>
+        </w:tc>
+        <w:tc>
+          <w:tcPr/>
+          <w:p>
+            <w:pPr>
+              <w:pStyle w:val="Compact"/>
+            </w:pPr>
+            <w:r>
+              <w:t xml:space="preserve">Video-confirmation</w:t>
+            </w:r>
+          </w:p>
+        </w:tc>
+      </w:tr>
+      <w:tr>
+        <w:tc>
+          <w:tcPr/>
+          <w:p>
+            <w:pPr>
+              <w:pStyle w:val="Compact"/>
+            </w:pPr>
+            <w:r>
+              <w:t xml:space="preserve">bridge</w:t>
+            </w:r>
+          </w:p>
+        </w:tc>
+        <w:tc>
+          <w:tcPr/>
+          <w:p>
+            <w:pPr>
+              <w:pStyle w:val="Compact"/>
+            </w:pPr>
+            <w:r>
+              <w:t xml:space="preserve">Best-model selection</w:t>
+            </w:r>
+          </w:p>
+        </w:tc>
+        <w:tc>
+          <w:tcPr/>
+          <w:p>
+            <w:pPr>
+              <w:pStyle w:val="Compact"/>
+            </w:pPr>
+            <w:r>
+              <w:t xml:space="preserve">Library</w:t>
+            </w:r>
+          </w:p>
+        </w:tc>
+        <w:tc>
+          <w:tcPr/>
+          <w:p>
+            <w:pPr>
+              <w:pStyle w:val="Compact"/>
+            </w:pPr>
+            <w:r>
+              <w:t xml:space="preserve">Implemented</w:t>
+            </w:r>
+          </w:p>
+        </w:tc>
+        <w:tc>
+          <w:tcPr/>
+          <w:p>
+            <w:pPr>
+              <w:pStyle w:val="Compact"/>
+            </w:pPr>
+            <w:r>
+              <w:t xml:space="preserve">Wired (via cmd/model-bridge CLI+MCP)</w:t>
+            </w:r>
+          </w:p>
+        </w:tc>
+        <w:tc>
+          <w:tcPr/>
+          <w:p>
+            <w:pPr>
+              <w:pStyle w:val="Compact"/>
+            </w:pPr>
+            <w:r>
+              <w:t xml:space="preserve">Picks top-1 LLMsVerifier-scored model with a fallback chain; no local models</w:t>
+            </w:r>
+          </w:p>
+        </w:tc>
+        <w:tc>
+          <w:tcPr/>
+          <w:p>
+            <w:pPr>
+              <w:pStyle w:val="Compact"/>
+            </w:pPr>
+            <w:r>
+              <w:t xml:space="preserve">Covered (</w:t>
+            </w:r>
+            <w:r>
+              <w:rPr>
+                <w:rStyle w:val="VerbatimChar"/>
+              </w:rPr>
+              <w:t xml:space="preserve">pkg/bridge/bridge_test.go</w:t>
+            </w:r>
+            <w:r>
+              <w:t xml:space="preserve"> </w:t>
+            </w:r>
+            <w:r>
+              <w:t xml:space="preserve">unit+integration, -race green)</w:t>
+            </w:r>
+          </w:p>
+        </w:tc>
+        <w:tc>
+          <w:tcPr/>
+          <w:p>
+            <w:pPr>
+              <w:pStyle w:val="Compact"/>
+            </w:pPr>
+            <w:r>
+              <w:rPr>
+                <w:b/>
+                <w:bCs/>
+              </w:rPr>
+              <w:t xml:space="preserve">PASS — real selection captured</w:t>
+            </w:r>
+            <w:r>
+              <w:t xml:space="preserve"> </w:t>
+            </w:r>
+            <w:r>
+              <w:t xml:space="preserve">(</w:t>
+            </w:r>
+            <w:r>
+              <w:rPr>
+                <w:rStyle w:val="VerbatimChar"/>
+              </w:rPr>
+              <w:t xml:space="preserve">groq/allam-2-7b</w:t>
+            </w:r>
+            <w:r>
+              <w:t xml:space="preserve"> </w:t>
+            </w:r>
+            <w:r>
+              <w:t xml:space="preserve">score 0.906)</w:t>
+            </w:r>
+          </w:p>
+        </w:tc>
+        <w:tc>
+          <w:tcPr/>
+          <w:p>
+            <w:pPr>
+              <w:pStyle w:val="Compact"/>
+            </w:pPr>
+            <w:r>
+              <w:t xml:space="preserve">N/A (internal selection logic — surfaced via cmd/model-bridge)</w:t>
+            </w:r>
+          </w:p>
+        </w:tc>
+      </w:tr>
+      <w:tr>
+        <w:tc>
+          <w:tcPr/>
+          <w:p>
+            <w:pPr>
+              <w:pStyle w:val="Compact"/>
+            </w:pPr>
+            <w:r>
+              <w:t xml:space="preserve">bridge</w:t>
+            </w:r>
+          </w:p>
+        </w:tc>
+        <w:tc>
+          <w:tcPr/>
+          <w:p>
+            <w:pPr>
+              <w:pStyle w:val="Compact"/>
+            </w:pPr>
+            <w:r>
+              <w:rPr>
+                <w:rStyle w:val="VerbatimChar"/>
+              </w:rPr>
+              <w:t xml:space="preserve">Invoke</w:t>
+            </w:r>
+            <w:r>
+              <w:t xml:space="preserve"> </w:t>
+            </w:r>
+            <w:r>
+              <w:t xml:space="preserve">routes to BestModel</w:t>
+            </w:r>
+          </w:p>
+        </w:tc>
+        <w:tc>
+          <w:tcPr/>
+          <w:p>
+            <w:pPr>
+              <w:pStyle w:val="Compact"/>
+            </w:pPr>
+            <w:r>
+              <w:t xml:space="preserve">Library</w:t>
+            </w:r>
+          </w:p>
+        </w:tc>
+        <w:tc>
+          <w:tcPr/>
+          <w:p>
+            <w:pPr>
+              <w:pStyle w:val="Compact"/>
+            </w:pPr>
+            <w:r>
+              <w:t xml:space="preserve">Implemented</w:t>
+            </w:r>
+          </w:p>
+        </w:tc>
+        <w:tc>
+          <w:tcPr/>
+          <w:p>
+            <w:pPr>
+              <w:pStyle w:val="Compact"/>
+            </w:pPr>
+            <w:r>
+              <w:t xml:space="preserve">Wired</w:t>
+            </w:r>
+          </w:p>
+        </w:tc>
+        <w:tc>
+          <w:tcPr/>
+          <w:p>
+            <w:pPr>
+              <w:pStyle w:val="Compact"/>
+            </w:pPr>
+            <w:r>
+              <w:t xml:space="preserve">Routes the invocation to the selected best model</w:t>
+            </w:r>
+          </w:p>
+        </w:tc>
+        <w:tc>
+          <w:tcPr/>
+          <w:p>
+            <w:pPr>
+              <w:pStyle w:val="Compact"/>
+            </w:pPr>
+            <w:r>
+              <w:t xml:space="preserve">Covered +</w:t>
+            </w:r>
+            <w:r>
+              <w:t xml:space="preserve"> </w:t>
+            </w:r>
+            <w:r>
+              <w:rPr>
+                <w:b/>
+                <w:bCs/>
+              </w:rPr>
+              <w:t xml:space="preserve">§1.1 paired mutation seam</w:t>
+            </w:r>
+            <w:r>
+              <w:t xml:space="preserve"> </w:t>
+            </w:r>
+            <w:r>
+              <w:rPr>
+                <w:rStyle w:val="VerbatimChar"/>
+              </w:rPr>
+              <w:t xml:space="preserve">TestBridge_Invoke_RoutesToBestModel</w:t>
+            </w:r>
+            <w:r>
+              <w:t xml:space="preserve"> </w:t>
+            </w:r>
+            <w:r>
+              <w:t xml:space="preserve">(RED FAILs on mis-route, -race green)</w:t>
+            </w:r>
+          </w:p>
+        </w:tc>
+        <w:tc>
+          <w:tcPr/>
+          <w:p>
+            <w:pPr>
+              <w:pStyle w:val="Compact"/>
+            </w:pPr>
+            <w:r>
+              <w:rPr>
+                <w:b/>
+                <w:bCs/>
+              </w:rPr>
+              <w:t xml:space="preserve">PASS</w:t>
+            </w:r>
+            <w:r>
+              <w:t xml:space="preserve"> </w:t>
+            </w:r>
+            <w:r>
+              <w:t xml:space="preserve">(</w:t>
+            </w:r>
+            <w:r>
+              <w:rPr>
+                <w:rStyle w:val="VerbatimChar"/>
+              </w:rPr>
+              <w:t xml:space="preserve">Invoke</w:t>
+            </w:r>
+            <w:r>
+              <w:t xml:space="preserve">→</w:t>
+            </w:r>
+            <w:r>
+              <w:t xml:space="preserve">“Buenos días, amigo.”</w:t>
+            </w:r>
+            <w:r>
+              <w:t xml:space="preserve"> </w:t>
+            </w:r>
+            <w:r>
+              <w:t xml:space="preserve">through selected model; routing guard catches mis-route)</w:t>
+            </w:r>
+          </w:p>
+        </w:tc>
+        <w:tc>
+          <w:tcPr/>
+          <w:p>
+            <w:pPr>
+              <w:pStyle w:val="Compact"/>
+            </w:pPr>
+            <w:r>
+              <w:t xml:space="preserve">N/A (internal routing — surfaced via cmd/model-bridge)</w:t>
+            </w:r>
+          </w:p>
+        </w:tc>
+      </w:tr>
+    </w:tbl>
+    <w:bookmarkEnd w:id="53"/>
+    <w:bookmarkStart w:id="54" w:name="pkgversion"/>
     <w:p>
       <w:pPr>
         <w:pStyle w:val="Heading2"/>
@@ -37137,8 +38683,8 @@
         </w:tc>
       </w:tr>
     </w:tbl>
-    <w:bookmarkEnd w:id="51"/>
-    <w:bookmarkStart w:id="52" w:name="X0fa75a363e3f61bef3dc5253e1fea2726fe312b"/>
+    <w:bookmarkEnd w:id="54"/>
+    <w:bookmarkStart w:id="55" w:name="X0fa75a363e3f61bef3dc5253e1fea2726fe312b"/>
     <w:p>
       <w:pPr>
         <w:pStyle w:val="Heading2"/>
@@ -37705,9 +39251,9 @@
         </w:pict>
       </w:r>
     </w:p>
-    <w:bookmarkEnd w:id="52"/>
-    <w:bookmarkEnd w:id="53"/>
-    <w:bookmarkStart w:id="63" w:name="web-dashboards-endpoints"/>
+    <w:bookmarkEnd w:id="55"/>
+    <w:bookmarkEnd w:id="56"/>
+    <w:bookmarkStart w:id="67" w:name="web-dashboards-endpoints"/>
     <w:p>
       <w:pPr>
         <w:pStyle w:val="Heading1"/>
@@ -37716,7 +39262,7 @@
         <w:t xml:space="preserve">3. Web Dashboards &amp; Endpoints</w:t>
       </w:r>
     </w:p>
-    <w:bookmarkStart w:id="54" w:name="web-dashboards"/>
+    <w:bookmarkStart w:id="57" w:name="web-dashboards"/>
     <w:p>
       <w:pPr>
         <w:pStyle w:val="Heading2"/>
@@ -40272,8 +41818,466 @@
         </w:tc>
       </w:tr>
     </w:tbl>
-    <w:bookmarkEnd w:id="54"/>
-    <w:bookmarkStart w:id="55" w:name="X387da94d96a175cef517fa87ca42ce184467b90"/>
+    <w:bookmarkEnd w:id="57"/>
+    <w:bookmarkStart w:id="58" w:name="X9ac04bc25e88e1bceefceb4c6eb437342eb5292"/>
+    <w:p>
+      <w:pPr>
+        <w:pStyle w:val="Heading2"/>
+      </w:pPr>
+      <w:r>
+        <w:t xml:space="preserve">Web Dashboard backend handler — pkg/api/dashboard.go</w:t>
+      </w:r>
+    </w:p>
+    <w:p>
+      <w:pPr>
+        <w:pStyle w:val="FirstParagraph"/>
+      </w:pPr>
+      <w:r>
+        <w:t xml:space="preserve">Backend that serves the dashboard page (</w:t>
+      </w:r>
+      <w:r>
+        <w:rPr>
+          <w:rStyle w:val="VerbatimChar"/>
+        </w:rPr>
+        <w:t xml:space="preserve">/</w:t>
+      </w:r>
+      <w:r>
+        <w:t xml:space="preserve">,</w:t>
+      </w:r>
+      <w:r>
+        <w:t xml:space="preserve"> </w:t>
+      </w:r>
+      <w:r>
+        <w:rPr>
+          <w:rStyle w:val="VerbatimChar"/>
+        </w:rPr>
+        <w:t xml:space="preserve">/dashboard</w:t>
+      </w:r>
+      <w:r>
+        <w:t xml:space="preserve">,</w:t>
+      </w:r>
+      <w:r>
+        <w:t xml:space="preserve"> </w:t>
+      </w:r>
+      <w:r>
+        <w:rPr>
+          <w:rStyle w:val="VerbatimChar"/>
+        </w:rPr>
+        <w:t xml:space="preserve">/monitor</w:t>
+      </w:r>
+      <w:r>
+        <w:t xml:space="preserve">) and the translations endpoints. Was previously UNROUTED (returned 404); now wired so the dashboard genuinely translates for end users. Source:</w:t>
+      </w:r>
+      <w:r>
+        <w:t xml:space="preserve"> </w:t>
+      </w:r>
+      <w:r>
+        <w:rPr>
+          <w:rStyle w:val="VerbatimChar"/>
+        </w:rPr>
+        <w:t xml:space="preserve">pkg/api/dashboard.go</w:t>
+      </w:r>
+      <w:r>
+        <w:t xml:space="preserve">, commit f6ba5cc.</w:t>
+      </w:r>
+    </w:p>
+    <w:tbl>
+      <w:tblPr>
+        <w:tblStyle w:val="Table"/>
+        <w:tblW w:type="pct" w:w="5000"/>
+        <w:tblLayout w:type="fixed"/>
+        <w:tblLook w:firstRow="1" w:lastRow="0" w:firstColumn="0" w:lastColumn="0" w:noHBand="0" w:noVBand="0" w:val="0020"/>
+      </w:tblPr>
+      <w:tblGrid>
+        <w:gridCol w:w="879"/>
+        <w:gridCol w:w="879"/>
+        <w:gridCol w:w="879"/>
+        <w:gridCol w:w="879"/>
+        <w:gridCol w:w="879"/>
+        <w:gridCol w:w="879"/>
+        <w:gridCol w:w="879"/>
+        <w:gridCol w:w="879"/>
+        <w:gridCol w:w="879"/>
+      </w:tblGrid>
+      <w:tr>
+        <w:trPr>
+          <w:tblHeader w:val="on"/>
+        </w:trPr>
+        <w:tc>
+          <w:tcPr/>
+          <w:p>
+            <w:pPr>
+              <w:pStyle w:val="Compact"/>
+            </w:pPr>
+            <w:r>
+              <w:t xml:space="preserve">Component</w:t>
+            </w:r>
+          </w:p>
+        </w:tc>
+        <w:tc>
+          <w:tcPr/>
+          <w:p>
+            <w:pPr>
+              <w:pStyle w:val="Compact"/>
+            </w:pPr>
+            <w:r>
+              <w:t xml:space="preserve">Feature</w:t>
+            </w:r>
+          </w:p>
+        </w:tc>
+        <w:tc>
+          <w:tcPr/>
+          <w:p>
+            <w:pPr>
+              <w:pStyle w:val="Compact"/>
+            </w:pPr>
+            <w:r>
+              <w:t xml:space="preserve">Category</w:t>
+            </w:r>
+          </w:p>
+        </w:tc>
+        <w:tc>
+          <w:tcPr/>
+          <w:p>
+            <w:pPr>
+              <w:pStyle w:val="Compact"/>
+            </w:pPr>
+            <w:r>
+              <w:t xml:space="preserve">Implementation</w:t>
+            </w:r>
+          </w:p>
+        </w:tc>
+        <w:tc>
+          <w:tcPr/>
+          <w:p>
+            <w:pPr>
+              <w:pStyle w:val="Compact"/>
+            </w:pPr>
+            <w:r>
+              <w:t xml:space="preserve">Wiring</w:t>
+            </w:r>
+          </w:p>
+        </w:tc>
+        <w:tc>
+          <w:tcPr/>
+          <w:p>
+            <w:pPr>
+              <w:pStyle w:val="Compact"/>
+            </w:pPr>
+            <w:r>
+              <w:t xml:space="preserve">Real-use</w:t>
+            </w:r>
+          </w:p>
+        </w:tc>
+        <w:tc>
+          <w:tcPr/>
+          <w:p>
+            <w:pPr>
+              <w:pStyle w:val="Compact"/>
+            </w:pPr>
+            <w:r>
+              <w:t xml:space="preserve">Tests</w:t>
+            </w:r>
+          </w:p>
+        </w:tc>
+        <w:tc>
+          <w:tcPr/>
+          <w:p>
+            <w:pPr>
+              <w:pStyle w:val="Compact"/>
+            </w:pPr>
+            <w:r>
+              <w:t xml:space="preserve">Validation</w:t>
+            </w:r>
+          </w:p>
+        </w:tc>
+        <w:tc>
+          <w:tcPr/>
+          <w:p>
+            <w:pPr>
+              <w:pStyle w:val="Compact"/>
+            </w:pPr>
+            <w:r>
+              <w:t xml:space="preserve">Video-confirmation</w:t>
+            </w:r>
+          </w:p>
+        </w:tc>
+      </w:tr>
+      <w:tr>
+        <w:tc>
+          <w:tcPr/>
+          <w:p>
+            <w:pPr>
+              <w:pStyle w:val="Compact"/>
+            </w:pPr>
+            <w:r>
+              <w:t xml:space="preserve">api/dashboard.go</w:t>
+            </w:r>
+          </w:p>
+        </w:tc>
+        <w:tc>
+          <w:tcPr/>
+          <w:p>
+            <w:pPr>
+              <w:pStyle w:val="Compact"/>
+            </w:pPr>
+            <w:r>
+              <w:t xml:space="preserve">Dashboard page + translations endpoints</w:t>
+            </w:r>
+          </w:p>
+        </w:tc>
+        <w:tc>
+          <w:tcPr/>
+          <w:p>
+            <w:pPr>
+              <w:pStyle w:val="Compact"/>
+            </w:pPr>
+            <w:r>
+              <w:t xml:space="preserve">Web</w:t>
+            </w:r>
+          </w:p>
+        </w:tc>
+        <w:tc>
+          <w:tcPr/>
+          <w:p>
+            <w:pPr>
+              <w:pStyle w:val="Compact"/>
+            </w:pPr>
+            <w:r>
+              <w:t xml:space="preserve">Implemented</w:t>
+            </w:r>
+          </w:p>
+        </w:tc>
+        <w:tc>
+          <w:tcPr/>
+          <w:p>
+            <w:pPr>
+              <w:pStyle w:val="Compact"/>
+            </w:pPr>
+            <w:r>
+              <w:t xml:space="preserve">Wired (was Unwired/404 pre-fix)</w:t>
+            </w:r>
+          </w:p>
+        </w:tc>
+        <w:tc>
+          <w:tcPr/>
+          <w:p>
+            <w:pPr>
+              <w:pStyle w:val="Compact"/>
+            </w:pPr>
+            <w:r>
+              <w:t xml:space="preserve">Serves the dashboard HTML at</w:t>
+            </w:r>
+            <w:r>
+              <w:t xml:space="preserve"> </w:t>
+            </w:r>
+            <w:r>
+              <w:rPr>
+                <w:rStyle w:val="VerbatimChar"/>
+              </w:rPr>
+              <w:t xml:space="preserve">/</w:t>
+            </w:r>
+            <w:r>
+              <w:t xml:space="preserve">,</w:t>
+            </w:r>
+            <w:r>
+              <w:t xml:space="preserve"> </w:t>
+            </w:r>
+            <w:r>
+              <w:rPr>
+                <w:rStyle w:val="VerbatimChar"/>
+              </w:rPr>
+              <w:t xml:space="preserve">/dashboard</w:t>
+            </w:r>
+            <w:r>
+              <w:t xml:space="preserve">,</w:t>
+            </w:r>
+            <w:r>
+              <w:t xml:space="preserve"> </w:t>
+            </w:r>
+            <w:r>
+              <w:rPr>
+                <w:rStyle w:val="VerbatimChar"/>
+              </w:rPr>
+              <w:t xml:space="preserve">/monitor</w:t>
+            </w:r>
+            <w:r>
+              <w:t xml:space="preserve"> </w:t>
+            </w:r>
+            <w:r>
+              <w:t xml:space="preserve">and the</w:t>
+            </w:r>
+            <w:r>
+              <w:t xml:space="preserve"> </w:t>
+            </w:r>
+            <w:r>
+              <w:rPr>
+                <w:rStyle w:val="VerbatimChar"/>
+              </w:rPr>
+              <w:t xml:space="preserve">GET/POST /api/v1/translations</w:t>
+            </w:r>
+            <w:r>
+              <w:t xml:space="preserve"> </w:t>
+            </w:r>
+            <w:r>
+              <w:t xml:space="preserve">path; Start-Translation now runs a real translation through the wired UI path (no longer a 404)</w:t>
+            </w:r>
+          </w:p>
+        </w:tc>
+        <w:tc>
+          <w:tcPr/>
+          <w:p>
+            <w:pPr>
+              <w:pStyle w:val="Compact"/>
+            </w:pPr>
+            <w:r>
+              <w:t xml:space="preserve">Covered +</w:t>
+            </w:r>
+            <w:r>
+              <w:t xml:space="preserve"> </w:t>
+            </w:r>
+            <w:r>
+              <w:rPr>
+                <w:b/>
+                <w:bCs/>
+              </w:rPr>
+              <w:t xml:space="preserve">§11.4.115 RED→GREEN guard</w:t>
+            </w:r>
+            <w:r>
+              <w:t xml:space="preserve"> </w:t>
+            </w:r>
+            <w:r>
+              <w:rPr>
+                <w:rStyle w:val="VerbatimChar"/>
+              </w:rPr>
+              <w:t xml:space="preserve">dashboard_test.go</w:t>
+            </w:r>
+            <w:r>
+              <w:t xml:space="preserve"> </w:t>
+            </w:r>
+            <w:r>
+              <w:t xml:space="preserve">(default GREEN asserts pages 200 + real translation start;</w:t>
+            </w:r>
+            <w:r>
+              <w:t xml:space="preserve"> </w:t>
+            </w:r>
+            <w:r>
+              <w:rPr>
+                <w:rStyle w:val="VerbatimChar"/>
+              </w:rPr>
+              <w:t xml:space="preserve">RED_MODE=1</w:t>
+            </w:r>
+            <w:r>
+              <w:t xml:space="preserve"> </w:t>
+            </w:r>
+            <w:r>
+              <w:t xml:space="preserve">reproduces the pre-fix 404) —</w:t>
+            </w:r>
+            <w:r>
+              <w:t xml:space="preserve"> </w:t>
+            </w:r>
+            <w:r>
+              <w:rPr>
+                <w:rStyle w:val="VerbatimChar"/>
+              </w:rPr>
+              <w:t xml:space="preserve">go test -race ./pkg/api</w:t>
+            </w:r>
+            <w:r>
+              <w:t xml:space="preserve"> </w:t>
+            </w:r>
+            <w:r>
+              <w:t xml:space="preserve">GREEN this session</w:t>
+            </w:r>
+          </w:p>
+        </w:tc>
+        <w:tc>
+          <w:tcPr/>
+          <w:p>
+            <w:pPr>
+              <w:pStyle w:val="Compact"/>
+            </w:pPr>
+            <w:r>
+              <w:rPr>
+                <w:b/>
+                <w:bCs/>
+              </w:rPr>
+              <w:t xml:space="preserve">PASS (unit/integration)</w:t>
+            </w:r>
+            <w:r>
+              <w:t xml:space="preserve"> </w:t>
+            </w:r>
+            <w:r>
+              <w:t xml:space="preserve">—</w:t>
+            </w:r>
+            <w:r>
+              <w:t xml:space="preserve"> </w:t>
+            </w:r>
+            <w:r>
+              <w:rPr>
+                <w:rStyle w:val="VerbatimChar"/>
+              </w:rPr>
+              <w:t xml:space="preserve">dashboard_test.go</w:t>
+            </w:r>
+            <w:r>
+              <w:t xml:space="preserve"> </w:t>
+            </w:r>
+            <w:r>
+              <w:t xml:space="preserve">observed green this session; live run produced real translation</w:t>
+            </w:r>
+            <w:r>
+              <w:t xml:space="preserve"> </w:t>
+            </w:r>
+            <w:r>
+              <w:t xml:space="preserve">“Dobro jutro, prijatelju.”</w:t>
+            </w:r>
+            <w:r>
+              <w:t xml:space="preserve"> </w:t>
+            </w:r>
+            <w:r>
+              <w:t xml:space="preserve">through the dashboard handler</w:t>
+            </w:r>
+          </w:p>
+        </w:tc>
+        <w:tc>
+          <w:tcPr/>
+          <w:p>
+            <w:pPr>
+              <w:pStyle w:val="Compact"/>
+            </w:pPr>
+            <w:r>
+              <w:rPr>
+                <w:b/>
+                <w:bCs/>
+              </w:rPr>
+              <w:t xml:space="preserve">SKIP (§11.4.3/§11.4.52)</w:t>
+            </w:r>
+            <w:r>
+              <w:t xml:space="preserve"> </w:t>
+            </w:r>
+            <w:r>
+              <w:t xml:space="preserve">— autonomous browser+video capture needs the HelixQA web/video backend, off-limits to this session; tracked migration item owed (a</w:t>
+            </w:r>
+            <w:r>
+              <w:t xml:space="preserve"> </w:t>
+            </w:r>
+            <w:r>
+              <w:rPr>
+                <w:rStyle w:val="VerbatimChar"/>
+              </w:rPr>
+              <w:t xml:space="preserve">helixtranslate-web-dashboard-*</w:t>
+            </w:r>
+            <w:r>
+              <w:t xml:space="preserve"> </w:t>
+            </w:r>
+            <w:r>
+              <w:t xml:space="preserve">recording requires that backend). NOT a faked confirmation</w:t>
+            </w:r>
+          </w:p>
+        </w:tc>
+      </w:tr>
+    </w:tbl>
+    <w:bookmarkEnd w:id="58"/>
+    <w:bookmarkStart w:id="59" w:name="X387da94d96a175cef517fa87ca42ce184467b90"/>
     <w:p>
       <w:pPr>
         <w:pStyle w:val="Heading2"/>
@@ -41045,8 +43049,8 @@
         </w:tc>
       </w:tr>
     </w:tbl>
-    <w:bookmarkEnd w:id="55"/>
-    <w:bookmarkStart w:id="56" w:name="X398b0092a0a7c37c2b92cfaaefcfd08b078e45d"/>
+    <w:bookmarkEnd w:id="59"/>
+    <w:bookmarkStart w:id="60" w:name="X398b0092a0a7c37c2b92cfaaefcfd08b078e45d"/>
     <w:p>
       <w:pPr>
         <w:pStyle w:val="Heading2"/>
@@ -44006,8 +46010,8 @@
         </w:tc>
       </w:tr>
     </w:tbl>
-    <w:bookmarkEnd w:id="56"/>
-    <w:bookmarkStart w:id="57" w:name="X3713199935696050c5dc5acce9d846a79866152"/>
+    <w:bookmarkEnd w:id="60"/>
+    <w:bookmarkStart w:id="61" w:name="X3713199935696050c5dc5acce9d846a79866152"/>
     <w:p>
       <w:pPr>
         <w:pStyle w:val="Heading2"/>
@@ -44359,8 +46363,8 @@
         </w:tc>
       </w:tr>
     </w:tbl>
-    <w:bookmarkEnd w:id="57"/>
-    <w:bookmarkStart w:id="58" w:name="X99b93f9ae79b0ed11af9ebbe1f24e68b3691747"/>
+    <w:bookmarkEnd w:id="61"/>
+    <w:bookmarkStart w:id="62" w:name="X99b93f9ae79b0ed11af9ebbe1f24e68b3691747"/>
     <w:p>
       <w:pPr>
         <w:pStyle w:val="Heading2"/>
@@ -45112,8 +47116,8 @@
         </w:tc>
       </w:tr>
     </w:tbl>
-    <w:bookmarkEnd w:id="58"/>
-    <w:bookmarkStart w:id="59" w:name="X946ae957ca43e21e617ae0957901c7fe6473f8d"/>
+    <w:bookmarkEnd w:id="62"/>
+    <w:bookmarkStart w:id="63" w:name="X946ae957ca43e21e617ae0957901c7fe6473f8d"/>
     <w:p>
       <w:pPr>
         <w:pStyle w:val="Heading2"/>
@@ -46356,8 +48360,8 @@
         </w:tc>
       </w:tr>
     </w:tbl>
-    <w:bookmarkEnd w:id="59"/>
-    <w:bookmarkStart w:id="60" w:name="websocket-hub-fan-out"/>
+    <w:bookmarkEnd w:id="63"/>
+    <w:bookmarkStart w:id="64" w:name="websocket-hub-fan-out"/>
     <w:p>
       <w:pPr>
         <w:pStyle w:val="Heading2"/>
@@ -46691,8 +48695,8 @@
         </w:tc>
       </w:tr>
     </w:tbl>
-    <w:bookmarkEnd w:id="60"/>
-    <w:bookmarkStart w:id="61" w:name="Xe80782b3db4addeaf55ee3392786a2c2117da7d"/>
+    <w:bookmarkEnd w:id="64"/>
+    <w:bookmarkStart w:id="65" w:name="Xe80782b3db4addeaf55ee3392786a2c2117da7d"/>
     <w:p>
       <w:pPr>
         <w:pStyle w:val="Heading2"/>
@@ -47543,8 +49547,8 @@
         </w:tc>
       </w:tr>
     </w:tbl>
-    <w:bookmarkEnd w:id="61"/>
-    <w:bookmarkStart w:id="62" w:name="cors-middleware-auth-infra"/>
+    <w:bookmarkEnd w:id="65"/>
+    <w:bookmarkStart w:id="66" w:name="cors-middleware-auth-infra"/>
     <w:p>
       <w:pPr>
         <w:pStyle w:val="Heading2"/>
@@ -48203,9 +50207,9 @@
         </w:pict>
       </w:r>
     </w:p>
-    <w:bookmarkEnd w:id="62"/>
-    <w:bookmarkEnd w:id="63"/>
-    <w:bookmarkStart w:id="74" w:name="owned-submodules"/>
+    <w:bookmarkEnd w:id="66"/>
+    <w:bookmarkEnd w:id="67"/>
+    <w:bookmarkStart w:id="78" w:name="owned-submodules"/>
     <w:p>
       <w:pPr>
         <w:pStyle w:val="Heading1"/>
@@ -48214,7 +50218,7 @@
         <w:t xml:space="preserve">4. Owned Submodules</w:t>
       </w:r>
     </w:p>
-    <w:bookmarkStart w:id="64" w:name="challenges"/>
+    <w:bookmarkStart w:id="68" w:name="challenges"/>
     <w:p>
       <w:pPr>
         <w:pStyle w:val="Heading2"/>
@@ -49861,8 +51865,8 @@
         </w:tc>
       </w:tr>
     </w:tbl>
-    <w:bookmarkEnd w:id="64"/>
-    <w:bookmarkStart w:id="65" w:name="containers"/>
+    <w:bookmarkEnd w:id="68"/>
+    <w:bookmarkStart w:id="69" w:name="containers"/>
     <w:p>
       <w:pPr>
         <w:pStyle w:val="Heading2"/>
@@ -51610,8 +53614,8 @@
         </w:tc>
       </w:tr>
     </w:tbl>
-    <w:bookmarkEnd w:id="65"/>
-    <w:bookmarkStart w:id="66" w:name="doc_processor"/>
+    <w:bookmarkEnd w:id="69"/>
+    <w:bookmarkStart w:id="70" w:name="doc_processor"/>
     <w:p>
       <w:pPr>
         <w:pStyle w:val="Heading2"/>
@@ -52551,8 +54555,8 @@
         </w:tc>
       </w:tr>
     </w:tbl>
-    <w:bookmarkEnd w:id="66"/>
-    <w:bookmarkStart w:id="67" w:name="docs_chain"/>
+    <w:bookmarkEnd w:id="70"/>
+    <w:bookmarkStart w:id="71" w:name="docs_chain"/>
     <w:p>
       <w:pPr>
         <w:pStyle w:val="Heading2"/>
@@ -53950,8 +55954,8 @@
         </w:tc>
       </w:tr>
     </w:tbl>
-    <w:bookmarkEnd w:id="67"/>
-    <w:bookmarkStart w:id="68" w:name="llm_orchestrator"/>
+    <w:bookmarkEnd w:id="71"/>
+    <w:bookmarkStart w:id="72" w:name="llm_orchestrator"/>
     <w:p>
       <w:pPr>
         <w:pStyle w:val="Heading2"/>
@@ -54790,8 +56794,8 @@
         </w:tc>
       </w:tr>
     </w:tbl>
-    <w:bookmarkEnd w:id="68"/>
-    <w:bookmarkStart w:id="69" w:name="llm_provider"/>
+    <w:bookmarkEnd w:id="72"/>
+    <w:bookmarkStart w:id="73" w:name="llm_provider"/>
     <w:p>
       <w:pPr>
         <w:pStyle w:val="Heading2"/>
@@ -55731,8 +57735,8 @@
         </w:tc>
       </w:tr>
     </w:tbl>
-    <w:bookmarkEnd w:id="69"/>
-    <w:bookmarkStart w:id="70" w:name="llms_verifier"/>
+    <w:bookmarkEnd w:id="73"/>
+    <w:bookmarkStart w:id="74" w:name="llms_verifier"/>
     <w:p>
       <w:pPr>
         <w:pStyle w:val="Heading2"/>
@@ -57385,8 +59389,8 @@
         </w:tc>
       </w:tr>
     </w:tbl>
-    <w:bookmarkEnd w:id="70"/>
-    <w:bookmarkStart w:id="71" w:name="security"/>
+    <w:bookmarkEnd w:id="74"/>
+    <w:bookmarkStart w:id="75" w:name="security"/>
     <w:p>
       <w:pPr>
         <w:pStyle w:val="Heading2"/>
@@ -58730,8 +60734,8 @@
         </w:tc>
       </w:tr>
     </w:tbl>
-    <w:bookmarkEnd w:id="71"/>
-    <w:bookmarkStart w:id="72" w:name="vision_engine"/>
+    <w:bookmarkEnd w:id="75"/>
+    <w:bookmarkStart w:id="76" w:name="vision_engine"/>
     <w:p>
       <w:pPr>
         <w:pStyle w:val="Heading2"/>
@@ -59476,8 +61480,8 @@
         </w:pict>
       </w:r>
     </w:p>
-    <w:bookmarkEnd w:id="72"/>
-    <w:bookmarkStart w:id="73" w:name="honest-gaps-caveats-11.4.6"/>
+    <w:bookmarkEnd w:id="76"/>
+    <w:bookmarkStart w:id="77" w:name="honest-gaps-caveats-11.4.6"/>
     <w:p>
       <w:pPr>
         <w:pStyle w:val="Heading2"/>
@@ -59551,7 +61555,7 @@
           <w:b/>
           <w:bCs/>
         </w:rPr>
-        <w:t xml:space="preserve">DOCX output is now Implemented (Rev 3, commit 87cd2be)</w:t>
+        <w:t xml:space="preserve">DOCX output is Implemented (Rev 3, commit 87cd2be)</w:t>
       </w:r>
       <w:r>
         <w:t xml:space="preserve"> </w:t>
@@ -59584,7 +61588,50 @@
         <w:t xml:space="preserve">Microsoft Word 2007+</w:t>
       </w:r>
       <w:r>
-        <w:t xml:space="preserve">. PDF output is still unimplemented (no PDF writer in</w:t>
+        <w:t xml:space="preserve">.</w:t>
+      </w:r>
+      <w:r>
+        <w:t xml:space="preserve"> </w:t>
+      </w:r>
+      <w:r>
+        <w:rPr>
+          <w:b/>
+          <w:bCs/>
+        </w:rPr>
+        <w:t xml:space="preserve">PDF output is now Implemented (Rev 4, commit fb265e7)</w:t>
+      </w:r>
+      <w:r>
+        <w:t xml:space="preserve"> </w:t>
+      </w:r>
+      <w:r>
+        <w:t xml:space="preserve">—</w:t>
+      </w:r>
+      <w:r>
+        <w:t xml:space="preserve"> </w:t>
+      </w:r>
+      <w:r>
+        <w:rPr>
+          <w:rStyle w:val="VerbatimChar"/>
+        </w:rPr>
+        <w:t xml:space="preserve">pkg/ebook/pdf_writer.go</w:t>
+      </w:r>
+      <w:r>
+        <w:t xml:space="preserve"> </w:t>
+      </w:r>
+      <w:r>
+        <w:t xml:space="preserve">(Book→HTML5→weasyprint→Cyrillic-faithful PDF), wired into unified-translator (</w:t>
+      </w:r>
+      <w:r>
+        <w:rPr>
+          <w:rStyle w:val="VerbatimChar"/>
+        </w:rPr>
+        <w:t xml:space="preserve">.pdf</w:t>
+      </w:r>
+      <w:r>
+        <w:t xml:space="preserve"> </w:t>
+      </w:r>
+      <w:r>
+        <w:t xml:space="preserve">output, main.go:1160);</w:t>
       </w:r>
       <w:r>
         <w:t xml:space="preserve"> </w:t>
@@ -59596,19 +61643,10 @@
         <w:t xml:space="preserve">pkg/ebook</w:t>
       </w:r>
       <w:r>
-        <w:t xml:space="preserve">; unified-translator rejects</w:t>
-      </w:r>
-      <w:r>
         <w:t xml:space="preserve"> </w:t>
       </w:r>
       <w:r>
-        <w:rPr>
-          <w:rStyle w:val="VerbatimChar"/>
-        </w:rPr>
-        <w:t xml:space="preserve">.pdf</w:t>
-      </w:r>
-      <w:r>
-        <w:t xml:space="preserve">). Output formats are now EPUB/FB2/TXT/HTML/MD/DOCX.</w:t>
+        <w:t xml:space="preserve">PDF tests green. Output formats are now EPUB/FB2/TXT/HTML/MD/DOCX/PDF.</w:t>
       </w:r>
       <w:r>
         <w:t xml:space="preserve"> </w:t>
@@ -60313,8 +62351,8 @@
         <w:t xml:space="preserve">— noted inline rather than asserted.</w:t>
       </w:r>
     </w:p>
-    <w:bookmarkEnd w:id="73"/>
-    <w:bookmarkEnd w:id="74"/>
+    <w:bookmarkEnd w:id="77"/>
+    <w:bookmarkEnd w:id="78"/>
     <w:sectPr>
       <w:footnotePr>
         <w:numRestart w:val="eachSect"/>

</xml_diff>

<commit_message>
docs(features §11.4.153): bridge real-use video confirmed — novita/Sao10K/L3-8B-Stheno-v3.2 live EN->ES translation, ffprobe-verified (8.0s/80fr, .mp4 at /Volumes/T7/Downloads/Recordings/helixtranslate-bridge-bestmodel-translate-20260615.mp4); video-confirmed 21->22
</commit_message>
<xml_diff>
--- a/docs/features/Status.docx
+++ b/docs/features/Status.docx
@@ -34,7 +34,7 @@
         <w:t xml:space="preserve"> </w:t>
       </w:r>
       <w:r>
-        <w:t xml:space="preserve">4</w:t>
+        <w:t xml:space="preserve">5</w:t>
       </w:r>
       <w:r>
         <w:t xml:space="preserve"> </w:t>
@@ -50,7 +50,7 @@
         <w:t xml:space="preserve"> </w:t>
       </w:r>
       <w:r>
-        <w:t xml:space="preserve">2026-06-15T20:10:00Z</w:t>
+        <w:t xml:space="preserve">2026-06-15T22:30:00Z</w:t>
       </w:r>
       <w:r>
         <w:t xml:space="preserve"> </w:t>
@@ -192,7 +192,7 @@
           <w:b/>
           <w:bCs/>
         </w:rPr>
-        <w:t xml:space="preserve">21 feature rows are video-confirmed</w:t>
+        <w:t xml:space="preserve">22 feature rows are video-confirmed</w:t>
       </w:r>
       <w:r>
         <w:t xml:space="preserve"> </w:t>
@@ -253,7 +253,98 @@
         <w:t xml:space="preserve">multi-pass polishing engine</w:t>
       </w:r>
       <w:r>
-        <w:t xml:space="preserve">), the REST API server (POST /api/v1/translate real DeepSeek + target_lang FIXED, TLS startup FIXED, /health · /api/v1/version · /api/v1/providers), the gRPC server (real EN→ES), markdown-translator (EPUB↔MD round-trip), preparation-translator (FIXED real analysis), cmd/cli (real DeepSeek), monitor-server (live WS hub), and the DeepSeek library client.</w:t>
+        <w:t xml:space="preserve">), the REST API server (POST /api/v1/translate real DeepSeek + target_lang FIXED, TLS startup FIXED, /health · /api/v1/version · /api/v1/providers), the gRPC server (real EN→ES), markdown-translator (EPUB↔MD round-trip), preparation-translator (FIXED real analysis), cmd/cli (real DeepSeek), monitor-server (live WS hub), the DeepSeek library client, and the</w:t>
+      </w:r>
+      <w:r>
+        <w:t xml:space="preserve"> </w:t>
+      </w:r>
+      <w:r>
+        <w:rPr>
+          <w:b/>
+          <w:bCs/>
+        </w:rPr>
+        <w:t xml:space="preserve">LLMsVerifier→agent bridge CLI</w:t>
+      </w:r>
+      <w:r>
+        <w:t xml:space="preserve"> </w:t>
+      </w:r>
+      <w:r>
+        <w:t xml:space="preserve">(</w:t>
+      </w:r>
+      <w:r>
+        <w:rPr>
+          <w:rStyle w:val="VerbatimChar"/>
+        </w:rPr>
+        <w:t xml:space="preserve">cmd/model-bridge</w:t>
+      </w:r>
+      <w:r>
+        <w:t xml:space="preserve"> </w:t>
+      </w:r>
+      <w:r>
+        <w:t xml:space="preserve">—</w:t>
+      </w:r>
+      <w:r>
+        <w:t xml:space="preserve"> </w:t>
+      </w:r>
+      <w:r>
+        <w:rPr>
+          <w:rStyle w:val="VerbatimChar"/>
+        </w:rPr>
+        <w:t xml:space="preserve">helixtranslate-bridge-bestmodel-translate-20260615.mp4</w:t>
+      </w:r>
+      <w:r>
+        <w:t xml:space="preserve">: in-process verify→SQLite store→select strongest</w:t>
+      </w:r>
+      <w:r>
+        <w:t xml:space="preserve"> </w:t>
+      </w:r>
+      <w:r>
+        <w:rPr>
+          <w:rStyle w:val="VerbatimChar"/>
+        </w:rPr>
+        <w:t xml:space="preserve">novita/Sao10K/L3-8B-Stheno-v3.2</w:t>
+      </w:r>
+      <w:r>
+        <w:t xml:space="preserve"> </w:t>
+      </w:r>
+      <w:r>
+        <w:t xml:space="preserve">score 0.919 → live</w:t>
+      </w:r>
+      <w:r>
+        <w:t xml:space="preserve"> </w:t>
+      </w:r>
+      <w:r>
+        <w:rPr>
+          <w:rStyle w:val="VerbatimChar"/>
+        </w:rPr>
+        <w:t xml:space="preserve">invoke</w:t>
+      </w:r>
+      <w:r>
+        <w:t xml:space="preserve"> </w:t>
+      </w:r>
+      <w:r>
+        <w:t xml:space="preserve">EN→ES</w:t>
+      </w:r>
+      <w:r>
+        <w:t xml:space="preserve"> </w:t>
+      </w:r>
+      <w:r>
+        <w:t xml:space="preserve">“Good morning, friend.”</w:t>
+      </w:r>
+      <w:r>
+        <w:t xml:space="preserve"> </w:t>
+      </w:r>
+      <w:r>
+        <w:t xml:space="preserve">→</w:t>
+      </w:r>
+      <w:r>
+        <w:t xml:space="preserve"> </w:t>
+      </w:r>
+      <w:r>
+        <w:t xml:space="preserve">“Buenos días, amigo.”</w:t>
+      </w:r>
+      <w:r>
+        <w:t xml:space="preserve">; ffprobe 8.0s/80 frames, ≥6 frames content-verified).</w:t>
       </w:r>
       <w:r>
         <w:t xml:space="preserve"> </w:t>
@@ -1081,13 +1172,13 @@
                 <w:b/>
                 <w:bCs/>
               </w:rPr>
-              <w:t xml:space="preserve">21</w:t>
+              <w:t xml:space="preserve">22</w:t>
             </w:r>
             <w:r>
               <w:t xml:space="preserve"> </w:t>
             </w:r>
             <w:r>
-              <w:t xml:space="preserve">(real, content-verified recordings this session — see Anti-bluff note) — ≈ 4.4% of 478 enumerated rows (≈ 5.0% of the 417 headline). Plus</w:t>
+              <w:t xml:space="preserve">(real, content-verified recordings this session — see Anti-bluff note) — ≈ 4.6% of 478 enumerated rows (≈ 5.3% of the 417 headline). Plus</w:t>
             </w:r>
             <w:r>
               <w:t xml:space="preserve"> </w:t>
@@ -1133,7 +1224,50 @@
               <w:t xml:space="preserve"> </w:t>
             </w:r>
             <w:r>
-              <w:t xml:space="preserve">tests green + weasyprint present; both video PENDING). Rev-4 additions (bridge CLI+MCP, pkg/bridge, internal/verifier gate, pkg/api/dashboard.go) are PASS at unit/integration/live-run level with video PENDING (terminal-surface recordings owed) or SKIP (web dashboard — needs HelixQA web/video backend) or N/A (internal logic) — none claim a video that doesn’t exist</w:t>
+              <w:t xml:space="preserve">tests green + weasyprint present; both video PENDING). Rev-5 (this run) flips the</w:t>
+            </w:r>
+            <w:r>
+              <w:t xml:space="preserve"> </w:t>
+            </w:r>
+            <w:r>
+              <w:rPr>
+                <w:b/>
+                <w:bCs/>
+              </w:rPr>
+              <w:t xml:space="preserve">LLMsVerifier→agent bridge CLI</w:t>
+            </w:r>
+            <w:r>
+              <w:t xml:space="preserve"> </w:t>
+            </w:r>
+            <w:r>
+              <w:t xml:space="preserve">row video PENDING→CONFIRMED (</w:t>
+            </w:r>
+            <w:r>
+              <w:rPr>
+                <w:rStyle w:val="VerbatimChar"/>
+              </w:rPr>
+              <w:t xml:space="preserve">helixtranslate-bridge-bestmodel-translate-20260615.mp4</w:t>
+            </w:r>
+            <w:r>
+              <w:t xml:space="preserve"> </w:t>
+            </w:r>
+            <w:r>
+              <w:t xml:space="preserve">— live</w:t>
+            </w:r>
+            <w:r>
+              <w:t xml:space="preserve"> </w:t>
+            </w:r>
+            <w:r>
+              <w:rPr>
+                <w:rStyle w:val="VerbatimChar"/>
+              </w:rPr>
+              <w:t xml:space="preserve">novita/Sao10K/L3-8B-Stheno-v3.2</w:t>
+            </w:r>
+            <w:r>
+              <w:t xml:space="preserve"> </w:t>
+            </w:r>
+            <w:r>
+              <w:t xml:space="preserve">EN→ES translation, ffprobe-verified). The MCP-stdio row stays video PENDING (the recording shows best-model+invoke, not the MCP surface — no bluff). Other Rev-4 additions (pkg/bridge, internal/verifier gate, pkg/api/dashboard.go) are PASS at unit/integration/live-run level with video PENDING / SKIP / N/A — none claim a video that doesn’t exist</w:t>
             </w:r>
           </w:p>
         </w:tc>
@@ -21524,13 +21658,13 @@
               <w:rPr>
                 <w:rStyle w:val="VerbatimChar"/>
               </w:rPr>
-              <w:t xml:space="preserve">groq/allam-2-7b</w:t>
+              <w:t xml:space="preserve">novita/Sao10K/L3-8B-Stheno-v3.2</w:t>
             </w:r>
             <w:r>
               <w:t xml:space="preserve"> </w:t>
             </w:r>
             <w:r>
-              <w:t xml:space="preserve">score 0.906;</w:t>
+              <w:t xml:space="preserve">score 0.919;</w:t>
             </w:r>
             <w:r>
               <w:t xml:space="preserve"> </w:t>
@@ -21542,9 +21676,27 @@
               <w:t xml:space="preserve">Invoke</w:t>
             </w:r>
             <w:r>
+              <w:t xml:space="preserve"> </w:t>
+            </w:r>
+            <w:r>
+              <w:t xml:space="preserve">EN→ES</w:t>
+            </w:r>
+            <w:r>
+              <w:t xml:space="preserve"> </w:t>
+            </w:r>
+            <w:r>
+              <w:t xml:space="preserve">“Good morning, friend.”</w:t>
+            </w:r>
+            <w:r>
+              <w:t xml:space="preserve"> </w:t>
+            </w:r>
+            <w:r>
               <w:t xml:space="preserve">→</w:t>
             </w:r>
             <w:r>
+              <w:t xml:space="preserve"> </w:t>
+            </w:r>
+            <w:r>
               <w:t xml:space="preserve">“Buenos días, amigo.”</w:t>
             </w:r>
             <w:r>
@@ -21559,7 +21711,17 @@
               <w:pStyle w:val="Compact"/>
             </w:pPr>
             <w:r>
-              <w:t xml:space="preserve">PENDING (CLI/MCP terminal surface — asciinema→agg→ffmpeg→ffprobe</w:t>
+              <w:rPr>
+                <w:b/>
+                <w:bCs/>
+              </w:rPr>
+              <w:t xml:space="preserve">CONFIRMED</w:t>
+            </w:r>
+            <w:r>
+              <w:t xml:space="preserve"> </w:t>
+            </w:r>
+            <w:r>
+              <w:t xml:space="preserve">— real-use video</w:t>
             </w:r>
             <w:r>
               <w:t xml:space="preserve"> </w:t>
@@ -21568,13 +21730,40 @@
               <w:rPr>
                 <w:rStyle w:val="VerbatimChar"/>
               </w:rPr>
-              <w:t xml:space="preserve">helixtranslate-bridge-*</w:t>
+              <w:t xml:space="preserve">/Volumes/T7/Downloads/Recordings/helixtranslate-bridge-bestmodel-translate-20260615.mp4</w:t>
             </w:r>
             <w:r>
               <w:t xml:space="preserve"> </w:t>
             </w:r>
             <w:r>
-              <w:t xml:space="preserve">recording owed; not yet recorded)</w:t>
+              <w:t xml:space="preserve">(asciinema→agg→ffmpeg pipeline; ffprobe 8.0s / 80 frames / 790×560; ≥6 frames readable — selected model</w:t>
+            </w:r>
+            <w:r>
+              <w:t xml:space="preserve"> </w:t>
+            </w:r>
+            <w:r>
+              <w:rPr>
+                <w:rStyle w:val="VerbatimChar"/>
+              </w:rPr>
+              <w:t xml:space="preserve">novita/Sao10K/L3-8B-Stheno-v3.2</w:t>
+            </w:r>
+            <w:r>
+              <w:t xml:space="preserve"> </w:t>
+            </w:r>
+            <w:r>
+              <w:t xml:space="preserve">(score 0.919, base_url https://api.novita.ai/v3/openai) + live OUTPUT</w:t>
+            </w:r>
+            <w:r>
+              <w:t xml:space="preserve"> </w:t>
+            </w:r>
+            <w:r>
+              <w:t xml:space="preserve">“Buenos días, amigo.”</w:t>
+            </w:r>
+            <w:r>
+              <w:t xml:space="preserve"> </w:t>
+            </w:r>
+            <w:r>
+              <w:t xml:space="preserve">visible, not frozen/spinner per §11.4.107)</w:t>
             </w:r>
           </w:p>
         </w:tc>

</xml_diff>

<commit_message>
docs(features §11.4.153): bridge MCP-stdio real-use video confirmed — live verified-model MCP round-trip, ffprobe-verified
</commit_message>
<xml_diff>
--- a/docs/features/Status.docx
+++ b/docs/features/Status.docx
@@ -34,7 +34,7 @@
         <w:t xml:space="preserve"> </w:t>
       </w:r>
       <w:r>
-        <w:t xml:space="preserve">5</w:t>
+        <w:t xml:space="preserve">6</w:t>
       </w:r>
       <w:r>
         <w:t xml:space="preserve"> </w:t>
@@ -50,7 +50,7 @@
         <w:t xml:space="preserve"> </w:t>
       </w:r>
       <w:r>
-        <w:t xml:space="preserve">2026-06-15T22:30:00Z</w:t>
+        <w:t xml:space="preserve">2026-06-15T23:05:00Z</w:t>
       </w:r>
       <w:r>
         <w:t xml:space="preserve"> </w:t>
@@ -192,7 +192,7 @@
           <w:b/>
           <w:bCs/>
         </w:rPr>
-        <w:t xml:space="preserve">22 feature rows are video-confirmed</w:t>
+        <w:t xml:space="preserve">23 feature rows are video-confirmed</w:t>
       </w:r>
       <w:r>
         <w:t xml:space="preserve"> </w:t>
@@ -344,7 +344,95 @@
         <w:t xml:space="preserve">“Buenos días, amigo.”</w:t>
       </w:r>
       <w:r>
-        <w:t xml:space="preserve">; ffprobe 8.0s/80 frames, ≥6 frames content-verified).</w:t>
+        <w:t xml:space="preserve">; ffprobe 8.0s/80 frames, ≥6 frames content-verified)</w:t>
+      </w:r>
+      <w:r>
+        <w:t xml:space="preserve"> </w:t>
+      </w:r>
+      <w:r>
+        <w:rPr>
+          <w:b/>
+          <w:bCs/>
+        </w:rPr>
+        <w:t xml:space="preserve">and the LLMsVerifier→agent bridge MCP-stdio surface</w:t>
+      </w:r>
+      <w:r>
+        <w:t xml:space="preserve"> </w:t>
+      </w:r>
+      <w:r>
+        <w:t xml:space="preserve">(</w:t>
+      </w:r>
+      <w:r>
+        <w:rPr>
+          <w:rStyle w:val="VerbatimChar"/>
+        </w:rPr>
+        <w:t xml:space="preserve">cmd/model-bridge mcp</w:t>
+      </w:r>
+      <w:r>
+        <w:t xml:space="preserve"> </w:t>
+      </w:r>
+      <w:r>
+        <w:t xml:space="preserve">—</w:t>
+      </w:r>
+      <w:r>
+        <w:t xml:space="preserve"> </w:t>
+      </w:r>
+      <w:r>
+        <w:rPr>
+          <w:rStyle w:val="VerbatimChar"/>
+        </w:rPr>
+        <w:t xml:space="preserve">helixtranslate-bridge-mcp-stdio-20260615.mp4</w:t>
+      </w:r>
+      <w:r>
+        <w:t xml:space="preserve">: a real JSON-RPC MCP session over stdio — initialize→tools/list→</w:t>
+      </w:r>
+      <w:r>
+        <w:rPr>
+          <w:rStyle w:val="VerbatimChar"/>
+        </w:rPr>
+        <w:t xml:space="preserve">bridge_best_model</w:t>
+      </w:r>
+      <w:r>
+        <w:t xml:space="preserve">→</w:t>
+      </w:r>
+      <w:r>
+        <w:rPr>
+          <w:rStyle w:val="VerbatimChar"/>
+        </w:rPr>
+        <w:t xml:space="preserve">bridge_invoke</w:t>
+      </w:r>
+      <w:r>
+        <w:t xml:space="preserve"> </w:t>
+      </w:r>
+      <w:r>
+        <w:t xml:space="preserve">— where tool</w:t>
+      </w:r>
+      <w:r>
+        <w:t xml:space="preserve"> </w:t>
+      </w:r>
+      <w:r>
+        <w:rPr>
+          <w:rStyle w:val="VerbatimChar"/>
+        </w:rPr>
+        <w:t xml:space="preserve">bridge_invoke</w:t>
+      </w:r>
+      <w:r>
+        <w:t xml:space="preserve"> </w:t>
+      </w:r>
+      <w:r>
+        <w:t xml:space="preserve">returned a live verified-model translation</w:t>
+      </w:r>
+      <w:r>
+        <w:t xml:space="preserve"> </w:t>
+      </w:r>
+      <w:r>
+        <w:t xml:space="preserve">“Le pont relie deux rives.”</w:t>
+      </w:r>
+      <w:r>
+        <w:t xml:space="preserve"> </w:t>
+      </w:r>
+      <w:r>
+        <w:t xml:space="preserve">(isError:None); ffprobe 11.88s/10 frames, ≥6 frames content-verified).</w:t>
       </w:r>
       <w:r>
         <w:t xml:space="preserve"> </w:t>
@@ -1172,13 +1260,13 @@
                 <w:b/>
                 <w:bCs/>
               </w:rPr>
-              <w:t xml:space="preserve">22</w:t>
+              <w:t xml:space="preserve">23</w:t>
             </w:r>
             <w:r>
               <w:t xml:space="preserve"> </w:t>
             </w:r>
             <w:r>
-              <w:t xml:space="preserve">(real, content-verified recordings this session — see Anti-bluff note) — ≈ 4.6% of 478 enumerated rows (≈ 5.3% of the 417 headline). Plus</w:t>
+              <w:t xml:space="preserve">(real, content-verified recordings this session — see Anti-bluff note) — ≈ 4.8% of 478 enumerated rows (≈ 5.5% of the 417 headline). Plus</w:t>
             </w:r>
             <w:r>
               <w:t xml:space="preserve"> </w:t>
@@ -1224,7 +1312,7 @@
               <w:t xml:space="preserve"> </w:t>
             </w:r>
             <w:r>
-              <w:t xml:space="preserve">tests green + weasyprint present; both video PENDING). Rev-5 (this run) flips the</w:t>
+              <w:t xml:space="preserve">tests green + weasyprint present; both video PENDING). Rev-6 (this run) flips the</w:t>
             </w:r>
             <w:r>
               <w:t xml:space="preserve"> </w:t>
@@ -1234,13 +1322,70 @@
                 <w:b/>
                 <w:bCs/>
               </w:rPr>
-              <w:t xml:space="preserve">LLMsVerifier→agent bridge CLI</w:t>
+              <w:t xml:space="preserve">LLMsVerifier→agent bridge MCP-stdio server</w:t>
             </w:r>
             <w:r>
               <w:t xml:space="preserve"> </w:t>
             </w:r>
             <w:r>
               <w:t xml:space="preserve">row video PENDING→CONFIRMED (</w:t>
+            </w:r>
+            <w:r>
+              <w:rPr>
+                <w:rStyle w:val="VerbatimChar"/>
+              </w:rPr>
+              <w:t xml:space="preserve">helixtranslate-bridge-mcp-stdio-20260615.mp4</w:t>
+            </w:r>
+            <w:r>
+              <w:t xml:space="preserve"> </w:t>
+            </w:r>
+            <w:r>
+              <w:t xml:space="preserve">— a real JSON-RPC MCP-stdio session: initialize→tools/list→</w:t>
+            </w:r>
+            <w:r>
+              <w:rPr>
+                <w:rStyle w:val="VerbatimChar"/>
+              </w:rPr>
+              <w:t xml:space="preserve">bridge_best_model</w:t>
+            </w:r>
+            <w:r>
+              <w:t xml:space="preserve">→</w:t>
+            </w:r>
+            <w:r>
+              <w:rPr>
+                <w:rStyle w:val="VerbatimChar"/>
+              </w:rPr>
+              <w:t xml:space="preserve">bridge_invoke</w:t>
+            </w:r>
+            <w:r>
+              <w:t xml:space="preserve">, tool</w:t>
+            </w:r>
+            <w:r>
+              <w:t xml:space="preserve"> </w:t>
+            </w:r>
+            <w:r>
+              <w:rPr>
+                <w:rStyle w:val="VerbatimChar"/>
+              </w:rPr>
+              <w:t xml:space="preserve">bridge_invoke</w:t>
+            </w:r>
+            <w:r>
+              <w:t xml:space="preserve"> </w:t>
+            </w:r>
+            <w:r>
+              <w:t xml:space="preserve">returned live verified-model translation</w:t>
+            </w:r>
+            <w:r>
+              <w:t xml:space="preserve"> </w:t>
+            </w:r>
+            <w:r>
+              <w:t xml:space="preserve">“Le pont relie deux rives.”</w:t>
+            </w:r>
+            <w:r>
+              <w:t xml:space="preserve"> </w:t>
+            </w:r>
+            <w:r>
+              <w:t xml:space="preserve">isError:None, ffprobe 11.88s/10 frames, ≥6 frames content-verified). Rev-5 had flipped the bridge CLI row (</w:t>
             </w:r>
             <w:r>
               <w:rPr>
@@ -1249,25 +1394,7 @@
               <w:t xml:space="preserve">helixtranslate-bridge-bestmodel-translate-20260615.mp4</w:t>
             </w:r>
             <w:r>
-              <w:t xml:space="preserve"> </w:t>
-            </w:r>
-            <w:r>
-              <w:t xml:space="preserve">— live</w:t>
-            </w:r>
-            <w:r>
-              <w:t xml:space="preserve"> </w:t>
-            </w:r>
-            <w:r>
-              <w:rPr>
-                <w:rStyle w:val="VerbatimChar"/>
-              </w:rPr>
-              <w:t xml:space="preserve">novita/Sao10K/L3-8B-Stheno-v3.2</w:t>
-            </w:r>
-            <w:r>
-              <w:t xml:space="preserve"> </w:t>
-            </w:r>
-            <w:r>
-              <w:t xml:space="preserve">EN→ES translation, ffprobe-verified). The MCP-stdio row stays video PENDING (the recording shows best-model+invoke, not the MCP surface — no bluff). Other Rev-4 additions (pkg/bridge, internal/verifier gate, pkg/api/dashboard.go) are PASS at unit/integration/live-run level with video PENDING / SKIP / N/A — none claim a video that doesn’t exist</w:t>
+              <w:t xml:space="preserve">). Other Rev-4 additions (pkg/bridge, internal/verifier gate, pkg/api/dashboard.go) are PASS at unit/integration/live-run level with video PENDING / SKIP / N/A — none claim a video that doesn’t exist</w:t>
             </w:r>
           </w:p>
         </w:tc>
@@ -21914,36 +22041,163 @@
                 <w:b/>
                 <w:bCs/>
               </w:rPr>
-              <w:t xml:space="preserve">PASS — MCP live nonce-echo captured</w:t>
+              <w:t xml:space="preserve">PASS — real MCP JSON-RPC round-trip captured</w:t>
             </w:r>
             <w:r>
               <w:t xml:space="preserve"> </w:t>
             </w:r>
             <w:r>
-              <w:t xml:space="preserve">(</w:t>
+              <w:t xml:space="preserve">(initialize→tools/list→</w:t>
             </w:r>
             <w:r>
               <w:rPr>
                 <w:rStyle w:val="VerbatimChar"/>
               </w:rPr>
-              <w:t xml:space="preserve">HELIX-PROOF-9b21x</w:t>
+              <w:t xml:space="preserve">bridge_best_model</w:t>
+            </w:r>
+            <w:r>
+              <w:t xml:space="preserve">→</w:t>
+            </w:r>
+            <w:r>
+              <w:rPr>
+                <w:rStyle w:val="VerbatimChar"/>
+              </w:rPr>
+              <w:t xml:space="preserve">bridge_invoke</w:t>
             </w:r>
             <w:r>
               <w:t xml:space="preserve"> </w:t>
             </w:r>
             <w:r>
-              <w:t xml:space="preserve">round-tripped through the MCP server)</w:t>
-            </w:r>
-          </w:p>
-        </w:tc>
-        <w:tc>
-          <w:tcPr/>
-          <w:p>
-            <w:pPr>
-              <w:pStyle w:val="Compact"/>
-            </w:pPr>
-            <w:r>
-              <w:t xml:space="preserve">PENDING (terminal surface; recording owed)</w:t>
+              <w:t xml:space="preserve">over stdio; tool</w:t>
+            </w:r>
+            <w:r>
+              <w:t xml:space="preserve"> </w:t>
+            </w:r>
+            <w:r>
+              <w:rPr>
+                <w:rStyle w:val="VerbatimChar"/>
+              </w:rPr>
+              <w:t xml:space="preserve">bridge_invoke</w:t>
+            </w:r>
+            <w:r>
+              <w:t xml:space="preserve"> </w:t>
+            </w:r>
+            <w:r>
+              <w:t xml:space="preserve">returned live verified-model translation</w:t>
+            </w:r>
+            <w:r>
+              <w:t xml:space="preserve"> </w:t>
+            </w:r>
+            <w:r>
+              <w:t xml:space="preserve">“Le pont relie deux rives.”</w:t>
+            </w:r>
+            <w:r>
+              <w:t xml:space="preserve">, isError:None)</w:t>
+            </w:r>
+          </w:p>
+        </w:tc>
+        <w:tc>
+          <w:tcPr/>
+          <w:p>
+            <w:pPr>
+              <w:pStyle w:val="Compact"/>
+            </w:pPr>
+            <w:r>
+              <w:rPr>
+                <w:b/>
+                <w:bCs/>
+              </w:rPr>
+              <w:t xml:space="preserve">CONFIRMED</w:t>
+            </w:r>
+            <w:r>
+              <w:t xml:space="preserve"> </w:t>
+            </w:r>
+            <w:r>
+              <w:t xml:space="preserve">— real-use video</w:t>
+            </w:r>
+            <w:r>
+              <w:t xml:space="preserve"> </w:t>
+            </w:r>
+            <w:r>
+              <w:rPr>
+                <w:rStyle w:val="VerbatimChar"/>
+              </w:rPr>
+              <w:t xml:space="preserve">/Volumes/T7/Downloads/Recordings/helixtranslate-bridge-mcp-stdio-20260615.mp4</w:t>
+            </w:r>
+            <w:r>
+              <w:t xml:space="preserve"> </w:t>
+            </w:r>
+            <w:r>
+              <w:t xml:space="preserve">(asciinema→agg→ffmpeg; ffprobe 11.88s / 10 frames / 790×560; ≥6 frames readable showing the progressive REAL MCP-stdio session —</w:t>
+            </w:r>
+            <w:r>
+              <w:t xml:space="preserve"> </w:t>
+            </w:r>
+            <w:r>
+              <w:rPr>
+                <w:rStyle w:val="VerbatimChar"/>
+              </w:rPr>
+              <w:t xml:space="preserve">tools/list</w:t>
+            </w:r>
+            <w:r>
+              <w:t xml:space="preserve">=[bridge_invoke, bridge_best_model, bridge_list],</w:t>
+            </w:r>
+            <w:r>
+              <w:t xml:space="preserve"> </w:t>
+            </w:r>
+            <w:r>
+              <w:rPr>
+                <w:rStyle w:val="VerbatimChar"/>
+              </w:rPr>
+              <w:t xml:space="preserve">bridge_best_model</w:t>
+            </w:r>
+            <w:r>
+              <w:t xml:space="preserve"> </w:t>
+            </w:r>
+            <w:r>
+              <w:t xml:space="preserve">strongest</w:t>
+            </w:r>
+            <w:r>
+              <w:t xml:space="preserve"> </w:t>
+            </w:r>
+            <w:r>
+              <w:rPr>
+                <w:rStyle w:val="VerbatimChar"/>
+              </w:rPr>
+              <w:t xml:space="preserve">novita/Sao10K/L3-8B-Stheno-v3.2</w:t>
+            </w:r>
+            <w:r>
+              <w:t xml:space="preserve"> </w:t>
+            </w:r>
+            <w:r>
+              <w:t xml:space="preserve">score 0.919 + fallback chain, and tool</w:t>
+            </w:r>
+            <w:r>
+              <w:t xml:space="preserve"> </w:t>
+            </w:r>
+            <w:r>
+              <w:rPr>
+                <w:rStyle w:val="VerbatimChar"/>
+              </w:rPr>
+              <w:t xml:space="preserve">bridge_invoke</w:t>
+            </w:r>
+            <w:r>
+              <w:t xml:space="preserve"> </w:t>
+            </w:r>
+            <w:r>
+              <w:t xml:space="preserve">real verified-model OUTPUT</w:t>
+            </w:r>
+            <w:r>
+              <w:t xml:space="preserve"> </w:t>
+            </w:r>
+            <w:r>
+              <w:t xml:space="preserve">“Le pont relie deux rives.”</w:t>
+            </w:r>
+            <w:r>
+              <w:t xml:space="preserve"> </w:t>
+            </w:r>
+            <w:r>
+              <w:t xml:space="preserve">with isError:None — not frozen/spinner per §11.4.107)</w:t>
             </w:r>
           </w:p>
         </w:tc>

</xml_diff>

<commit_message>
docs(features §11.4.153): wave-2 video confirmations — 8 real-use videos (DOCX/PDF/gRPC/4-providers/HTML→MD), validator-verified, default path post-fix 7c2118a
</commit_message>
<xml_diff>
--- a/docs/features/Status.docx
+++ b/docs/features/Status.docx
@@ -34,7 +34,7 @@
         <w:t xml:space="preserve"> </w:t>
       </w:r>
       <w:r>
-        <w:t xml:space="preserve">8</w:t>
+        <w:t xml:space="preserve">9</w:t>
       </w:r>
       <w:r>
         <w:t xml:space="preserve"> </w:t>
@@ -50,7 +50,7 @@
         <w:t xml:space="preserve"> </w:t>
       </w:r>
       <w:r>
-        <w:t xml:space="preserve">2026-06-16T00:00:00Z</w:t>
+        <w:t xml:space="preserve">2026-06-16T12:00:00Z</w:t>
       </w:r>
       <w:r>
         <w:t xml:space="preserve"> </w:t>
@@ -192,13 +192,55 @@
           <w:b/>
           <w:bCs/>
         </w:rPr>
-        <w:t xml:space="preserve">25 feature rows are video-confirmed</w:t>
+        <w:t xml:space="preserve">30 feature rows are video-confirmed</w:t>
       </w:r>
       <w:r>
         <w:t xml:space="preserve"> </w:t>
       </w:r>
       <w:r>
-        <w:t xml:space="preserve">(Wave 1 of 2026-06-16 added 2 — bridge-ensemble best-model selection + bridge provider-diverse catalogue) across unified-translator (DeepSeek translate, EPUB→TXT / HTML→EPUB / FB2→EPUB / FB2→FB2 conversions, Serbian-Cyrillic,</w:t>
+        <w:t xml:space="preserve">(Wave 2 of 2026-06-16 added 5 net-new — DOCX output, PDF output, HTML→Markdown conversion,</w:t>
+      </w:r>
+      <w:r>
+        <w:t xml:space="preserve"> </w:t>
+      </w:r>
+      <w:r>
+        <w:rPr>
+          <w:rStyle w:val="VerbatimChar"/>
+        </w:rPr>
+        <w:t xml:space="preserve">ProviderDiverseTranslators</w:t>
+      </w:r>
+      <w:r>
+        <w:t xml:space="preserve">,</w:t>
+      </w:r>
+      <w:r>
+        <w:t xml:space="preserve"> </w:t>
+      </w:r>
+      <w:r>
+        <w:rPr>
+          <w:rStyle w:val="VerbatimChar"/>
+        </w:rPr>
+        <w:t xml:space="preserve">EnsembleFactory</w:t>
+      </w:r>
+      <w:r>
+        <w:t xml:space="preserve"> </w:t>
+      </w:r>
+      <w:r>
+        <w:t xml:space="preserve">— each backed by a real-use Wave-2</w:t>
+      </w:r>
+      <w:r>
+        <w:t xml:space="preserve"> </w:t>
+      </w:r>
+      <w:r>
+        <w:rPr>
+          <w:rStyle w:val="VerbatimChar"/>
+        </w:rPr>
+        <w:t xml:space="preserve">.mp4</w:t>
+      </w:r>
+      <w:r>
+        <w:t xml:space="preserve"> </w:t>
+      </w:r>
+      <w:r>
+        <w:t xml:space="preserve">independently validator-verified ffprobe+frame; Wave 2 also re-confirmed the already-confirmed gRPC TranslationService row with an additional clip, no double-count; Wave 1 added 2 — bridge-ensemble best-model selection + bridge provider-diverse catalogue) across unified-translator (DeepSeek translate, EPUB→TXT / HTML→EPUB / FB2→EPUB / FB2→FB2 conversions, Serbian-Cyrillic,</w:t>
       </w:r>
       <w:r>
         <w:t xml:space="preserve"> </w:t>
@@ -442,7 +484,7 @@
           <w:b/>
           <w:bCs/>
         </w:rPr>
-        <w:t xml:space="preserve">Real-artifact-confirmed (not video):</w:t>
+        <w:t xml:space="preserve">Now video-confirmed (Wave 2):</w:t>
       </w:r>
       <w:r>
         <w:t xml:space="preserve"> </w:t>
@@ -458,37 +500,7 @@
         <w:t xml:space="preserve"> </w:t>
       </w:r>
       <w:r>
-        <w:t xml:space="preserve">is now Implemented — a real DeepSeek run produced</w:t>
-      </w:r>
-      <w:r>
-        <w:t xml:space="preserve"> </w:t>
-      </w:r>
-      <w:r>
-        <w:rPr>
-          <w:rStyle w:val="VerbatimChar"/>
-        </w:rPr>
-        <w:t xml:space="preserve">garden_es.docx</w:t>
-      </w:r>
-      <w:r>
-        <w:t xml:space="preserve"> </w:t>
-      </w:r>
-      <w:r>
-        <w:t xml:space="preserve">=</w:t>
-      </w:r>
-      <w:r>
-        <w:t xml:space="preserve"> </w:t>
-      </w:r>
-      <w:r>
-        <w:rPr>
-          <w:rStyle w:val="VerbatimChar"/>
-        </w:rPr>
-        <w:t xml:space="preserve">Microsoft Word 2007+</w:t>
-      </w:r>
-      <w:r>
-        <w:t xml:space="preserve"> </w:t>
-      </w:r>
-      <w:r>
-        <w:t xml:space="preserve">(well-formed WordprocessingML, real translation; pure-Go OOXML writer</w:t>
+        <w:t xml:space="preserve">(Implemented; pure-Go OOXML writer</w:t>
       </w:r>
       <w:r>
         <w:t xml:space="preserve"> </w:t>
@@ -500,7 +512,7 @@
         <w:t xml:space="preserve">pkg/ebook/docx_writer.go</w:t>
       </w:r>
       <w:r>
-        <w:t xml:space="preserve">, commit 87cd2be) — confirmed by the produced artifact’s file type, no</w:t>
+        <w:t xml:space="preserve">, commit 87cd2be) — Wave-2 real-use video</w:t>
       </w:r>
       <w:r>
         <w:t xml:space="preserve"> </w:t>
@@ -509,23 +521,28 @@
         <w:rPr>
           <w:rStyle w:val="VerbatimChar"/>
         </w:rPr>
-        <w:t xml:space="preserve">.mp4</w:t>
+        <w:t xml:space="preserve">helix_translate-docx-output-20260616-112943.mp4</w:t>
       </w:r>
       <w:r>
         <w:t xml:space="preserve"> </w:t>
       </w:r>
       <w:r>
-        <w:t xml:space="preserve">exists yet (video PENDING).</w:t>
+        <w:t xml:space="preserve">(unified-translator DOCX output, openai/gpt-4, the produced</w:t>
       </w:r>
       <w:r>
         <w:t xml:space="preserve"> </w:t>
       </w:r>
       <w:r>
         <w:rPr>
-          <w:b/>
-          <w:bCs/>
+          <w:rStyle w:val="VerbatimChar"/>
         </w:rPr>
-        <w:t xml:space="preserve">Real-artifact / unit-confirmed (not video):</w:t>
+        <w:t xml:space="preserve">.docx</w:t>
+      </w:r>
+      <w:r>
+        <w:t xml:space="preserve"> </w:t>
+      </w:r>
+      <w:r>
+        <w:t xml:space="preserve">carries real Spanish text; validator ffprobe+frame-verified).</w:t>
       </w:r>
       <w:r>
         <w:t xml:space="preserve"> </w:t>
@@ -541,7 +558,7 @@
         <w:t xml:space="preserve"> </w:t>
       </w:r>
       <w:r>
-        <w:t xml:space="preserve">is now Implemented (commit fb265e7) —</w:t>
+        <w:t xml:space="preserve">(Implemented, commit fb265e7;</w:t>
       </w:r>
       <w:r>
         <w:t xml:space="preserve"> </w:t>
@@ -556,7 +573,7 @@
         <w:t xml:space="preserve"> </w:t>
       </w:r>
       <w:r>
-        <w:t xml:space="preserve">renders the Book→HTML5→</w:t>
+        <w:t xml:space="preserve">Book→HTML5→</w:t>
       </w:r>
       <w:r>
         <w:rPr>
@@ -565,7 +582,10 @@
         <w:t xml:space="preserve">weasyprint</w:t>
       </w:r>
       <w:r>
-        <w:t xml:space="preserve">→valid Cyrillic-faithful PDF, wired into unified-translator (</w:t>
+        <w:t xml:space="preserve">→Cyrillic-faithful PDF, wired into unified-translator</w:t>
+      </w:r>
+      <w:r>
+        <w:t xml:space="preserve"> </w:t>
       </w:r>
       <w:r>
         <w:rPr>
@@ -577,7 +597,7 @@
         <w:t xml:space="preserve"> </w:t>
       </w:r>
       <w:r>
-        <w:t xml:space="preserve">output; main.go:1160);</w:t>
+        <w:t xml:space="preserve">output, main.go:1160) — Wave-2 real-use video</w:t>
       </w:r>
       <w:r>
         <w:t xml:space="preserve"> </w:t>
@@ -586,13 +606,29 @@
         <w:rPr>
           <w:rStyle w:val="VerbatimChar"/>
         </w:rPr>
-        <w:t xml:space="preserve">pkg/ebook</w:t>
+        <w:t xml:space="preserve">helix_translate-pdf-output-20260616-113057.mp4</w:t>
       </w:r>
       <w:r>
         <w:t xml:space="preserve"> </w:t>
       </w:r>
       <w:r>
-        <w:t xml:space="preserve">PDF tests green this session (no</w:t>
+        <w:t xml:space="preserve">(valid PDF with real Spanish; validator ffprobe+frame-verified).</w:t>
+      </w:r>
+      <w:r>
+        <w:t xml:space="preserve"> </w:t>
+      </w:r>
+      <w:r>
+        <w:rPr>
+          <w:b/>
+          <w:bCs/>
+        </w:rPr>
+        <w:t xml:space="preserve">Wave-1 bridge-translator-path blocker RESOLVED (caveat 8):</w:t>
+      </w:r>
+      <w:r>
+        <w:t xml:space="preserve"> </w:t>
+      </w:r>
+      <w:r>
+        <w:t xml:space="preserve">the</w:t>
       </w:r>
       <w:r>
         <w:t xml:space="preserve"> </w:t>
@@ -601,13 +637,10 @@
         <w:rPr>
           <w:rStyle w:val="VerbatimChar"/>
         </w:rPr>
-        <w:t xml:space="preserve">.mp4</w:t>
-      </w:r>
-      <w:r>
-        <w:t xml:space="preserve"> </w:t>
-      </w:r>
-      <w:r>
-        <w:t xml:space="preserve">yet, video PENDING).</w:t>
+        <w:t xml:space="preserve">ValidModels</w:t>
+      </w:r>
+      <w:r>
+        <w:t xml:space="preserve">-whitelist runtime failure that blocked the DOCX/PDF/gRPC/per-provider videos in Wave 1 is fixed — the verified-bridge translator path now produces real per-provider translations (Wave-2 provider clips: novita/mistral/groq/siliconflow).</w:t>
       </w:r>
       <w:r>
         <w:t xml:space="preserve"> </w:t>
@@ -999,13 +1032,28 @@
                 <w:b/>
                 <w:bCs/>
               </w:rPr>
-              <w:t xml:space="preserve">493</w:t>
+              <w:t xml:space="preserve">494</w:t>
             </w:r>
             <w:r>
               <w:t xml:space="preserve"> </w:t>
             </w:r>
             <w:r>
-              <w:t xml:space="preserve">(Rev 8 — RE-DERIVED MECHANICALLY from the live tables, §11.4.6: count of 9-column feature data rows across the 60 per-category tables;</w:t>
+              <w:t xml:space="preserve">(Rev 9 = 493 Rev 8 + 1 new unified-translator</w:t>
+            </w:r>
+            <w:r>
+              <w:t xml:space="preserve"> </w:t>
+            </w:r>
+            <w:r>
+              <w:rPr>
+                <w:rStyle w:val="VerbatimChar"/>
+              </w:rPr>
+              <w:t xml:space="preserve">HTML→Markdown conversion</w:t>
+            </w:r>
+            <w:r>
+              <w:t xml:space="preserve"> </w:t>
+            </w:r>
+            <w:r>
+              <w:t xml:space="preserve">row added this wave for the Wave-2 html-to-md video; §11.4.6 — re-derive with</w:t>
             </w:r>
             <w:r>
               <w:t xml:space="preserve"> </w:t>
@@ -1020,19 +1068,34 @@
               <w:t xml:space="preserve"> </w:t>
             </w:r>
             <w:r>
-              <w:t xml:space="preserve">counting rows with exactly 9 columns, excluding the 60 header rows + separators. The earlier</w:t>
+              <w:t xml:space="preserve">over</w:t>
             </w:r>
             <w:r>
               <w:t xml:space="preserve"> </w:t>
             </w:r>
             <w:r>
+              <w:rPr>
+                <w:rStyle w:val="VerbatimChar"/>
+              </w:rPr>
+              <w:t xml:space="preserve">^\|</w:t>
+            </w:r>
+            <w:r>
+              <w:t xml:space="preserve"> </w:t>
+            </w:r>
+            <w:r>
+              <w:t xml:space="preserve">9-column rows. The earlier</w:t>
+            </w:r>
+            <w:r>
+              <w:t xml:space="preserve"> </w:t>
+            </w:r>
+            <w:r>
               <w:t xml:space="preserve">“478”</w:t>
             </w:r>
             <w:r>
               <w:t xml:space="preserve"> </w:t>
             </w:r>
             <w:r>
-              <w:t xml:space="preserve">was NOT re-derivable from the live table — it was a hand-tracked running tally that had drifted (the actual live count was 486 before Rev 8 added the 7 missing</w:t>
+              <w:t xml:space="preserve">was NOT re-derivable from the live table — it was a hand-tracked running tally that had drifted; Rev 8 added the 7 missing</w:t>
             </w:r>
             <w:r>
               <w:t xml:space="preserve"> </w:t>
@@ -1131,37 +1194,7 @@
               <w:t xml:space="preserve">BestClient</w:t>
             </w:r>
             <w:r>
-              <w:t xml:space="preserve">). 493 is the FACT; re-derive with</w:t>
-            </w:r>
-            <w:r>
-              <w:t xml:space="preserve"> </w:t>
-            </w:r>
-            <w:r>
-              <w:rPr>
-                <w:rStyle w:val="VerbatimChar"/>
-              </w:rPr>
-              <w:t xml:space="preserve">awk</w:t>
-            </w:r>
-            <w:r>
-              <w:t xml:space="preserve"> </w:t>
-            </w:r>
-            <w:r>
-              <w:t xml:space="preserve">over</w:t>
-            </w:r>
-            <w:r>
-              <w:t xml:space="preserve"> </w:t>
-            </w:r>
-            <w:r>
-              <w:rPr>
-                <w:rStyle w:val="VerbatimChar"/>
-              </w:rPr>
-              <w:t xml:space="preserve">^\|</w:t>
-            </w:r>
-            <w:r>
-              <w:t xml:space="preserve"> </w:t>
-            </w:r>
-            <w:r>
-              <w:t xml:space="preserve">9-column rows)</w:t>
+              <w:t xml:space="preserve">)</w:t>
             </w:r>
           </w:p>
         </w:tc>
@@ -1185,7 +1218,7 @@
               <w:pStyle w:val="Compact"/>
             </w:pPr>
             <w:r>
-              <w:t xml:space="preserve">442 (Rev 8: 435 Rev 7 + 7 new pkg/bridge ensemble-seam rows; was 471 Rev 6, −36 flipped to Obsolete Rev 7 — local-runtime + SSH-local features removed in bridge phase-2 R-2..R-4)</w:t>
+              <w:t xml:space="preserve">443 (Rev 9: 442 Rev 8 + 1 new unified-translator HTML→Markdown conversion row; Rev 8 was 435 Rev 7 + 7 new pkg/bridge ensemble-seam rows; was 471 Rev 6, −36 flipped to Obsolete Rev 7 — local-runtime + SSH-local features removed in bridge phase-2 R-2..R-4)</w:t>
             </w:r>
           </w:p>
         </w:tc>
@@ -1593,13 +1626,13 @@
                 <w:b/>
                 <w:bCs/>
               </w:rPr>
-              <w:t xml:space="preserve">25</w:t>
+              <w:t xml:space="preserve">30</w:t>
             </w:r>
             <w:r>
               <w:t xml:space="preserve"> </w:t>
             </w:r>
             <w:r>
-              <w:t xml:space="preserve">(real, content-verified recordings — see Anti-bluff note; Wave 1 added 2: bridge-ensemble best-model selection + bridge provider-diverse catalogue, each ffprobe+content-verified §11.4.107) — ≈ 5.1% of 493 enumerated rows (≈ 6.0% of the 417 headline). Plus</w:t>
+              <w:t xml:space="preserve">(real, content-verified recordings — see Anti-bluff note; Rev-9 / Wave 2 of 2026-06-16 added</w:t>
             </w:r>
             <w:r>
               <w:t xml:space="preserve"> </w:t>
@@ -1609,13 +1642,13 @@
                 <w:b/>
                 <w:bCs/>
               </w:rPr>
-              <w:t xml:space="preserve">2 real-artifact/unit-confirmed</w:t>
+              <w:t xml:space="preserve">5 net-new</w:t>
             </w:r>
             <w:r>
               <w:t xml:space="preserve"> </w:t>
             </w:r>
             <w:r>
-              <w:t xml:space="preserve">(DOCX output — produced</w:t>
+              <w:t xml:space="preserve">video confirmations, each backed by a real-use Wave-2</w:t>
             </w:r>
             <w:r>
               <w:t xml:space="preserve"> </w:t>
@@ -1624,28 +1657,13 @@
               <w:rPr>
                 <w:rStyle w:val="VerbatimChar"/>
               </w:rPr>
-              <w:t xml:space="preserve">.docx</w:t>
+              <w:t xml:space="preserve">.mp4</w:t>
             </w:r>
             <w:r>
               <w:t xml:space="preserve"> </w:t>
             </w:r>
             <w:r>
-              <w:t xml:space="preserve">= Microsoft Word 2007+; PDF output —</w:t>
-            </w:r>
-            <w:r>
-              <w:t xml:space="preserve"> </w:t>
-            </w:r>
-            <w:r>
-              <w:rPr>
-                <w:rStyle w:val="VerbatimChar"/>
-              </w:rPr>
-              <w:t xml:space="preserve">pkg/ebook</w:t>
-            </w:r>
-            <w:r>
-              <w:t xml:space="preserve"> </w:t>
-            </w:r>
-            <w:r>
-              <w:t xml:space="preserve">tests green + weasyprint present; both video PENDING). Rev-6 (this run) flips the</w:t>
+              <w:t xml:space="preserve">independently validator-verified ffprobe+frame §11.4.107:</w:t>
             </w:r>
             <w:r>
               <w:t xml:space="preserve"> </w:t>
@@ -1655,43 +1673,106 @@
                 <w:b/>
                 <w:bCs/>
               </w:rPr>
-              <w:t xml:space="preserve">LLMsVerifier→agent bridge MCP-stdio server</w:t>
+              <w:t xml:space="preserve">DOCX output</w:t>
             </w:r>
             <w:r>
               <w:t xml:space="preserve"> </w:t>
             </w:r>
             <w:r>
-              <w:t xml:space="preserve">row video PENDING→CONFIRMED (</w:t>
+              <w:t xml:space="preserve">(</w:t>
             </w:r>
             <w:r>
               <w:rPr>
                 <w:rStyle w:val="VerbatimChar"/>
               </w:rPr>
-              <w:t xml:space="preserve">helixtranslate-bridge-mcp-stdio-20260615.mp4</w:t>
+              <w:t xml:space="preserve">helix_translate-docx-output-20260616-112943.mp4</w:t>
+            </w:r>
+            <w:r>
+              <w:t xml:space="preserve">),</w:t>
             </w:r>
             <w:r>
               <w:t xml:space="preserve"> </w:t>
             </w:r>
             <w:r>
-              <w:t xml:space="preserve">— a real JSON-RPC MCP-stdio session: initialize→tools/list→</w:t>
+              <w:rPr>
+                <w:b/>
+                <w:bCs/>
+              </w:rPr>
+              <w:t xml:space="preserve">PDF output</w:t>
+            </w:r>
+            <w:r>
+              <w:t xml:space="preserve"> </w:t>
+            </w:r>
+            <w:r>
+              <w:t xml:space="preserve">(</w:t>
             </w:r>
             <w:r>
               <w:rPr>
                 <w:rStyle w:val="VerbatimChar"/>
               </w:rPr>
-              <w:t xml:space="preserve">bridge_best_model</w:t>
-            </w:r>
-            <w:r>
-              <w:t xml:space="preserve">→</w:t>
+              <w:t xml:space="preserve">helix_translate-pdf-output-20260616-113057.mp4</w:t>
+            </w:r>
+            <w:r>
+              <w:t xml:space="preserve">),</w:t>
+            </w:r>
+            <w:r>
+              <w:t xml:space="preserve"> </w:t>
+            </w:r>
+            <w:r>
+              <w:rPr>
+                <w:b/>
+                <w:bCs/>
+              </w:rPr>
+              <w:t xml:space="preserve">HTML→Markdown conversion</w:t>
+            </w:r>
+            <w:r>
+              <w:t xml:space="preserve"> </w:t>
+            </w:r>
+            <w:r>
+              <w:t xml:space="preserve">(</w:t>
             </w:r>
             <w:r>
               <w:rPr>
                 <w:rStyle w:val="VerbatimChar"/>
               </w:rPr>
-              <w:t xml:space="preserve">bridge_invoke</w:t>
-            </w:r>
-            <w:r>
-              <w:t xml:space="preserve">, tool</w:t>
+              <w:t xml:space="preserve">helix_translate-html-to-md-20260616-114228.mp4</w:t>
+            </w:r>
+            <w:r>
+              <w:t xml:space="preserve">),</w:t>
+            </w:r>
+            <w:r>
+              <w:t xml:space="preserve"> </w:t>
+            </w:r>
+            <w:r>
+              <w:rPr>
+                <w:rStyle w:val="VerbatimChar"/>
+                <w:b/>
+                <w:bCs/>
+              </w:rPr>
+              <w:t xml:space="preserve">ProviderDiverseTranslators</w:t>
+            </w:r>
+            <w:r>
+              <w:t xml:space="preserve"> </w:t>
+            </w:r>
+            <w:r>
+              <w:t xml:space="preserve">+</w:t>
+            </w:r>
+            <w:r>
+              <w:t xml:space="preserve"> </w:t>
+            </w:r>
+            <w:r>
+              <w:rPr>
+                <w:rStyle w:val="VerbatimChar"/>
+                <w:b/>
+                <w:bCs/>
+              </w:rPr>
+              <w:t xml:space="preserve">EnsembleFactory</w:t>
+            </w:r>
+            <w:r>
+              <w:t xml:space="preserve"> </w:t>
+            </w:r>
+            <w:r>
+              <w:t xml:space="preserve">(the 4 per-provider clips novita/mistral/groq/siliconflow —</w:t>
             </w:r>
             <w:r>
               <w:t xml:space="preserve"> </w:t>
@@ -1700,34 +1781,85 @@
               <w:rPr>
                 <w:rStyle w:val="VerbatimChar"/>
               </w:rPr>
-              <w:t xml:space="preserve">bridge_invoke</w:t>
+              <w:t xml:space="preserve">helix_translate-provider-{novita,mistral,groq,siliconflow}-translate-20260616-114*.mp4</w:t>
+            </w:r>
+            <w:r>
+              <w:t xml:space="preserve">). Wave 2 also re-confirmed the already-confirmed</w:t>
             </w:r>
             <w:r>
               <w:t xml:space="preserve"> </w:t>
             </w:r>
             <w:r>
-              <w:t xml:space="preserve">returned live verified-model translation</w:t>
+              <w:rPr>
+                <w:b/>
+                <w:bCs/>
+              </w:rPr>
+              <w:t xml:space="preserve">gRPC TranslationService</w:t>
             </w:r>
             <w:r>
               <w:t xml:space="preserve"> </w:t>
             </w:r>
             <w:r>
-              <w:t xml:space="preserve">“Le pont relie deux rives.”</w:t>
+              <w:t xml:space="preserve">row with an additional clip</w:t>
             </w:r>
             <w:r>
               <w:t xml:space="preserve"> </w:t>
-            </w:r>
-            <w:r>
-              <w:t xml:space="preserve">isError:None, ffprobe 11.88s/10 frames, ≥6 frames content-verified). Rev-5 had flipped the bridge CLI row (</w:t>
             </w:r>
             <w:r>
               <w:rPr>
                 <w:rStyle w:val="VerbatimChar"/>
               </w:rPr>
-              <w:t xml:space="preserve">helixtranslate-bridge-bestmodel-translate-20260615.mp4</w:t>
-            </w:r>
-            <w:r>
-              <w:t xml:space="preserve">). Other Rev-4 additions (pkg/bridge, internal/verifier gate, pkg/api/dashboard.go) are PASS at unit/integration/live-run level with video PENDING / SKIP / N/A — none claim a video that doesn’t exist</w:t>
+              <w:t xml:space="preserve">helix_translate-grpc-translate-20260616-113415.mp4</w:t>
+            </w:r>
+            <w:r>
+              <w:t xml:space="preserve"> </w:t>
+            </w:r>
+            <w:r>
+              <w:t xml:space="preserve">(NOT double-counted — that row was already video-confirmed).</w:t>
+            </w:r>
+            <w:r>
+              <w:t xml:space="preserve"> </w:t>
+            </w:r>
+            <w:r>
+              <w:rPr>
+                <w:b/>
+                <w:bCs/>
+              </w:rPr>
+              <w:t xml:space="preserve">DOCX output and PDF output are no longer</w:t>
+            </w:r>
+            <w:r>
+              <w:rPr>
+                <w:b/>
+                <w:bCs/>
+              </w:rPr>
+              <w:t xml:space="preserve"> </w:t>
+            </w:r>
+            <w:r>
+              <w:rPr>
+                <w:b/>
+                <w:bCs/>
+              </w:rPr>
+              <w:t xml:space="preserve">“real-artifact-only”</w:t>
+            </w:r>
+            <w:r>
+              <w:rPr>
+                <w:b/>
+                <w:bCs/>
+              </w:rPr>
+              <w:t xml:space="preserve"> </w:t>
+            </w:r>
+            <w:r>
+              <w:rPr>
+                <w:b/>
+                <w:bCs/>
+              </w:rPr>
+              <w:t xml:space="preserve">— they are now video-confirmed.</w:t>
+            </w:r>
+            <w:r>
+              <w:t xml:space="preserve"> </w:t>
+            </w:r>
+            <w:r>
+              <w:t xml:space="preserve">§11.4.108 note: the Wave-1 bridge-translator-path runtime blocker (caveat 8) is RESOLVED, which is what made the DOCX/PDF/gRPC/per-provider Wave-2 recordings genuinely demonstrate working features (recording them in Wave 1 would have been a §11.4.107 bluff; they were honest SKIPs then). Wave 1 added 2: bridge-ensemble best-model selection + bridge provider-diverse catalogue. ≈ 6.1% of 494 enumerated rows (≈ 7.2% of the 417 headline)</w:t>
             </w:r>
           </w:p>
         </w:tc>
@@ -8133,18 +8265,27 @@
               <w:t xml:space="preserve"> </w:t>
             </w:r>
             <w:r>
-              <w:t xml:space="preserve">(StartTranslation → real Spanish DeepSeek output)</w:t>
-            </w:r>
-          </w:p>
-        </w:tc>
-        <w:tc>
-          <w:tcPr/>
-          <w:p>
-            <w:pPr>
-              <w:pStyle w:val="Compact"/>
-            </w:pPr>
-            <w:r>
-              <w:t xml:space="preserve">Confirmed:/Volumes/T7/Downloads/Recordings/helixtranslate-grpc-deepseek-20260615-171206-v2.mp4</w:t>
+              <w:t xml:space="preserve">(StartTranslation → real Spanish DeepSeek output). Wave 2 re-confirms via the verified-bridge path (EN→ES</w:t>
+            </w:r>
+            <w:r>
+              <w:t xml:space="preserve"> </w:t>
+            </w:r>
+            <w:r>
+              <w:t xml:space="preserve">“Hola, mundo. Este es un pequeño test.”</w:t>
+            </w:r>
+            <w:r>
+              <w:t xml:space="preserve">)</w:t>
+            </w:r>
+          </w:p>
+        </w:tc>
+        <w:tc>
+          <w:tcPr/>
+          <w:p>
+            <w:pPr>
+              <w:pStyle w:val="Compact"/>
+            </w:pPr>
+            <w:r>
+              <w:t xml:space="preserve">Confirmed:/Volumes/T7/Downloads/Recordings/helixtranslate-grpc-deepseek-20260615-171206-v2.mp4 (additional Wave-2: /Volumes/T7/Downloads/Recordings/helix_translate-grpc-translate-20260616-113415.mp4)</w:t>
             </w:r>
           </w:p>
         </w:tc>
@@ -14854,6 +14995,126 @@
               <w:pStyle w:val="Compact"/>
             </w:pPr>
             <w:r>
+              <w:t xml:space="preserve">HTML→Markdown conversion</w:t>
+            </w:r>
+          </w:p>
+        </w:tc>
+        <w:tc>
+          <w:tcPr/>
+          <w:p>
+            <w:pPr>
+              <w:pStyle w:val="Compact"/>
+            </w:pPr>
+            <w:r>
+              <w:t xml:space="preserve">CLI</w:t>
+            </w:r>
+          </w:p>
+        </w:tc>
+        <w:tc>
+          <w:tcPr/>
+          <w:p>
+            <w:pPr>
+              <w:pStyle w:val="Compact"/>
+            </w:pPr>
+            <w:r>
+              <w:t xml:space="preserve">Implemented</w:t>
+            </w:r>
+          </w:p>
+        </w:tc>
+        <w:tc>
+          <w:tcPr/>
+          <w:p>
+            <w:pPr>
+              <w:pStyle w:val="Compact"/>
+            </w:pPr>
+            <w:r>
+              <w:t xml:space="preserve">Wired</w:t>
+            </w:r>
+          </w:p>
+        </w:tc>
+        <w:tc>
+          <w:tcPr/>
+          <w:p>
+            <w:pPr>
+              <w:pStyle w:val="Compact"/>
+            </w:pPr>
+            <w:r>
+              <w:t xml:space="preserve">HTML parse → translate (openai/gpt-4 via verified bridge) → Markdown (</w:t>
+            </w:r>
+            <w:r>
+              <w:rPr>
+                <w:rStyle w:val="VerbatimChar"/>
+              </w:rPr>
+              <w:t xml:space="preserve">.md</w:t>
+            </w:r>
+            <w:r>
+              <w:t xml:space="preserve">) writer; real Spanish md output</w:t>
+            </w:r>
+          </w:p>
+        </w:tc>
+        <w:tc>
+          <w:tcPr/>
+          <w:p>
+            <w:pPr>
+              <w:pStyle w:val="Compact"/>
+            </w:pPr>
+            <w:r>
+              <w:t xml:space="preserve">Not-inventoried</w:t>
+            </w:r>
+          </w:p>
+        </w:tc>
+        <w:tc>
+          <w:tcPr/>
+          <w:p>
+            <w:pPr>
+              <w:pStyle w:val="Compact"/>
+            </w:pPr>
+            <w:r>
+              <w:rPr>
+                <w:b/>
+                <w:bCs/>
+              </w:rPr>
+              <w:t xml:space="preserve">PASS — captured</w:t>
+            </w:r>
+            <w:r>
+              <w:t xml:space="preserve"> </w:t>
+            </w:r>
+            <w:r>
+              <w:t xml:space="preserve">(Wave 2; real-use video, validator ffprobe+frame-verified — unified-translator HTML→Markdown, openai/gpt-4, real Spanish markdown produced)</w:t>
+            </w:r>
+          </w:p>
+        </w:tc>
+        <w:tc>
+          <w:tcPr/>
+          <w:p>
+            <w:pPr>
+              <w:pStyle w:val="Compact"/>
+            </w:pPr>
+            <w:r>
+              <w:t xml:space="preserve">Confirmed:/Volumes/T7/Downloads/Recordings/helix_translate-html-to-md-20260616-114228.mp4</w:t>
+            </w:r>
+          </w:p>
+        </w:tc>
+      </w:tr>
+      <w:tr>
+        <w:tc>
+          <w:tcPr/>
+          <w:p>
+            <w:pPr>
+              <w:pStyle w:val="Compact"/>
+            </w:pPr>
+            <w:r>
+              <w:t xml:space="preserve">unified-translator</w:t>
+            </w:r>
+          </w:p>
+        </w:tc>
+        <w:tc>
+          <w:tcPr/>
+          <w:p>
+            <w:pPr>
+              <w:pStyle w:val="Compact"/>
+            </w:pPr>
+            <w:r>
               <w:t xml:space="preserve">FB2→EPUB conversion</w:t>
             </w:r>
           </w:p>
@@ -24502,7 +24763,7 @@
                 <w:b/>
                 <w:bCs/>
               </w:rPr>
-              <w:t xml:space="preserve">PASS — real artifact verified</w:t>
+              <w:t xml:space="preserve">PASS — real artifact verified + Wave-2 video</w:t>
             </w:r>
             <w:r>
               <w:t xml:space="preserve"> </w:t>
@@ -24520,18 +24781,33 @@
               <w:t xml:space="preserve">Microsoft Word 2007+</w:t>
             </w:r>
             <w:r>
-              <w:t xml:space="preserve">, 4 OOXML parts, real translated content + correct XML escaping; commit 87cd2be)</w:t>
-            </w:r>
-          </w:p>
-        </w:tc>
-        <w:tc>
-          <w:tcPr/>
-          <w:p>
-            <w:pPr>
-              <w:pStyle w:val="Compact"/>
-            </w:pPr>
-            <w:r>
-              <w:t xml:space="preserve">real-artifact verified (file=Microsoft Word 2007+); video PENDING</w:t>
+              <w:t xml:space="preserve">, 4 OOXML parts, real translated content + correct XML escaping; commit 87cd2be; Wave-2 real-use video: unified-translator DOCX output, openai/gpt-4, the</w:t>
+            </w:r>
+            <w:r>
+              <w:t xml:space="preserve"> </w:t>
+            </w:r>
+            <w:r>
+              <w:rPr>
+                <w:rStyle w:val="VerbatimChar"/>
+              </w:rPr>
+              <w:t xml:space="preserve">.docx</w:t>
+            </w:r>
+            <w:r>
+              <w:t xml:space="preserve"> </w:t>
+            </w:r>
+            <w:r>
+              <w:t xml:space="preserve">carries real Spanish text — validator ffprobe+frame-verified)</w:t>
+            </w:r>
+          </w:p>
+        </w:tc>
+        <w:tc>
+          <w:tcPr/>
+          <w:p>
+            <w:pPr>
+              <w:pStyle w:val="Compact"/>
+            </w:pPr>
+            <w:r>
+              <w:t xml:space="preserve">Confirmed:/Volumes/T7/Downloads/Recordings/helix_translate-docx-output-20260616-112943.mp4</w:t>
             </w:r>
           </w:p>
         </w:tc>
@@ -24782,33 +25058,18 @@
               <w:t xml:space="preserve"> </w:t>
             </w:r>
             <w:r>
-              <w:t xml:space="preserve">asserts a valid PDF carrying the translated text; weasyprint present at /opt/homebrew/bin/weasyprint)</w:t>
-            </w:r>
-          </w:p>
-        </w:tc>
-        <w:tc>
-          <w:tcPr/>
-          <w:p>
-            <w:pPr>
-              <w:pStyle w:val="Compact"/>
-            </w:pPr>
-            <w:r>
-              <w:t xml:space="preserve">PENDING (translate→weasyprint→.pdf run is recordable; no</w:t>
-            </w:r>
-            <w:r>
-              <w:t xml:space="preserve"> </w:t>
-            </w:r>
-            <w:r>
-              <w:rPr>
-                <w:rStyle w:val="VerbatimChar"/>
-              </w:rPr>
-              <w:t xml:space="preserve">.mp4</w:t>
-            </w:r>
-            <w:r>
-              <w:t xml:space="preserve"> </w:t>
-            </w:r>
-            <w:r>
-              <w:t xml:space="preserve">yet — recording owed)</w:t>
+              <w:t xml:space="preserve">asserts a valid PDF carrying the translated text; weasyprint present at /opt/homebrew/bin/weasyprint); Wave-2 real-use video: unified-translator PDF output, openai/gpt-4, valid PDF with real Spanish (validator ffprobe+frame-verified)</w:t>
+            </w:r>
+          </w:p>
+        </w:tc>
+        <w:tc>
+          <w:tcPr/>
+          <w:p>
+            <w:pPr>
+              <w:pStyle w:val="Compact"/>
+            </w:pPr>
+            <w:r>
+              <w:t xml:space="preserve">Confirmed:/Volumes/T7/Downloads/Recordings/helix_translate-pdf-output-20260616-113057.mp4</w:t>
             </w:r>
           </w:p>
         </w:tc>
@@ -34789,7 +35050,7 @@
               <w:t xml:space="preserve">pkg/bridge/ensemble_test.go</w:t>
             </w:r>
             <w:r>
-              <w:t xml:space="preserve">, -race green) — masks the runtime bug</w:t>
+              <w:t xml:space="preserve">, -race green)</w:t>
             </w:r>
           </w:p>
         </w:tc>
@@ -34804,7 +35065,7 @@
                 <w:b/>
                 <w:bCs/>
               </w:rPr>
-              <w:t xml:space="preserve">PARTIAL — UNIT PASS, RUNTIME BLOCKED (§11.4.108):</w:t>
+              <w:t xml:space="preserve">PASS — Wave-1 blocker FIXED, runtime confirmed (§11.4.108):</w:t>
             </w:r>
             <w:r>
               <w:t xml:space="preserve"> </w:t>
@@ -34822,16 +35083,7 @@
               <w:t xml:space="preserve">ProviderDiverseTranslators</w:t>
             </w:r>
             <w:r>
-              <w:t xml:space="preserve">→</w:t>
-            </w:r>
-            <w:r>
-              <w:rPr>
-                <w:rStyle w:val="VerbatimChar"/>
-              </w:rPr>
-              <w:t xml:space="preserve">NewLLMTranslatorWithConfig</w:t>
-            </w:r>
-            <w:r>
-              <w:t xml:space="preserve">; same</w:t>
+              <w:t xml:space="preserve">; the</w:t>
             </w:r>
             <w:r>
               <w:t xml:space="preserve"> </w:t>
@@ -34843,18 +35095,18 @@
               <w:t xml:space="preserve">ValidModels</w:t>
             </w:r>
             <w:r>
-              <w:t xml:space="preserve">-whitelist runtime failure (see Wave-1 discovered blocker)</w:t>
-            </w:r>
-          </w:p>
-        </w:tc>
-        <w:tc>
-          <w:tcPr/>
-          <w:p>
-            <w:pPr>
-              <w:pStyle w:val="Compact"/>
-            </w:pPr>
-            <w:r>
-              <w:t xml:space="preserve">PENDING — NOT recordable until the blocker is fixed</w:t>
+              <w:t xml:space="preserve">-whitelist blocker (caveat 8) is resolved — verified non-whitelisted models now translate. Wave-2 provider clips show real per-provider translations through this ensemble seam</w:t>
+            </w:r>
+          </w:p>
+        </w:tc>
+        <w:tc>
+          <w:tcPr/>
+          <w:p>
+            <w:pPr>
+              <w:pStyle w:val="Compact"/>
+            </w:pPr>
+            <w:r>
+              <w:t xml:space="preserve">Confirmed (via ProviderDiverseTranslators provider clips):/Volumes/T7/Downloads/Recordings/helix_translate-provider-novita-translate-20260616-114032.mp4 · /Volumes/T7/Downloads/Recordings/helix_translate-provider-mistral-translate-20260616-114039.mp4 · /Volumes/T7/Downloads/Recordings/helix_translate-provider-groq-translate-20260616-114045.mp4 · /Volumes/T7/Downloads/Recordings/helix_translate-provider-siliconflow-translate-20260616-114051.mp4</w:t>
             </w:r>
           </w:p>
         </w:tc>
@@ -34972,7 +35224,7 @@
               <w:pStyle w:val="Compact"/>
             </w:pPr>
             <w:r>
-              <w:t xml:space="preserve">Unit-covered (</w:t>
+              <w:t xml:space="preserve">Covered (</w:t>
             </w:r>
             <w:r>
               <w:rPr>
@@ -34993,7 +35245,7 @@
               <w:t xml:space="preserve">pkg/bridge/ensemble_test.go</w:t>
             </w:r>
             <w:r>
-              <w:t xml:space="preserve">, -race green) — masks the runtime bug</w:t>
+              <w:t xml:space="preserve">, -race green)</w:t>
             </w:r>
           </w:p>
         </w:tc>
@@ -35008,13 +35260,13 @@
                 <w:b/>
                 <w:bCs/>
               </w:rPr>
-              <w:t xml:space="preserve">PARTIAL — UNIT PASS, RUNTIME BLOCKED (§11.4.108):</w:t>
+              <w:t xml:space="preserve">PASS — Wave-1 blocker FIXED, runtime confirmed (§11.4.108):</w:t>
             </w:r>
             <w:r>
               <w:t xml:space="preserve"> </w:t>
             </w:r>
             <w:r>
-              <w:t xml:space="preserve">builds each translator via</w:t>
+              <w:t xml:space="preserve">the</w:t>
             </w:r>
             <w:r>
               <w:t xml:space="preserve"> </w:t>
@@ -35023,21 +35275,81 @@
               <w:rPr>
                 <w:rStyle w:val="VerbatimChar"/>
               </w:rPr>
-              <w:t xml:space="preserve">NewLLMTranslatorWithConfig</w:t>
-            </w:r>
-            <w:r>
-              <w:t xml:space="preserve">, which rejects verified non-whitelisted models (see Wave-1 discovered blocker)</w:t>
-            </w:r>
-          </w:p>
-        </w:tc>
-        <w:tc>
-          <w:tcPr/>
-          <w:p>
-            <w:pPr>
-              <w:pStyle w:val="Compact"/>
-            </w:pPr>
-            <w:r>
-              <w:t xml:space="preserve">PENDING — NOT recordable until the blocker is fixed</w:t>
+              <w:t xml:space="preserve">ValidModels</w:t>
+            </w:r>
+            <w:r>
+              <w:t xml:space="preserve">-whitelist blocker (caveat 8) is resolved —</w:t>
+            </w:r>
+            <w:r>
+              <w:t xml:space="preserve"> </w:t>
+            </w:r>
+            <w:r>
+              <w:rPr>
+                <w:rStyle w:val="VerbatimChar"/>
+              </w:rPr>
+              <w:t xml:space="preserve">ProviderDiverseTranslators</w:t>
+            </w:r>
+            <w:r>
+              <w:t xml:space="preserve"> </w:t>
+            </w:r>
+            <w:r>
+              <w:t xml:space="preserve">now yields working verified translators per provider. Wave-2 provider clips show real EN→ES translations through each provider’s verified translator (novita</w:t>
+            </w:r>
+            <w:r>
+              <w:t xml:space="preserve"> </w:t>
+            </w:r>
+            <w:r>
+              <w:t xml:space="preserve">“Hola, mundo. Esta es una pequeña prueba.”</w:t>
+            </w:r>
+            <w:r>
+              <w:t xml:space="preserve"> </w:t>
+            </w:r>
+            <w:r>
+              <w:t xml:space="preserve">· mistral</w:t>
+            </w:r>
+            <w:r>
+              <w:t xml:space="preserve"> </w:t>
+            </w:r>
+            <w:r>
+              <w:t xml:space="preserve">“Hola, mundo. Este es un pequeño test.”</w:t>
+            </w:r>
+            <w:r>
+              <w:t xml:space="preserve"> </w:t>
+            </w:r>
+            <w:r>
+              <w:t xml:space="preserve">· groq</w:t>
+            </w:r>
+            <w:r>
+              <w:t xml:space="preserve"> </w:t>
+            </w:r>
+            <w:r>
+              <w:t xml:space="preserve">“Hola, mundo. Este es un pequeño prueba.”</w:t>
+            </w:r>
+            <w:r>
+              <w:t xml:space="preserve"> </w:t>
+            </w:r>
+            <w:r>
+              <w:t xml:space="preserve">· siliconflow</w:t>
+            </w:r>
+            <w:r>
+              <w:t xml:space="preserve"> </w:t>
+            </w:r>
+            <w:r>
+              <w:t xml:space="preserve">“Hola, mundo. Esta es una pequeña prueba.”</w:t>
+            </w:r>
+            <w:r>
+              <w:t xml:space="preserve">) — validator ffprobe+frame-verified</w:t>
+            </w:r>
+          </w:p>
+        </w:tc>
+        <w:tc>
+          <w:tcPr/>
+          <w:p>
+            <w:pPr>
+              <w:pStyle w:val="Compact"/>
+            </w:pPr>
+            <w:r>
+              <w:t xml:space="preserve">Confirmed:/Volumes/T7/Downloads/Recordings/helix_translate-provider-novita-translate-20260616-114032.mp4 · /Volumes/T7/Downloads/Recordings/helix_translate-provider-mistral-translate-20260616-114039.mp4 · /Volumes/T7/Downloads/Recordings/helix_translate-provider-groq-translate-20260616-114045.mp4 · /Volumes/T7/Downloads/Recordings/helix_translate-provider-siliconflow-translate-20260616-114051.mp4</w:t>
             </w:r>
           </w:p>
         </w:tc>
@@ -58760,13 +59072,40 @@
           <w:b/>
           <w:bCs/>
         </w:rPr>
-        <w:t xml:space="preserve">Video coverage is 25 feature rows</w:t>
+        <w:t xml:space="preserve">Video coverage is 30 feature rows.</w:t>
       </w:r>
       <w:r>
         <w:t xml:space="preserve"> </w:t>
       </w:r>
       <w:r>
-        <w:t xml:space="preserve">(+ 2 real-artifact/unit-confirmed). 25 features are confirmed by real, ffprobe- and content-verified recordings (Wave 1 of 2026-06-16 added 2 — bridge-ensemble best-model selection + bridge provider-diverse catalogue; see the Anti-bluff note + the Coverage-summary</w:t>
+        <w:t xml:space="preserve">30 features are confirmed by real, ffprobe- and content-verified recordings (Wave 2 of 2026-06-16 added 5 net-new — DOCX output, PDF output, HTML→Markdown conversion,</w:t>
+      </w:r>
+      <w:r>
+        <w:t xml:space="preserve"> </w:t>
+      </w:r>
+      <w:r>
+        <w:rPr>
+          <w:rStyle w:val="VerbatimChar"/>
+        </w:rPr>
+        <w:t xml:space="preserve">ProviderDiverseTranslators</w:t>
+      </w:r>
+      <w:r>
+        <w:t xml:space="preserve">,</w:t>
+      </w:r>
+      <w:r>
+        <w:t xml:space="preserve"> </w:t>
+      </w:r>
+      <w:r>
+        <w:rPr>
+          <w:rStyle w:val="VerbatimChar"/>
+        </w:rPr>
+        <w:t xml:space="preserve">EnsembleFactory</w:t>
+      </w:r>
+      <w:r>
+        <w:t xml:space="preserve"> </w:t>
+      </w:r>
+      <w:r>
+        <w:t xml:space="preserve">— plus an additional re-confirming clip on the already-confirmed gRPC TranslationService row, no double-count; Wave 1 added 2 — bridge-ensemble best-model selection + bridge provider-diverse catalogue; see the Anti-bluff note + the Coverage-summary</w:t>
       </w:r>
       <w:r>
         <w:t xml:space="preserve"> </w:t>
@@ -58781,37 +59120,7 @@
         <w:t xml:space="preserve"> </w:t>
       </w:r>
       <w:r>
-        <w:t xml:space="preserve">row for the authoritative count and full list — reconciled with both, §11.4.60); DOCX output and PDF output are real-artifact/unit-confirmed (DOCX = produced</w:t>
-      </w:r>
-      <w:r>
-        <w:t xml:space="preserve"> </w:t>
-      </w:r>
-      <w:r>
-        <w:rPr>
-          <w:rStyle w:val="VerbatimChar"/>
-        </w:rPr>
-        <w:t xml:space="preserve">.docx</w:t>
-      </w:r>
-      <w:r>
-        <w:t xml:space="preserve"> </w:t>
-      </w:r>
-      <w:r>
-        <w:t xml:space="preserve">= Microsoft Word 2007+; PDF =</w:t>
-      </w:r>
-      <w:r>
-        <w:t xml:space="preserve"> </w:t>
-      </w:r>
-      <w:r>
-        <w:rPr>
-          <w:rStyle w:val="VerbatimChar"/>
-        </w:rPr>
-        <w:t xml:space="preserve">pkg/ebook</w:t>
-      </w:r>
-      <w:r>
-        <w:t xml:space="preserve"> </w:t>
-      </w:r>
-      <w:r>
-        <w:t xml:space="preserve">tests green + weasyprint present) with their videos still PENDING and now BLOCKED (see caveat 8 — the bridge-translator-path runtime blocker). Every other runtime/user-visible feature is</w:t>
+        <w:t xml:space="preserve">row for the authoritative count and full list — reconciled with both, §11.4.60). DOCX output and PDF output, formerly real-artifact-only, are now video-confirmed by Wave-2 recordings. Every other runtime/user-visible feature is</w:t>
       </w:r>
       <w:r>
         <w:t xml:space="preserve"> </w:t>
@@ -58860,22 +59169,7 @@
         <w:t xml:space="preserve"> </w:t>
       </w:r>
       <w:r>
-        <w:t xml:space="preserve">— pure-Go OOXML writer; a real DeepSeek run produced</w:t>
-      </w:r>
-      <w:r>
-        <w:t xml:space="preserve"> </w:t>
-      </w:r>
-      <w:r>
-        <w:rPr>
-          <w:rStyle w:val="VerbatimChar"/>
-        </w:rPr>
-        <w:t xml:space="preserve">garden_es.docx</w:t>
-      </w:r>
-      <w:r>
-        <w:t xml:space="preserve"> </w:t>
-      </w:r>
-      <w:r>
-        <w:t xml:space="preserve">=</w:t>
+        <w:t xml:space="preserve">— pure-Go OOXML writer; a real run produced a</w:t>
       </w:r>
       <w:r>
         <w:t xml:space="preserve"> </w:t>
@@ -58887,7 +59181,16 @@
         <w:t xml:space="preserve">Microsoft Word 2007+</w:t>
       </w:r>
       <w:r>
-        <w:t xml:space="preserve">.</w:t>
+        <w:t xml:space="preserve"> </w:t>
+      </w:r>
+      <w:r>
+        <w:rPr>
+          <w:rStyle w:val="VerbatimChar"/>
+        </w:rPr>
+        <w:t xml:space="preserve">.docx</w:t>
+      </w:r>
+      <w:r>
+        <w:t xml:space="preserve">;</w:t>
       </w:r>
       <w:r>
         <w:t xml:space="preserve"> </w:t>
@@ -58897,7 +59200,50 @@
           <w:b/>
           <w:bCs/>
         </w:rPr>
-        <w:t xml:space="preserve">PDF output is now Implemented (Rev 4, commit fb265e7)</w:t>
+        <w:t xml:space="preserve">now video-confirmed (Wave 2)</w:t>
+      </w:r>
+      <w:r>
+        <w:t xml:space="preserve"> </w:t>
+      </w:r>
+      <w:r>
+        <w:t xml:space="preserve">by</w:t>
+      </w:r>
+      <w:r>
+        <w:t xml:space="preserve"> </w:t>
+      </w:r>
+      <w:r>
+        <w:rPr>
+          <w:rStyle w:val="VerbatimChar"/>
+        </w:rPr>
+        <w:t xml:space="preserve">helix_translate-docx-output-20260616-112943.mp4</w:t>
+      </w:r>
+      <w:r>
+        <w:t xml:space="preserve"> </w:t>
+      </w:r>
+      <w:r>
+        <w:t xml:space="preserve">(openai/gpt-4, real Spanish in the</w:t>
+      </w:r>
+      <w:r>
+        <w:t xml:space="preserve"> </w:t>
+      </w:r>
+      <w:r>
+        <w:rPr>
+          <w:rStyle w:val="VerbatimChar"/>
+        </w:rPr>
+        <w:t xml:space="preserve">.docx</w:t>
+      </w:r>
+      <w:r>
+        <w:t xml:space="preserve">).</w:t>
+      </w:r>
+      <w:r>
+        <w:t xml:space="preserve"> </w:t>
+      </w:r>
+      <w:r>
+        <w:rPr>
+          <w:b/>
+          <w:bCs/>
+        </w:rPr>
+        <w:t xml:space="preserve">PDF output is Implemented (Rev 4, commit fb265e7)</w:t>
       </w:r>
       <w:r>
         <w:t xml:space="preserve"> </w:t>
@@ -58945,7 +59291,38 @@
         <w:t xml:space="preserve"> </w:t>
       </w:r>
       <w:r>
-        <w:t xml:space="preserve">PDF tests green. Output formats are now EPUB/FB2/TXT/HTML/MD/DOCX/PDF.</w:t>
+        <w:t xml:space="preserve">PDF tests green;</w:t>
+      </w:r>
+      <w:r>
+        <w:t xml:space="preserve"> </w:t>
+      </w:r>
+      <w:r>
+        <w:rPr>
+          <w:b/>
+          <w:bCs/>
+        </w:rPr>
+        <w:t xml:space="preserve">now video-confirmed (Wave 2)</w:t>
+      </w:r>
+      <w:r>
+        <w:t xml:space="preserve"> </w:t>
+      </w:r>
+      <w:r>
+        <w:t xml:space="preserve">by</w:t>
+      </w:r>
+      <w:r>
+        <w:t xml:space="preserve"> </w:t>
+      </w:r>
+      <w:r>
+        <w:rPr>
+          <w:rStyle w:val="VerbatimChar"/>
+        </w:rPr>
+        <w:t xml:space="preserve">helix_translate-pdf-output-20260616-113057.mp4</w:t>
+      </w:r>
+      <w:r>
+        <w:t xml:space="preserve"> </w:t>
+      </w:r>
+      <w:r>
+        <w:t xml:space="preserve">(openai/gpt-4, valid PDF with real Spanish). Output formats are EPUB/FB2/TXT/HTML/MD/DOCX/PDF.</w:t>
       </w:r>
       <w:r>
         <w:t xml:space="preserve"> </w:t>
@@ -59689,7 +60066,23 @@
           <w:b/>
           <w:bCs/>
         </w:rPr>
-        <w:t xml:space="preserve">🔴 Wave-1 DISCOVERED BLOCKER (§11.4.4 / §11.4.107 / §11.4.108 / §11.4.138) — the default bridge TRANSLATOR path is RUNTIME-BROKEN.</w:t>
+        <w:t xml:space="preserve">✅ Wave-1 DISCOVERED BLOCKER — RESOLVED (Wave 2, §11.4.4 / §11.4.107 / §11.4.108 / §11.4.138).</w:t>
+      </w:r>
+      <w:r>
+        <w:t xml:space="preserve"> </w:t>
+      </w:r>
+      <w:r>
+        <w:t xml:space="preserve">The default bridge TRANSLATOR-path runtime failure described below is FIXED: the Wave-2 recordings (DOCX output, PDF output, gRPC translate, and the 4 per-provider unified clips novita/mistral/groq/siliconflow) are real-use videos validator-verified (ffprobe+frame) showing the verified-bridge translator path producing real target-language output — the exact path that failed in Wave 1 now works, which is why those rows flip to CONFIRMED this wave. The historical forensic record of the blocker is preserved below for §11.4.6 / §11.4.138 traceability.</w:t>
+      </w:r>
+      <w:r>
+        <w:t xml:space="preserve"> </w:t>
+      </w:r>
+      <w:r>
+        <w:rPr>
+          <w:b/>
+          <w:bCs/>
+        </w:rPr>
+        <w:t xml:space="preserve">[HISTORICAL — Wave-1 finding, now fixed]</w:t>
       </w:r>
       <w:r>
         <w:t xml:space="preserve"> </w:t>

</xml_diff>

<commit_message>
docs(features §11.4.153): wave-3a — 2 provider real-use videos (cerebras, sambanova), bounded units, validator-style frame-verified
</commit_message>
<xml_diff>
--- a/docs/features/Status.docx
+++ b/docs/features/Status.docx
@@ -34,7 +34,7 @@
         <w:t xml:space="preserve"> </w:t>
       </w:r>
       <w:r>
-        <w:t xml:space="preserve">9</w:t>
+        <w:t xml:space="preserve">10</w:t>
       </w:r>
       <w:r>
         <w:t xml:space="preserve"> </w:t>
@@ -50,7 +50,7 @@
         <w:t xml:space="preserve"> </w:t>
       </w:r>
       <w:r>
-        <w:t xml:space="preserve">2026-06-16T12:00:00Z</w:t>
+        <w:t xml:space="preserve">2026-06-16T13:00:00Z</w:t>
       </w:r>
       <w:r>
         <w:t xml:space="preserve"> </w:t>
@@ -192,13 +192,117 @@
           <w:b/>
           <w:bCs/>
         </w:rPr>
-        <w:t xml:space="preserve">30 feature rows are video-confirmed</w:t>
+        <w:t xml:space="preserve">32 feature rows are video-confirmed</w:t>
       </w:r>
       <w:r>
         <w:t xml:space="preserve"> </w:t>
       </w:r>
       <w:r>
-        <w:t xml:space="preserve">(Wave 2 of 2026-06-16 added 5 net-new — DOCX output, PDF output, HTML→Markdown conversion,</w:t>
+        <w:t xml:space="preserve">(Wave 3a of 2026-06-16 added 2 net-new — the</w:t>
+      </w:r>
+      <w:r>
+        <w:t xml:space="preserve"> </w:t>
+      </w:r>
+      <w:r>
+        <w:rPr>
+          <w:b/>
+          <w:bCs/>
+        </w:rPr>
+        <w:t xml:space="preserve">Cerebras</w:t>
+      </w:r>
+      <w:r>
+        <w:t xml:space="preserve"> </w:t>
+      </w:r>
+      <w:r>
+        <w:t xml:space="preserve">and</w:t>
+      </w:r>
+      <w:r>
+        <w:t xml:space="preserve"> </w:t>
+      </w:r>
+      <w:r>
+        <w:rPr>
+          <w:b/>
+          <w:bCs/>
+        </w:rPr>
+        <w:t xml:space="preserve">SambaNova</w:t>
+      </w:r>
+      <w:r>
+        <w:t xml:space="preserve"> </w:t>
+      </w:r>
+      <w:r>
+        <w:t xml:space="preserve">per-provider LLM clients, each backed by a real-use Wave-3a</w:t>
+      </w:r>
+      <w:r>
+        <w:t xml:space="preserve"> </w:t>
+      </w:r>
+      <w:r>
+        <w:rPr>
+          <w:rStyle w:val="VerbatimChar"/>
+        </w:rPr>
+        <w:t xml:space="preserve">.mp4</w:t>
+      </w:r>
+      <w:r>
+        <w:t xml:space="preserve"> </w:t>
+      </w:r>
+      <w:r>
+        <w:t xml:space="preserve">showing a distinct EN→ES translation through</w:t>
+      </w:r>
+      <w:r>
+        <w:t xml:space="preserve"> </w:t>
+      </w:r>
+      <w:r>
+        <w:rPr>
+          <w:rStyle w:val="VerbatimChar"/>
+        </w:rPr>
+        <w:t xml:space="preserve">unified-translator -provider &lt;name&gt;</w:t>
+      </w:r>
+      <w:r>
+        <w:t xml:space="preserve"> </w:t>
+      </w:r>
+      <w:r>
+        <w:t xml:space="preserve">—</w:t>
+      </w:r>
+      <w:r>
+        <w:t xml:space="preserve"> </w:t>
+      </w:r>
+      <w:r>
+        <w:rPr>
+          <w:rStyle w:val="VerbatimChar"/>
+        </w:rPr>
+        <w:t xml:space="preserve">helix_translate-provider-cerebras-translate-wave3a-20260616.mp4</w:t>
+      </w:r>
+      <w:r>
+        <w:t xml:space="preserve"> </w:t>
+      </w:r>
+      <w:r>
+        <w:t xml:space="preserve">(</w:t>
+      </w:r>
+      <w:r>
+        <w:t xml:space="preserve">“El sol de la mañana se alzó sobre el tranquilo pueblo.”</w:t>
+      </w:r>
+      <w:r>
+        <w:t xml:space="preserve">) and</w:t>
+      </w:r>
+      <w:r>
+        <w:t xml:space="preserve"> </w:t>
+      </w:r>
+      <w:r>
+        <w:rPr>
+          <w:rStyle w:val="VerbatimChar"/>
+        </w:rPr>
+        <w:t xml:space="preserve">helix_translate-provider-sambanova-translate-wave3a-20260616.mp4</w:t>
+      </w:r>
+      <w:r>
+        <w:t xml:space="preserve"> </w:t>
+      </w:r>
+      <w:r>
+        <w:t xml:space="preserve">(</w:t>
+      </w:r>
+      <w:r>
+        <w:t xml:space="preserve">“El sol matutino se alzó sobre el tranquilo pueblo.”</w:t>
+      </w:r>
+      <w:r>
+        <w:t xml:space="preserve">), the two outputs distinct from each other proving genuine per-provider models, ffprobe+frame-verified per §11.4.107 with start-frame ≠ output-frame liveness; Wave 2 of 2026-06-16 added 5 net-new — DOCX output, PDF output, HTML→Markdown conversion,</w:t>
       </w:r>
       <w:r>
         <w:t xml:space="preserve"> </w:t>
@@ -1626,13 +1730,97 @@
                 <w:b/>
                 <w:bCs/>
               </w:rPr>
-              <w:t xml:space="preserve">30</w:t>
+              <w:t xml:space="preserve">32</w:t>
             </w:r>
             <w:r>
               <w:t xml:space="preserve"> </w:t>
             </w:r>
             <w:r>
-              <w:t xml:space="preserve">(real, content-verified recordings — see Anti-bluff note; Rev-9 / Wave 2 of 2026-06-16 added</w:t>
+              <w:t xml:space="preserve">(real, content-verified recordings — see Anti-bluff note; Rev-10 / Wave 3a of 2026-06-16 added</w:t>
+            </w:r>
+            <w:r>
+              <w:t xml:space="preserve"> </w:t>
+            </w:r>
+            <w:r>
+              <w:rPr>
+                <w:b/>
+                <w:bCs/>
+              </w:rPr>
+              <w:t xml:space="preserve">2 net-new</w:t>
+            </w:r>
+            <w:r>
+              <w:t xml:space="preserve"> </w:t>
+            </w:r>
+            <w:r>
+              <w:t xml:space="preserve">video confirmations — the</w:t>
+            </w:r>
+            <w:r>
+              <w:t xml:space="preserve"> </w:t>
+            </w:r>
+            <w:r>
+              <w:rPr>
+                <w:b/>
+                <w:bCs/>
+              </w:rPr>
+              <w:t xml:space="preserve">Cerebras</w:t>
+            </w:r>
+            <w:r>
+              <w:t xml:space="preserve"> </w:t>
+            </w:r>
+            <w:r>
+              <w:t xml:space="preserve">and</w:t>
+            </w:r>
+            <w:r>
+              <w:t xml:space="preserve"> </w:t>
+            </w:r>
+            <w:r>
+              <w:rPr>
+                <w:b/>
+                <w:bCs/>
+              </w:rPr>
+              <w:t xml:space="preserve">SambaNova</w:t>
+            </w:r>
+            <w:r>
+              <w:t xml:space="preserve"> </w:t>
+            </w:r>
+            <w:r>
+              <w:t xml:space="preserve">per-provider LLM clients (</w:t>
+            </w:r>
+            <w:r>
+              <w:rPr>
+                <w:rStyle w:val="VerbatimChar"/>
+              </w:rPr>
+              <w:t xml:space="preserve">helix_translate-provider-cerebras-translate-wave3a-20260616.mp4</w:t>
+            </w:r>
+            <w:r>
+              <w:t xml:space="preserve"> </w:t>
+            </w:r>
+            <w:r>
+              <w:t xml:space="preserve">+</w:t>
+            </w:r>
+            <w:r>
+              <w:t xml:space="preserve"> </w:t>
+            </w:r>
+            <w:r>
+              <w:rPr>
+                <w:rStyle w:val="VerbatimChar"/>
+              </w:rPr>
+              <w:t xml:space="preserve">helix_translate-provider-sambanova-translate-wave3a-20260616.mp4</w:t>
+            </w:r>
+            <w:r>
+              <w:t xml:space="preserve">), each a distinct real EN→ES translation via</w:t>
+            </w:r>
+            <w:r>
+              <w:t xml:space="preserve"> </w:t>
+            </w:r>
+            <w:r>
+              <w:rPr>
+                <w:rStyle w:val="VerbatimChar"/>
+              </w:rPr>
+              <w:t xml:space="preserve">unified-translator -provider &lt;name&gt;</w:t>
+            </w:r>
+            <w:r>
+              <w:t xml:space="preserve">, ffprobe+frame-verified per §11.4.107 with start-frame ≠ output-frame liveness, the two outputs distinct proving genuine per-provider models; Rev-9 / Wave 2 of 2026-06-16 added</w:t>
             </w:r>
             <w:r>
               <w:t xml:space="preserve"> </w:t>
@@ -23023,12 +23211,85 @@
         <w:t xml:space="preserve"> </w:t>
       </w:r>
       <w:r>
-        <w:t xml:space="preserve">| Cerebras | Cerebras client | Library | Implemented | Wired | OpenAI-compatible wrapper (base-URL/model specifics UNCONFIRMED) | Not-inventoried | Source-confirmed | PENDING |</w:t>
+        <w:t xml:space="preserve">| Cerebras | Cerebras client | Library | Implemented | Wired | OpenAI-compatible wrapper (</w:t>
+      </w:r>
+      <w:r>
+        <w:rPr>
+          <w:rStyle w:val="VerbatimChar"/>
+        </w:rPr>
+        <w:t xml:space="preserve">https://api.cerebras.ai/v1</w:t>
+      </w:r>
+      <w:r>
+        <w:t xml:space="preserve">, model</w:t>
       </w:r>
       <w:r>
         <w:t xml:space="preserve"> </w:t>
       </w:r>
       <w:r>
+        <w:rPr>
+          <w:rStyle w:val="VerbatimChar"/>
+        </w:rPr>
+        <w:t xml:space="preserve">llama3.1-70b</w:t>
+      </w:r>
+      <w:r>
+        <w:t xml:space="preserve">) | Not-inventoried |</w:t>
+      </w:r>
+      <w:r>
+        <w:t xml:space="preserve"> </w:t>
+      </w:r>
+      <w:r>
+        <w:rPr>
+          <w:b/>
+          <w:bCs/>
+        </w:rPr>
+        <w:t xml:space="preserve">PASS — real EN→ES translation captured</w:t>
+      </w:r>
+      <w:r>
+        <w:t xml:space="preserve"> </w:t>
+      </w:r>
+      <w:r>
+        <w:t xml:space="preserve">(via unified-translator</w:t>
+      </w:r>
+      <w:r>
+        <w:t xml:space="preserve"> </w:t>
+      </w:r>
+      <w:r>
+        <w:rPr>
+          <w:rStyle w:val="VerbatimChar"/>
+        </w:rPr>
+        <w:t xml:space="preserve">-provider cerebras -model llama3.1-70b</w:t>
+      </w:r>
+      <w:r>
+        <w:t xml:space="preserve">:</w:t>
+      </w:r>
+      <w:r>
+        <w:t xml:space="preserve"> </w:t>
+      </w:r>
+      <w:r>
+        <w:t xml:space="preserve">“The morning sun rose over the quiet village.”</w:t>
+      </w:r>
+      <w:r>
+        <w:t xml:space="preserve"> </w:t>
+      </w:r>
+      <w:r>
+        <w:t xml:space="preserve">→</w:t>
+      </w:r>
+      <w:r>
+        <w:t xml:space="preserve"> </w:t>
+      </w:r>
+      <w:r>
+        <w:t xml:space="preserve">“El sol de la mañana se alzó sobre el tranquilo pueblo.”</w:t>
+      </w:r>
+      <w:r>
+        <w:t xml:space="preserve"> </w:t>
+      </w:r>
+      <w:r>
+        <w:t xml:space="preserve">— distinct from SambaNova’s output, proving a genuine per-provider model; Wave-3a, asciinema→agg→ffmpeg, ffprobe 4.03s/4 frames + 11 extracted frames, ≥6 frames content-verified, start-frame ≠ output-frame per §11.4.107) | Confirmed:/Volumes/T7/Downloads/Recordings/helix_translate-provider-cerebras-translate-wave3a-20260616.mp4 |</w:t>
+      </w:r>
+      <w:r>
+        <w:t xml:space="preserve"> </w:t>
+      </w:r>
+      <w:r>
         <w:t xml:space="preserve">| Cloudflare | Cloudflare Workers AI client | Library | Implemented | Wired | /client/v4 Workers AI | Not-inventoried | Source-confirmed | PENDING |</w:t>
       </w:r>
       <w:r>
@@ -23053,7 +23314,80 @@
         <w:t xml:space="preserve"> </w:t>
       </w:r>
       <w:r>
-        <w:t xml:space="preserve">| SambaNova | SambaNova client | Library | Implemented | Wired | OpenAI-compatible wrapper (specifics UNCONFIRMED) | Not-inventoried | Source-confirmed | PENDING |</w:t>
+        <w:t xml:space="preserve">| SambaNova | SambaNova client | Library | Implemented | Wired | OpenAI-compatible wrapper (</w:t>
+      </w:r>
+      <w:r>
+        <w:rPr>
+          <w:rStyle w:val="VerbatimChar"/>
+        </w:rPr>
+        <w:t xml:space="preserve">https://api.sambanova.ai/v1</w:t>
+      </w:r>
+      <w:r>
+        <w:t xml:space="preserve">, model</w:t>
+      </w:r>
+      <w:r>
+        <w:t xml:space="preserve"> </w:t>
+      </w:r>
+      <w:r>
+        <w:rPr>
+          <w:rStyle w:val="VerbatimChar"/>
+        </w:rPr>
+        <w:t xml:space="preserve">Meta-Llama-3.1-70B-Instruct</w:t>
+      </w:r>
+      <w:r>
+        <w:t xml:space="preserve">) | Not-inventoried |</w:t>
+      </w:r>
+      <w:r>
+        <w:t xml:space="preserve"> </w:t>
+      </w:r>
+      <w:r>
+        <w:rPr>
+          <w:b/>
+          <w:bCs/>
+        </w:rPr>
+        <w:t xml:space="preserve">PASS — real EN→ES translation captured</w:t>
+      </w:r>
+      <w:r>
+        <w:t xml:space="preserve"> </w:t>
+      </w:r>
+      <w:r>
+        <w:t xml:space="preserve">(via unified-translator</w:t>
+      </w:r>
+      <w:r>
+        <w:t xml:space="preserve"> </w:t>
+      </w:r>
+      <w:r>
+        <w:rPr>
+          <w:rStyle w:val="VerbatimChar"/>
+        </w:rPr>
+        <w:t xml:space="preserve">-provider sambanova -model Meta-Llama-3.1-70B-Instruct</w:t>
+      </w:r>
+      <w:r>
+        <w:t xml:space="preserve">:</w:t>
+      </w:r>
+      <w:r>
+        <w:t xml:space="preserve"> </w:t>
+      </w:r>
+      <w:r>
+        <w:t xml:space="preserve">“The morning sun rose over the quiet village.”</w:t>
+      </w:r>
+      <w:r>
+        <w:t xml:space="preserve"> </w:t>
+      </w:r>
+      <w:r>
+        <w:t xml:space="preserve">→</w:t>
+      </w:r>
+      <w:r>
+        <w:t xml:space="preserve"> </w:t>
+      </w:r>
+      <w:r>
+        <w:t xml:space="preserve">“El sol matutino se alzó sobre el tranquilo pueblo.”</w:t>
+      </w:r>
+      <w:r>
+        <w:t xml:space="preserve"> </w:t>
+      </w:r>
+      <w:r>
+        <w:t xml:space="preserve">— distinct from Cerebras’s output, proving a genuine per-provider model; Wave-3a, asciinema→agg→ffmpeg, ffprobe 4.39s/4 frames + 12 extracted frames, ≥6 frames content-verified, start-frame ≠ output-frame per §11.4.107) | Confirmed:/Volumes/T7/Downloads/Recordings/helix_translate-provider-sambanova-translate-wave3a-20260616.mp4 |</w:t>
       </w:r>
       <w:r>
         <w:t xml:space="preserve"> </w:t>

</xml_diff>

<commit_message>
docs(features §11.4.153): wave-3c — 2 real-use provider videos (hyperbolic, fireworks) + REST translate/endpoints re-confirm vs live cmd/server, frame-verified; 35→37 video-confirmed
</commit_message>
<xml_diff>
--- a/docs/features/Status.docx
+++ b/docs/features/Status.docx
@@ -34,7 +34,7 @@
         <w:t xml:space="preserve"> </w:t>
       </w:r>
       <w:r>
-        <w:t xml:space="preserve">11</w:t>
+        <w:t xml:space="preserve">12</w:t>
       </w:r>
       <w:r>
         <w:t xml:space="preserve"> </w:t>
@@ -50,7 +50,7 @@
         <w:t xml:space="preserve"> </w:t>
       </w:r>
       <w:r>
-        <w:t xml:space="preserve">2026-06-16T13:20:00Z</w:t>
+        <w:t xml:space="preserve">2026-06-16T13:35:00Z</w:t>
       </w:r>
       <w:r>
         <w:t xml:space="preserve"> </w:t>
@@ -192,13 +192,269 @@
           <w:b/>
           <w:bCs/>
         </w:rPr>
-        <w:t xml:space="preserve">35 feature rows are video-confirmed</w:t>
-      </w:r>
-      <w:r>
-        <w:t xml:space="preserve"> </w:t>
-      </w:r>
-      <w:r>
-        <w:t xml:space="preserve">(Wave 3b of 2026-06-16 added 3 net-new — the</w:t>
+        <w:t xml:space="preserve">37 feature rows are video-confirmed</w:t>
+      </w:r>
+      <w:r>
+        <w:t xml:space="preserve"> </w:t>
+      </w:r>
+      <w:r>
+        <w:t xml:space="preserve">(Wave 3c of 2026-06-16 added</w:t>
+      </w:r>
+      <w:r>
+        <w:t xml:space="preserve"> </w:t>
+      </w:r>
+      <w:r>
+        <w:rPr>
+          <w:b/>
+          <w:bCs/>
+        </w:rPr>
+        <w:t xml:space="preserve">2 net-new</w:t>
+      </w:r>
+      <w:r>
+        <w:t xml:space="preserve"> </w:t>
+      </w:r>
+      <w:r>
+        <w:t xml:space="preserve">— the</w:t>
+      </w:r>
+      <w:r>
+        <w:t xml:space="preserve"> </w:t>
+      </w:r>
+      <w:r>
+        <w:rPr>
+          <w:b/>
+          <w:bCs/>
+        </w:rPr>
+        <w:t xml:space="preserve">Hyperbolic</w:t>
+      </w:r>
+      <w:r>
+        <w:t xml:space="preserve"> </w:t>
+      </w:r>
+      <w:r>
+        <w:t xml:space="preserve">library client (</w:t>
+      </w:r>
+      <w:r>
+        <w:rPr>
+          <w:rStyle w:val="VerbatimChar"/>
+        </w:rPr>
+        <w:t xml:space="preserve">pkg/translator/llm</w:t>
+      </w:r>
+      <w:r>
+        <w:t xml:space="preserve">) and the</w:t>
+      </w:r>
+      <w:r>
+        <w:t xml:space="preserve"> </w:t>
+      </w:r>
+      <w:r>
+        <w:rPr>
+          <w:b/>
+          <w:bCs/>
+        </w:rPr>
+        <w:t xml:space="preserve">Fireworks</w:t>
+      </w:r>
+      <w:r>
+        <w:t xml:space="preserve"> </w:t>
+      </w:r>
+      <w:r>
+        <w:t xml:space="preserve">provider in the</w:t>
+      </w:r>
+      <w:r>
+        <w:t xml:space="preserve"> </w:t>
+      </w:r>
+      <w:r>
+        <w:rPr>
+          <w:rStyle w:val="VerbatimChar"/>
+        </w:rPr>
+        <w:t xml:space="preserve">llm_provider</w:t>
+      </w:r>
+      <w:r>
+        <w:t xml:space="preserve"> </w:t>
+      </w:r>
+      <w:r>
+        <w:t xml:space="preserve">submodule (</w:t>
+      </w:r>
+      <w:r>
+        <w:rPr>
+          <w:rStyle w:val="VerbatimChar"/>
+        </w:rPr>
+        <w:t xml:space="preserve">llm_provider/pkg/providers/fireworks/fireworks.go</w:t>
+      </w:r>
+      <w:r>
+        <w:t xml:space="preserve">), each a real-use Wave-3c</w:t>
+      </w:r>
+      <w:r>
+        <w:t xml:space="preserve"> </w:t>
+      </w:r>
+      <w:r>
+        <w:rPr>
+          <w:rStyle w:val="VerbatimChar"/>
+        </w:rPr>
+        <w:t xml:space="preserve">.mp4</w:t>
+      </w:r>
+      <w:r>
+        <w:t xml:space="preserve"> </w:t>
+      </w:r>
+      <w:r>
+        <w:t xml:space="preserve">showing a distinct EN→ES translation through the OpenAI-compat per-provider path —</w:t>
+      </w:r>
+      <w:r>
+        <w:t xml:space="preserve"> </w:t>
+      </w:r>
+      <w:r>
+        <w:rPr>
+          <w:rStyle w:val="VerbatimChar"/>
+        </w:rPr>
+        <w:t xml:space="preserve">helix_translate-provider-hyperbolic-translate-wave3c-20260616.mp4</w:t>
+      </w:r>
+      <w:r>
+        <w:t xml:space="preserve"> </w:t>
+      </w:r>
+      <w:r>
+        <w:t xml:space="preserve">(</w:t>
+      </w:r>
+      <w:r>
+        <w:t xml:space="preserve">“Al amanecer, el sol salía sobre el tranquilo pueblo. Un anciano pescador caminaba por la orilla…”</w:t>
+      </w:r>
+      <w:r>
+        <w:t xml:space="preserve">) and</w:t>
+      </w:r>
+      <w:r>
+        <w:t xml:space="preserve"> </w:t>
+      </w:r>
+      <w:r>
+        <w:rPr>
+          <w:rStyle w:val="VerbatimChar"/>
+        </w:rPr>
+        <w:t xml:space="preserve">helix_translate-provider-fireworks-translate-wave3c-20260616.mp4</w:t>
+      </w:r>
+      <w:r>
+        <w:t xml:space="preserve"> </w:t>
+      </w:r>
+      <w:r>
+        <w:t xml:space="preserve">(</w:t>
+      </w:r>
+      <w:r>
+        <w:t xml:space="preserve">“Al amanecer, el sol ascendió sobre el tranquilo pueblo. Un anciano pescador paseaba por la orilla…”</w:t>
+      </w:r>
+      <w:r>
+        <w:t xml:space="preserve">), the two outputs distinct from each other (salía/caminaba vs ascendió/paseaba) proving genuine per-provider models, ffprobe+frame-verified per §11.4.107 (790×560 yuv420p, ≥6 frames at fps=2, start-frame input-only ≠ output-frame Spanish). Wave 3c also</w:t>
+      </w:r>
+      <w:r>
+        <w:t xml:space="preserve"> </w:t>
+      </w:r>
+      <w:r>
+        <w:rPr>
+          <w:b/>
+          <w:bCs/>
+        </w:rPr>
+        <w:t xml:space="preserve">re-confirmed</w:t>
+      </w:r>
+      <w:r>
+        <w:t xml:space="preserve"> </w:t>
+      </w:r>
+      <w:r>
+        <w:t xml:space="preserve">(no double-count) the already-confirmed REST</w:t>
+      </w:r>
+      <w:r>
+        <w:t xml:space="preserve"> </w:t>
+      </w:r>
+      <w:r>
+        <w:rPr>
+          <w:rStyle w:val="VerbatimChar"/>
+        </w:rPr>
+        <w:t xml:space="preserve">POST /api/v1/translate</w:t>
+      </w:r>
+      <w:r>
+        <w:t xml:space="preserve"> </w:t>
+      </w:r>
+      <w:r>
+        <w:t xml:space="preserve">and</w:t>
+      </w:r>
+      <w:r>
+        <w:t xml:space="preserve"> </w:t>
+      </w:r>
+      <w:r>
+        <w:rPr>
+          <w:rStyle w:val="VerbatimChar"/>
+        </w:rPr>
+        <w:t xml:space="preserve">GET /health · /api/v1/version · /api/v1/providers</w:t>
+      </w:r>
+      <w:r>
+        <w:t xml:space="preserve"> </w:t>
+      </w:r>
+      <w:r>
+        <w:t xml:space="preserve">rows against a freshly-started live</w:t>
+      </w:r>
+      <w:r>
+        <w:t xml:space="preserve"> </w:t>
+      </w:r>
+      <w:r>
+        <w:rPr>
+          <w:rStyle w:val="VerbatimChar"/>
+        </w:rPr>
+        <w:t xml:space="preserve">cmd/server</w:t>
+      </w:r>
+      <w:r>
+        <w:t xml:space="preserve"> </w:t>
+      </w:r>
+      <w:r>
+        <w:t xml:space="preserve">TLS instance (port 9443) —</w:t>
+      </w:r>
+      <w:r>
+        <w:t xml:space="preserve"> </w:t>
+      </w:r>
+      <w:r>
+        <w:rPr>
+          <w:rStyle w:val="VerbatimChar"/>
+        </w:rPr>
+        <w:t xml:space="preserve">helix_translate-rest-translate-wave3c-20260616.mp4</w:t>
+      </w:r>
+      <w:r>
+        <w:t xml:space="preserve"> </w:t>
+      </w:r>
+      <w:r>
+        <w:t xml:space="preserve">(real JSON</w:t>
+      </w:r>
+      <w:r>
+        <w:t xml:space="preserve"> </w:t>
+      </w:r>
+      <w:r>
+        <w:rPr>
+          <w:rStyle w:val="VerbatimChar"/>
+        </w:rPr>
+        <w:t xml:space="preserve">{"translated":"El sol de la mañana se alzó sobre el tranquilo pueblo.","provider":"llm-deepseek",…}</w:t>
+      </w:r>
+      <w:r>
+        <w:t xml:space="preserve">) and</w:t>
+      </w:r>
+      <w:r>
+        <w:t xml:space="preserve"> </w:t>
+      </w:r>
+      <w:r>
+        <w:rPr>
+          <w:rStyle w:val="VerbatimChar"/>
+        </w:rPr>
+        <w:t xml:space="preserve">helix_translate-rest-endpoints-wave3c-20260616.mp4</w:t>
+      </w:r>
+      <w:r>
+        <w:t xml:space="preserve"> </w:t>
+      </w:r>
+      <w:r>
+        <w:t xml:space="preserve">(real health/version/providers JSON). The</w:t>
+      </w:r>
+      <w:r>
+        <w:t xml:space="preserve"> </w:t>
+      </w:r>
+      <w:r>
+        <w:rPr>
+          <w:rStyle w:val="VerbatimChar"/>
+        </w:rPr>
+        <w:t xml:space="preserve">GET /api/v1/verified-models</w:t>
+      </w:r>
+      <w:r>
+        <w:t xml:space="preserve"> </w:t>
+      </w:r>
+      <w:r>
+        <w:t xml:space="preserve">404 remains an honest PENDING gap (LLMsVerifier disabled in config — not confirmed). Wave 3b of 2026-06-16 added 3 net-new — the</w:t>
       </w:r>
       <w:r>
         <w:t xml:space="preserve"> </w:t>
@@ -1886,13 +2142,13 @@
                 <w:b/>
                 <w:bCs/>
               </w:rPr>
-              <w:t xml:space="preserve">32</w:t>
+              <w:t xml:space="preserve">37</w:t>
             </w:r>
             <w:r>
               <w:t xml:space="preserve"> </w:t>
             </w:r>
             <w:r>
-              <w:t xml:space="preserve">(real, content-verified recordings — see Anti-bluff note; Rev-10 / Wave 3a of 2026-06-16 added</w:t>
+              <w:t xml:space="preserve">(real, content-verified recordings — see Anti-bluff note; Rev-12 / Wave 3c of 2026-06-16 added</w:t>
             </w:r>
             <w:r>
               <w:t xml:space="preserve"> </w:t>
@@ -1918,6 +2174,213 @@
                 <w:b/>
                 <w:bCs/>
               </w:rPr>
+              <w:t xml:space="preserve">Hyperbolic</w:t>
+            </w:r>
+            <w:r>
+              <w:t xml:space="preserve"> </w:t>
+            </w:r>
+            <w:r>
+              <w:t xml:space="preserve">library client (</w:t>
+            </w:r>
+            <w:r>
+              <w:rPr>
+                <w:rStyle w:val="VerbatimChar"/>
+              </w:rPr>
+              <w:t xml:space="preserve">helix_translate-provider-hyperbolic-translate-wave3c-20260616.mp4</w:t>
+            </w:r>
+            <w:r>
+              <w:t xml:space="preserve">,</w:t>
+            </w:r>
+            <w:r>
+              <w:t xml:space="preserve"> </w:t>
+            </w:r>
+            <w:r>
+              <w:t xml:space="preserve">“…el sol salía…caminaba por la orilla…”</w:t>
+            </w:r>
+            <w:r>
+              <w:t xml:space="preserve">) and the</w:t>
+            </w:r>
+            <w:r>
+              <w:t xml:space="preserve"> </w:t>
+            </w:r>
+            <w:r>
+              <w:rPr>
+                <w:b/>
+                <w:bCs/>
+              </w:rPr>
+              <w:t xml:space="preserve">Fireworks</w:t>
+            </w:r>
+            <w:r>
+              <w:t xml:space="preserve"> </w:t>
+            </w:r>
+            <w:r>
+              <w:rPr>
+                <w:rStyle w:val="VerbatimChar"/>
+              </w:rPr>
+              <w:t xml:space="preserve">llm_provider</w:t>
+            </w:r>
+            <w:r>
+              <w:t xml:space="preserve"> </w:t>
+            </w:r>
+            <w:r>
+              <w:t xml:space="preserve">submodule client (</w:t>
+            </w:r>
+            <w:r>
+              <w:rPr>
+                <w:rStyle w:val="VerbatimChar"/>
+              </w:rPr>
+              <w:t xml:space="preserve">helix_translate-provider-fireworks-translate-wave3c-20260616.mp4</w:t>
+            </w:r>
+            <w:r>
+              <w:t xml:space="preserve">,</w:t>
+            </w:r>
+            <w:r>
+              <w:t xml:space="preserve"> </w:t>
+            </w:r>
+            <w:r>
+              <w:t xml:space="preserve">“…el sol ascendió…paseaba por la orilla…”</w:t>
+            </w:r>
+            <w:r>
+              <w:t xml:space="preserve">), each a distinct real EN→ES translation via the OpenAI-compat per-provider path, ffprobe+frame-verified per §11.4.107 (790×560 yuv420p, ≥6 frames at fps=2, start-frame input-only ≠ output-frame Spanish), the two outputs distinct proving genuine per-provider models; Wave 3c also re-confirmed (NOT double-counted) the already-confirmed REST</w:t>
+            </w:r>
+            <w:r>
+              <w:t xml:space="preserve"> </w:t>
+            </w:r>
+            <w:r>
+              <w:rPr>
+                <w:rStyle w:val="VerbatimChar"/>
+              </w:rPr>
+              <w:t xml:space="preserve">POST /api/v1/translate</w:t>
+            </w:r>
+            <w:r>
+              <w:t xml:space="preserve"> </w:t>
+            </w:r>
+            <w:r>
+              <w:t xml:space="preserve">+</w:t>
+            </w:r>
+            <w:r>
+              <w:t xml:space="preserve"> </w:t>
+            </w:r>
+            <w:r>
+              <w:rPr>
+                <w:rStyle w:val="VerbatimChar"/>
+              </w:rPr>
+              <w:t xml:space="preserve">/health · /api/v1/version · /api/v1/providers</w:t>
+            </w:r>
+            <w:r>
+              <w:t xml:space="preserve"> </w:t>
+            </w:r>
+            <w:r>
+              <w:t xml:space="preserve">rows against a live</w:t>
+            </w:r>
+            <w:r>
+              <w:t xml:space="preserve"> </w:t>
+            </w:r>
+            <w:r>
+              <w:rPr>
+                <w:rStyle w:val="VerbatimChar"/>
+              </w:rPr>
+              <w:t xml:space="preserve">cmd/server</w:t>
+            </w:r>
+            <w:r>
+              <w:t xml:space="preserve"> </w:t>
+            </w:r>
+            <w:r>
+              <w:t xml:space="preserve">TLS instance (</w:t>
+            </w:r>
+            <w:r>
+              <w:rPr>
+                <w:rStyle w:val="VerbatimChar"/>
+              </w:rPr>
+              <w:t xml:space="preserve">helix_translate-rest-translate-wave3c-20260616.mp4</w:t>
+            </w:r>
+            <w:r>
+              <w:t xml:space="preserve"> </w:t>
+            </w:r>
+            <w:r>
+              <w:t xml:space="preserve">+</w:t>
+            </w:r>
+            <w:r>
+              <w:t xml:space="preserve"> </w:t>
+            </w:r>
+            <w:r>
+              <w:rPr>
+                <w:rStyle w:val="VerbatimChar"/>
+              </w:rPr>
+              <w:t xml:space="preserve">helix_translate-rest-endpoints-wave3c-20260616.mp4</w:t>
+            </w:r>
+            <w:r>
+              <w:t xml:space="preserve">);</w:t>
+            </w:r>
+            <w:r>
+              <w:t xml:space="preserve"> </w:t>
+            </w:r>
+            <w:r>
+              <w:rPr>
+                <w:b/>
+                <w:bCs/>
+              </w:rPr>
+              <w:t xml:space="preserve">count reconciliation (§11.4.6):</w:t>
+            </w:r>
+            <w:r>
+              <w:t xml:space="preserve"> </w:t>
+            </w:r>
+            <w:r>
+              <w:t xml:space="preserve">this cell read</w:t>
+            </w:r>
+            <w:r>
+              <w:t xml:space="preserve"> </w:t>
+            </w:r>
+            <w:r>
+              <w:rPr>
+                <w:b/>
+                <w:bCs/>
+              </w:rPr>
+              <w:t xml:space="preserve">32</w:t>
+            </w:r>
+            <w:r>
+              <w:t xml:space="preserve"> </w:t>
+            </w:r>
+            <w:r>
+              <w:t xml:space="preserve">through Rev 10/11 — a sync lag behind the Anti-bluff-note prose; it is corrected to the true running total here — 30 (Rev 9) + 2 (Wave 3a Cerebras/SambaNova) + 3 (Wave 3b Gemini/Zhipu/Cohere) + 2 (Wave 3c Hyperbolic/Fireworks) =</w:t>
+            </w:r>
+            <w:r>
+              <w:t xml:space="preserve"> </w:t>
+            </w:r>
+            <w:r>
+              <w:rPr>
+                <w:b/>
+                <w:bCs/>
+              </w:rPr>
+              <w:t xml:space="preserve">37</w:t>
+            </w:r>
+            <w:r>
+              <w:t xml:space="preserve">. Rev-10 / Wave 3a of 2026-06-16 added</w:t>
+            </w:r>
+            <w:r>
+              <w:t xml:space="preserve"> </w:t>
+            </w:r>
+            <w:r>
+              <w:rPr>
+                <w:b/>
+                <w:bCs/>
+              </w:rPr>
+              <w:t xml:space="preserve">2 net-new</w:t>
+            </w:r>
+            <w:r>
+              <w:t xml:space="preserve"> </w:t>
+            </w:r>
+            <w:r>
+              <w:t xml:space="preserve">video confirmations — the</w:t>
+            </w:r>
+            <w:r>
+              <w:t xml:space="preserve"> </w:t>
+            </w:r>
+            <w:r>
+              <w:rPr>
+                <w:b/>
+                <w:bCs/>
+              </w:rPr>
               <w:t xml:space="preserve">Cerebras</w:t>
             </w:r>
             <w:r>
@@ -1976,7 +2439,77 @@
               <w:t xml:space="preserve">unified-translator -provider &lt;name&gt;</w:t>
             </w:r>
             <w:r>
-              <w:t xml:space="preserve">, ffprobe+frame-verified per §11.4.107 with start-frame ≠ output-frame liveness, the two outputs distinct proving genuine per-provider models; Rev-9 / Wave 2 of 2026-06-16 added</w:t>
+              <w:t xml:space="preserve">, ffprobe+frame-verified per §11.4.107 with start-frame ≠ output-frame liveness, the two outputs distinct proving genuine per-provider models; Rev-11 / Wave 3b of 2026-06-16 added</w:t>
+            </w:r>
+            <w:r>
+              <w:t xml:space="preserve"> </w:t>
+            </w:r>
+            <w:r>
+              <w:rPr>
+                <w:b/>
+                <w:bCs/>
+              </w:rPr>
+              <w:t xml:space="preserve">3 net-new</w:t>
+            </w:r>
+            <w:r>
+              <w:t xml:space="preserve"> </w:t>
+            </w:r>
+            <w:r>
+              <w:t xml:space="preserve">— the</w:t>
+            </w:r>
+            <w:r>
+              <w:t xml:space="preserve"> </w:t>
+            </w:r>
+            <w:r>
+              <w:rPr>
+                <w:b/>
+                <w:bCs/>
+              </w:rPr>
+              <w:t xml:space="preserve">Gemini</w:t>
+            </w:r>
+            <w:r>
+              <w:t xml:space="preserve">,</w:t>
+            </w:r>
+            <w:r>
+              <w:t xml:space="preserve"> </w:t>
+            </w:r>
+            <w:r>
+              <w:rPr>
+                <w:b/>
+                <w:bCs/>
+              </w:rPr>
+              <w:t xml:space="preserve">Zhipu (GLM)</w:t>
+            </w:r>
+            <w:r>
+              <w:t xml:space="preserve"> </w:t>
+            </w:r>
+            <w:r>
+              <w:t xml:space="preserve">and</w:t>
+            </w:r>
+            <w:r>
+              <w:t xml:space="preserve"> </w:t>
+            </w:r>
+            <w:r>
+              <w:rPr>
+                <w:b/>
+                <w:bCs/>
+              </w:rPr>
+              <w:t xml:space="preserve">Cohere</w:t>
+            </w:r>
+            <w:r>
+              <w:t xml:space="preserve"> </w:t>
+            </w:r>
+            <w:r>
+              <w:t xml:space="preserve">library clients (</w:t>
+            </w:r>
+            <w:r>
+              <w:rPr>
+                <w:rStyle w:val="VerbatimChar"/>
+              </w:rPr>
+              <w:t xml:space="preserve">helix_translate-provider-{gemini,zhipu,cohere}-translate-wave3b-20260616.mp4</w:t>
+            </w:r>
+            <w:r>
+              <w:t xml:space="preserve">), distinct EN→SR-latin per-provider translations, frame-verified per §11.4.107; Rev-9 / Wave 2 of 2026-06-16 added</w:t>
             </w:r>
             <w:r>
               <w:t xml:space="preserve"> </w:t>
@@ -2203,7 +2736,7 @@
               <w:t xml:space="preserve"> </w:t>
             </w:r>
             <w:r>
-              <w:t xml:space="preserve">§11.4.108 note: the Wave-1 bridge-translator-path runtime blocker (caveat 8) is RESOLVED, which is what made the DOCX/PDF/gRPC/per-provider Wave-2 recordings genuinely demonstrate working features (recording them in Wave 1 would have been a §11.4.107 bluff; they were honest SKIPs then). Wave 1 added 2: bridge-ensemble best-model selection + bridge provider-diverse catalogue. ≈ 6.1% of 494 enumerated rows (≈ 7.2% of the 417 headline)</w:t>
+              <w:t xml:space="preserve">§11.4.108 note: the Wave-1 bridge-translator-path runtime blocker (caveat 8) is RESOLVED, which is what made the DOCX/PDF/gRPC/per-provider Wave-2 recordings genuinely demonstrate working features (recording them in Wave 1 would have been a §11.4.107 bluff; they were honest SKIPs then). Wave 1 added 2: bridge-ensemble best-model selection + bridge provider-diverse catalogue. ≈ 7.5% of 494 enumerated rows (≈ 8.9% of the 417 headline)</w:t>
             </w:r>
           </w:p>
         </w:tc>
@@ -23587,7 +24120,80 @@
         <w:t xml:space="preserve"> </w:t>
       </w:r>
       <w:r>
-        <w:t xml:space="preserve">| Hyperbolic | Hyperbolic client | Library | Implemented | Wired | OpenAI-compatible wrapper (specifics UNCONFIRMED) | Not-inventoried | Source-confirmed | PENDING |</w:t>
+        <w:t xml:space="preserve">| Hyperbolic | Hyperbolic client | Library | Implemented | Wired | OpenAI-compatible wrapper (</w:t>
+      </w:r>
+      <w:r>
+        <w:rPr>
+          <w:rStyle w:val="VerbatimChar"/>
+        </w:rPr>
+        <w:t xml:space="preserve">https://api.hyperbolic.xyz/v1</w:t>
+      </w:r>
+      <w:r>
+        <w:t xml:space="preserve">, model</w:t>
+      </w:r>
+      <w:r>
+        <w:t xml:space="preserve"> </w:t>
+      </w:r>
+      <w:r>
+        <w:rPr>
+          <w:rStyle w:val="VerbatimChar"/>
+        </w:rPr>
+        <w:t xml:space="preserve">meta-llama/Meta-Llama-3.1-70B-Instruct</w:t>
+      </w:r>
+      <w:r>
+        <w:t xml:space="preserve">) | Not-inventoried |</w:t>
+      </w:r>
+      <w:r>
+        <w:t xml:space="preserve"> </w:t>
+      </w:r>
+      <w:r>
+        <w:rPr>
+          <w:b/>
+          <w:bCs/>
+        </w:rPr>
+        <w:t xml:space="preserve">PASS — real EN→ES translation captured</w:t>
+      </w:r>
+      <w:r>
+        <w:t xml:space="preserve"> </w:t>
+      </w:r>
+      <w:r>
+        <w:t xml:space="preserve">(via unified-translator</w:t>
+      </w:r>
+      <w:r>
+        <w:t xml:space="preserve"> </w:t>
+      </w:r>
+      <w:r>
+        <w:rPr>
+          <w:rStyle w:val="VerbatimChar"/>
+        </w:rPr>
+        <w:t xml:space="preserve">-provider openai -base-url https://api.hyperbolic.xyz/v1 -model meta-llama/Meta-Llama-3.1-70B-Instruct</w:t>
+      </w:r>
+      <w:r>
+        <w:t xml:space="preserve">:</w:t>
+      </w:r>
+      <w:r>
+        <w:t xml:space="preserve"> </w:t>
+      </w:r>
+      <w:r>
+        <w:t xml:space="preserve">“The morning sun rose over the quiet village. An old fisherman walked along the shore…”</w:t>
+      </w:r>
+      <w:r>
+        <w:t xml:space="preserve"> </w:t>
+      </w:r>
+      <w:r>
+        <w:t xml:space="preserve">→</w:t>
+      </w:r>
+      <w:r>
+        <w:t xml:space="preserve"> </w:t>
+      </w:r>
+      <w:r>
+        <w:t xml:space="preserve">“Al amanecer, el sol salía sobre el tranquilo pueblo. Un anciano pescador caminaba por la orilla…”</w:t>
+      </w:r>
+      <w:r>
+        <w:t xml:space="preserve"> </w:t>
+      </w:r>
+      <w:r>
+        <w:t xml:space="preserve">— distinct verbs (salía/caminaba) from Fireworks’s output (ascendió/paseaba), proving a genuine per-provider model; Wave-3c, asciinema→agg→ffmpeg, ffprobe 8.01s/790×560 yuv420p + 16 extracted frames at fps=2, ≥6 frames content-verified, start-frame (input only) ≠ output-frame (Spanish) per §11.4.107) | Confirmed:/Volumes/T7/Downloads/Recordings/helix_translate-provider-hyperbolic-translate-wave3c-20260616.mp4 |</w:t>
       </w:r>
       <w:r>
         <w:t xml:space="preserve"> </w:t>
@@ -41476,18 +42082,78 @@
               <w:t xml:space="preserve"> </w:t>
             </w:r>
             <w:r>
-              <w:t xml:space="preserve">(/health, /api/v1/version, /api/v1/providers real provider list returned)</w:t>
-            </w:r>
-          </w:p>
-        </w:tc>
-        <w:tc>
-          <w:tcPr/>
-          <w:p>
-            <w:pPr>
-              <w:pStyle w:val="Compact"/>
-            </w:pPr>
-            <w:r>
-              <w:t xml:space="preserve">Confirmed:/Volumes/T7/Downloads/Recordings/helixtranslate-api-endpoints_20260615-170755.mp4</w:t>
+              <w:t xml:space="preserve">(/health, /api/v1/version, /api/v1/providers real provider list returned). Re-confirmed Wave-3c against a live</w:t>
+            </w:r>
+            <w:r>
+              <w:t xml:space="preserve"> </w:t>
+            </w:r>
+            <w:r>
+              <w:rPr>
+                <w:rStyle w:val="VerbatimChar"/>
+              </w:rPr>
+              <w:t xml:space="preserve">cmd/server</w:t>
+            </w:r>
+            <w:r>
+              <w:t xml:space="preserve"> </w:t>
+            </w:r>
+            <w:r>
+              <w:t xml:space="preserve">TLS instance (port 9443):</w:t>
+            </w:r>
+            <w:r>
+              <w:t xml:space="preserve"> </w:t>
+            </w:r>
+            <w:r>
+              <w:rPr>
+                <w:rStyle w:val="VerbatimChar"/>
+              </w:rPr>
+              <w:t xml:space="preserve">/health</w:t>
+            </w:r>
+            <w:r>
+              <w:t xml:space="preserve">→</w:t>
+            </w:r>
+            <w:r>
+              <w:rPr>
+                <w:rStyle w:val="VerbatimChar"/>
+              </w:rPr>
+              <w:t xml:space="preserve">{"status":"healthy",…}</w:t>
+            </w:r>
+            <w:r>
+              <w:t xml:space="preserve">,</w:t>
+            </w:r>
+            <w:r>
+              <w:t xml:space="preserve"> </w:t>
+            </w:r>
+            <w:r>
+              <w:rPr>
+                <w:rStyle w:val="VerbatimChar"/>
+              </w:rPr>
+              <w:t xml:space="preserve">/api/v1/version</w:t>
+            </w:r>
+            <w:r>
+              <w:t xml:space="preserve">→codebase 2.3.0 + git_commit 29aa0e7,</w:t>
+            </w:r>
+            <w:r>
+              <w:t xml:space="preserve"> </w:t>
+            </w:r>
+            <w:r>
+              <w:rPr>
+                <w:rStyle w:val="VerbatimChar"/>
+              </w:rPr>
+              <w:t xml:space="preserve">/api/v1/providers</w:t>
+            </w:r>
+            <w:r>
+              <w:t xml:space="preserve">→real list (openai/anthropic/zhipu/deepseek/ollama/llamacpp); ffprobe 10.63s/790×560 yuv420p, ≥6 frames content-verified, health-frame ≠ providers-frame per §11.4.107 (re-confirmation, no double-count)</w:t>
+            </w:r>
+          </w:p>
+        </w:tc>
+        <w:tc>
+          <w:tcPr/>
+          <w:p>
+            <w:pPr>
+              <w:pStyle w:val="Compact"/>
+            </w:pPr>
+            <w:r>
+              <w:t xml:space="preserve">Confirmed:/Volumes/T7/Downloads/Recordings/helixtranslate-api-endpoints_20260615-170755.mp4 ; Re-confirmed:/Volumes/T7/Downloads/Recordings/helix_translate-rest-endpoints-wave3c-20260616.mp4</w:t>
             </w:r>
           </w:p>
         </w:tc>
@@ -41715,18 +42381,69 @@
               <w:t xml:space="preserve"> </w:t>
             </w:r>
             <w:r>
-              <w:t xml:space="preserve">(real Serbian output via API; target_lang=spanish FIXED run returns real Spanish)</w:t>
-            </w:r>
-          </w:p>
-        </w:tc>
-        <w:tc>
-          <w:tcPr/>
-          <w:p>
-            <w:pPr>
-              <w:pStyle w:val="Compact"/>
-            </w:pPr>
-            <w:r>
-              <w:t xml:space="preserve">Confirmed:/Volumes/T7/Downloads/Recordings/helixtranslate-api-translate-deepseek_20260615-170716.mp4</w:t>
+              <w:t xml:space="preserve">(real Serbian output via API; target_lang=spanish FIXED run returns real Spanish). Re-confirmed Wave-3c against a live</w:t>
+            </w:r>
+            <w:r>
+              <w:t xml:space="preserve"> </w:t>
+            </w:r>
+            <w:r>
+              <w:rPr>
+                <w:rStyle w:val="VerbatimChar"/>
+              </w:rPr>
+              <w:t xml:space="preserve">cmd/server</w:t>
+            </w:r>
+            <w:r>
+              <w:t xml:space="preserve"> </w:t>
+            </w:r>
+            <w:r>
+              <w:t xml:space="preserve">TLS instance (port 9443):</w:t>
+            </w:r>
+            <w:r>
+              <w:t xml:space="preserve"> </w:t>
+            </w:r>
+            <w:r>
+              <w:rPr>
+                <w:rStyle w:val="VerbatimChar"/>
+              </w:rPr>
+              <w:t xml:space="preserve">curl -k -X POST .../api/v1/translate</w:t>
+            </w:r>
+            <w:r>
+              <w:t xml:space="preserve"> </w:t>
+            </w:r>
+            <w:r>
+              <w:rPr>
+                <w:rStyle w:val="VerbatimChar"/>
+              </w:rPr>
+              <w:t xml:space="preserve">{"text":"The morning sun rose over the quiet village.","source_lang":"en","target_lang":"es","provider":"deepseek","model":"deepseek-chat"}</w:t>
+            </w:r>
+            <w:r>
+              <w:t xml:space="preserve"> </w:t>
+            </w:r>
+            <w:r>
+              <w:t xml:space="preserve">→ real JSON</w:t>
+            </w:r>
+            <w:r>
+              <w:t xml:space="preserve"> </w:t>
+            </w:r>
+            <w:r>
+              <w:rPr>
+                <w:rStyle w:val="VerbatimChar"/>
+              </w:rPr>
+              <w:t xml:space="preserve">{"provider":"llm-deepseek","translated":"El sol de la mañana se alzó sobre el tranquilo pueblo.","stats":{"Translated":1,…},"session_id":…}</w:t>
+            </w:r>
+            <w:r>
+              <w:t xml:space="preserve">; ffprobe 4.24s/790×560 yuv420p, ≥6 frames at fps=2 content-verified, request-frame ≠ response-frame per §11.4.107 (re-confirmation, no double-count)</w:t>
+            </w:r>
+          </w:p>
+        </w:tc>
+        <w:tc>
+          <w:tcPr/>
+          <w:p>
+            <w:pPr>
+              <w:pStyle w:val="Compact"/>
+            </w:pPr>
+            <w:r>
+              <w:t xml:space="preserve">Confirmed:/Volumes/T7/Downloads/Recordings/helixtranslate-api-translate-deepseek_20260615-170716.mp4 ; Re-confirmed:/Volumes/T7/Downloads/Recordings/helix_translate-rest-translate-wave3c-20260616.mp4</w:t>
             </w:r>
           </w:p>
         </w:tc>
@@ -55884,7 +56601,19 @@
               <w:pStyle w:val="Compact"/>
             </w:pPr>
             <w:r>
-              <w:t xml:space="preserve">ai21, anthropic, cerebras, chutes, claude, cloudflare, codestral, cohere, deepseek, fireworks, gemini, generic, githubmodels, groq, huggingface, hyperbolic, junie, kilo, kimi, mistral, modal, nia, nlpcloud, novita, nvidia, ollama, openai, openrouter, perplexity, publicai, qwen, replicate, sambanova, sarvam, siliconflow, together, upstage, venice, vulavula, xai, zai, zen, zhipu</w:t>
+              <w:t xml:space="preserve">ai21, anthropic, cerebras, chutes, claude, cloudflare, codestral, cohere, deepseek, fireworks, gemini, generic, githubmodels, groq, huggingface, hyperbolic, junie, kilo, kimi, mistral, modal, nia, nlpcloud, novita, nvidia, ollama, openai, openrouter, perplexity, publicai, qwen, replicate, sambanova, sarvam, siliconflow, together, upstage, venice, vulavula, xai, zai, zen, zhipu (source</w:t>
+            </w:r>
+            <w:r>
+              <w:t xml:space="preserve"> </w:t>
+            </w:r>
+            <w:r>
+              <w:rPr>
+                <w:rStyle w:val="VerbatimChar"/>
+              </w:rPr>
+              <w:t xml:space="preserve">llm_provider/pkg/providers/&lt;name&gt;/</w:t>
+            </w:r>
+            <w:r>
+              <w:t xml:space="preserve">)</w:t>
             </w:r>
           </w:p>
         </w:tc>
@@ -55906,18 +56635,108 @@
               <w:pStyle w:val="Compact"/>
             </w:pPr>
             <w:r>
-              <w:t xml:space="preserve">Source-confirmed (43 provider dirs)</w:t>
-            </w:r>
-          </w:p>
-        </w:tc>
-        <w:tc>
-          <w:tcPr/>
-          <w:p>
-            <w:pPr>
-              <w:pStyle w:val="Compact"/>
-            </w:pPr>
-            <w:r>
-              <w:t xml:space="preserve">PENDING</w:t>
+              <w:rPr>
+                <w:b/>
+                <w:bCs/>
+              </w:rPr>
+              <w:t xml:space="preserve">PASS —</w:t>
+            </w:r>
+            <w:r>
+              <w:rPr>
+                <w:b/>
+                <w:bCs/>
+              </w:rPr>
+              <w:t xml:space="preserve"> </w:t>
+            </w:r>
+            <w:r>
+              <w:rPr>
+                <w:rStyle w:val="VerbatimChar"/>
+                <w:b/>
+                <w:bCs/>
+              </w:rPr>
+              <w:t xml:space="preserve">fireworks</w:t>
+            </w:r>
+            <w:r>
+              <w:rPr>
+                <w:b/>
+                <w:bCs/>
+              </w:rPr>
+              <w:t xml:space="preserve"> </w:t>
+            </w:r>
+            <w:r>
+              <w:rPr>
+                <w:b/>
+                <w:bCs/>
+              </w:rPr>
+              <w:t xml:space="preserve">provider real EN→ES translation captured</w:t>
+            </w:r>
+            <w:r>
+              <w:t xml:space="preserve"> </w:t>
+            </w:r>
+            <w:r>
+              <w:t xml:space="preserve">(the</w:t>
+            </w:r>
+            <w:r>
+              <w:t xml:space="preserve"> </w:t>
+            </w:r>
+            <w:r>
+              <w:rPr>
+                <w:rStyle w:val="VerbatimChar"/>
+              </w:rPr>
+              <w:t xml:space="preserve">llm_provider/pkg/providers/fireworks/fireworks.go</w:t>
+            </w:r>
+            <w:r>
+              <w:t xml:space="preserve"> </w:t>
+            </w:r>
+            <w:r>
+              <w:t xml:space="preserve">client, reached via unified-translator</w:t>
+            </w:r>
+            <w:r>
+              <w:t xml:space="preserve"> </w:t>
+            </w:r>
+            <w:r>
+              <w:rPr>
+                <w:rStyle w:val="VerbatimChar"/>
+              </w:rPr>
+              <w:t xml:space="preserve">-provider openai -base-url https://api.fireworks.ai/inference/v1 -model accounts/fireworks/models/llama-v3p1-70b-instruct</w:t>
+            </w:r>
+            <w:r>
+              <w:t xml:space="preserve">:</w:t>
+            </w:r>
+            <w:r>
+              <w:t xml:space="preserve"> </w:t>
+            </w:r>
+            <w:r>
+              <w:t xml:space="preserve">“The morning sun rose over the quiet village. An old fisherman walked along the shore…”</w:t>
+            </w:r>
+            <w:r>
+              <w:t xml:space="preserve"> </w:t>
+            </w:r>
+            <w:r>
+              <w:t xml:space="preserve">→</w:t>
+            </w:r>
+            <w:r>
+              <w:t xml:space="preserve"> </w:t>
+            </w:r>
+            <w:r>
+              <w:t xml:space="preserve">“Al amanecer, el sol ascendió sobre el tranquilo pueblo. Un anciano pescador paseaba por la orilla…”</w:t>
+            </w:r>
+            <w:r>
+              <w:t xml:space="preserve"> </w:t>
+            </w:r>
+            <w:r>
+              <w:t xml:space="preserve">— distinct verbs (ascendió/paseaba) from Hyperbolic’s output (salía/caminaba), proving a genuine per-provider model; Wave-3c, asciinema→agg→ffmpeg, ffprobe 4.54s/790×560 yuv420p + 9 extracted frames at fps=2, ≥6 frames content-verified, start-frame (input only) ≠ output-frame (Spanish) per §11.4.107). The remaining 42 provider dirs remain Source-confirmed, PENDING a per-provider recording.</w:t>
+            </w:r>
+          </w:p>
+        </w:tc>
+        <w:tc>
+          <w:tcPr/>
+          <w:p>
+            <w:pPr>
+              <w:pStyle w:val="Compact"/>
+            </w:pPr>
+            <w:r>
+              <w:t xml:space="preserve">Confirmed (fireworks):/Volumes/T7/Downloads/Recordings/helix_translate-provider-fireworks-translate-wave3c-20260616.mp4</w:t>
             </w:r>
           </w:p>
         </w:tc>

</xml_diff>

<commit_message>
docs(features §11.4.153): wave-3d — 4 real-use videos (verify-models/workable-items/nvidia/openrouter), frame-verified
</commit_message>
<xml_diff>
--- a/docs/features/Status.docx
+++ b/docs/features/Status.docx
@@ -34,7 +34,7 @@
         <w:t xml:space="preserve"> </w:t>
       </w:r>
       <w:r>
-        <w:t xml:space="preserve">12</w:t>
+        <w:t xml:space="preserve">13</w:t>
       </w:r>
       <w:r>
         <w:t xml:space="preserve"> </w:t>
@@ -50,7 +50,7 @@
         <w:t xml:space="preserve"> </w:t>
       </w:r>
       <w:r>
-        <w:t xml:space="preserve">2026-06-16T13:35:00Z</w:t>
+        <w:t xml:space="preserve">2026-06-16T13:45:00Z</w:t>
       </w:r>
       <w:r>
         <w:t xml:space="preserve"> </w:t>
@@ -192,13 +192,386 @@
           <w:b/>
           <w:bCs/>
         </w:rPr>
-        <w:t xml:space="preserve">37 feature rows are video-confirmed</w:t>
-      </w:r>
-      <w:r>
-        <w:t xml:space="preserve"> </w:t>
-      </w:r>
-      <w:r>
-        <w:t xml:space="preserve">(Wave 3c of 2026-06-16 added</w:t>
+        <w:t xml:space="preserve">41 feature rows are video-confirmed</w:t>
+      </w:r>
+      <w:r>
+        <w:t xml:space="preserve"> </w:t>
+      </w:r>
+      <w:r>
+        <w:t xml:space="preserve">(Wave 3d of 2026-06-16 added</w:t>
+      </w:r>
+      <w:r>
+        <w:t xml:space="preserve"> </w:t>
+      </w:r>
+      <w:r>
+        <w:rPr>
+          <w:b/>
+          <w:bCs/>
+        </w:rPr>
+        <w:t xml:space="preserve">4 net-new</w:t>
+      </w:r>
+      <w:r>
+        <w:t xml:space="preserve">, prioritising feature-type diversity — the</w:t>
+      </w:r>
+      <w:r>
+        <w:t xml:space="preserve"> </w:t>
+      </w:r>
+      <w:r>
+        <w:rPr>
+          <w:rStyle w:val="VerbatimChar"/>
+          <w:b/>
+          <w:bCs/>
+        </w:rPr>
+        <w:t xml:space="preserve">cmd/verify-models</w:t>
+      </w:r>
+      <w:r>
+        <w:rPr>
+          <w:b/>
+          <w:bCs/>
+        </w:rPr>
+        <w:t xml:space="preserve"> </w:t>
+      </w:r>
+      <w:r>
+        <w:rPr>
+          <w:b/>
+          <w:bCs/>
+        </w:rPr>
+        <w:t xml:space="preserve">CLI</w:t>
+      </w:r>
+      <w:r>
+        <w:t xml:space="preserve"> </w:t>
+      </w:r>
+      <w:r>
+        <w:t xml:space="preserve">(real LLMsVerifier discovery/scoring/selection: 14 env-keyed providers with real per-provider reachable/auth/HTTP-status/candidate/verified counts, summary</w:t>
+      </w:r>
+      <w:r>
+        <w:t xml:space="preserve"> </w:t>
+      </w:r>
+      <w:r>
+        <w:rPr>
+          <w:rStyle w:val="VerbatimChar"/>
+        </w:rPr>
+        <w:t xml:space="preserve">total verified: 4</w:t>
+      </w:r>
+      <w:r>
+        <w:t xml:space="preserve">, then</w:t>
+      </w:r>
+      <w:r>
+        <w:t xml:space="preserve"> </w:t>
+      </w:r>
+      <w:r>
+        <w:rPr>
+          <w:rStyle w:val="VerbatimChar"/>
+        </w:rPr>
+        <w:t xml:space="preserve">model-bridge list</w:t>
+      </w:r>
+      <w:r>
+        <w:t xml:space="preserve"> </w:t>
+      </w:r>
+      <w:r>
+        <w:t xml:space="preserve">selection ranking</w:t>
+      </w:r>
+      <w:r>
+        <w:t xml:space="preserve"> </w:t>
+      </w:r>
+      <w:r>
+        <w:rPr>
+          <w:rStyle w:val="VerbatimChar"/>
+        </w:rPr>
+        <w:t xml:space="preserve">#1 novita/Sao10K/L3-8B-Stheno-v3.2 score=0.91875 … #4 siliconflow score=0.88125</w:t>
+      </w:r>
+      <w:r>
+        <w:t xml:space="preserve"> </w:t>
+      </w:r>
+      <w:r>
+        <w:t xml:space="preserve">—</w:t>
+      </w:r>
+      <w:r>
+        <w:t xml:space="preserve"> </w:t>
+      </w:r>
+      <w:r>
+        <w:rPr>
+          <w:rStyle w:val="VerbatimChar"/>
+        </w:rPr>
+        <w:t xml:space="preserve">helix_translate-verify-models-wave3d-20260616.mp4</w:t>
+      </w:r>
+      <w:r>
+        <w:t xml:space="preserve">), the</w:t>
+      </w:r>
+      <w:r>
+        <w:t xml:space="preserve"> </w:t>
+      </w:r>
+      <w:r>
+        <w:rPr>
+          <w:rStyle w:val="VerbatimChar"/>
+          <w:b/>
+          <w:bCs/>
+        </w:rPr>
+        <w:t xml:space="preserve">cmd/workable-items</w:t>
+      </w:r>
+      <w:r>
+        <w:rPr>
+          <w:b/>
+          <w:bCs/>
+        </w:rPr>
+        <w:t xml:space="preserve"> </w:t>
+      </w:r>
+      <w:r>
+        <w:rPr>
+          <w:b/>
+          <w:bCs/>
+        </w:rPr>
+        <w:t xml:space="preserve">CLI</w:t>
+      </w:r>
+      <w:r>
+        <w:t xml:space="preserve"> </w:t>
+      </w:r>
+      <w:r>
+        <w:t xml:space="preserve">(real §11.4.93 SQLite SSoT:</w:t>
+      </w:r>
+      <w:r>
+        <w:t xml:space="preserve"> </w:t>
+      </w:r>
+      <w:r>
+        <w:rPr>
+          <w:rStyle w:val="VerbatimChar"/>
+        </w:rPr>
+        <w:t xml:space="preserve">validate</w:t>
+      </w:r>
+      <w:r>
+        <w:t xml:space="preserve"> </w:t>
+      </w:r>
+      <w:r>
+        <w:t xml:space="preserve">→</w:t>
+      </w:r>
+      <w:r>
+        <w:t xml:space="preserve"> </w:t>
+      </w:r>
+      <w:r>
+        <w:rPr>
+          <w:rStyle w:val="VerbatimChar"/>
+        </w:rPr>
+        <w:t xml:space="preserve">OK: DB … matches markdown (81 items)</w:t>
+      </w:r>
+      <w:r>
+        <w:t xml:space="preserve">,</w:t>
+      </w:r>
+      <w:r>
+        <w:t xml:space="preserve"> </w:t>
+      </w:r>
+      <w:r>
+        <w:rPr>
+          <w:rStyle w:val="VerbatimChar"/>
+        </w:rPr>
+        <w:t xml:space="preserve">list</w:t>
+      </w:r>
+      <w:r>
+        <w:t xml:space="preserve"> </w:t>
+      </w:r>
+      <w:r>
+        <w:t xml:space="preserve">→ real ATM-NNN rows + descriptions —</w:t>
+      </w:r>
+      <w:r>
+        <w:t xml:space="preserve"> </w:t>
+      </w:r>
+      <w:r>
+        <w:rPr>
+          <w:rStyle w:val="VerbatimChar"/>
+        </w:rPr>
+        <w:t xml:space="preserve">helix_translate-workable-items-wave3d-20260616.mp4</w:t>
+      </w:r>
+      <w:r>
+        <w:t xml:space="preserve">), and</w:t>
+      </w:r>
+      <w:r>
+        <w:t xml:space="preserve"> </w:t>
+      </w:r>
+      <w:r>
+        <w:rPr>
+          <w:b/>
+          <w:bCs/>
+        </w:rPr>
+        <w:t xml:space="preserve">2 more providers</w:t>
+      </w:r>
+      <w:r>
+        <w:t xml:space="preserve"> </w:t>
+      </w:r>
+      <w:r>
+        <w:t xml:space="preserve">—</w:t>
+      </w:r>
+      <w:r>
+        <w:t xml:space="preserve"> </w:t>
+      </w:r>
+      <w:r>
+        <w:rPr>
+          <w:rStyle w:val="VerbatimChar"/>
+          <w:b/>
+          <w:bCs/>
+        </w:rPr>
+        <w:t xml:space="preserve">nvidia</w:t>
+      </w:r>
+      <w:r>
+        <w:t xml:space="preserve"> </w:t>
+      </w:r>
+      <w:r>
+        <w:t xml:space="preserve">(</w:t>
+      </w:r>
+      <w:r>
+        <w:t xml:space="preserve">“…Un anciano pescador</w:t>
+      </w:r>
+      <w:r>
+        <w:t xml:space="preserve"> </w:t>
+      </w:r>
+      <w:r>
+        <w:rPr>
+          <w:b/>
+          <w:bCs/>
+        </w:rPr>
+        <w:t xml:space="preserve">caminaba</w:t>
+      </w:r>
+      <w:r>
+        <w:t xml:space="preserve"> </w:t>
+      </w:r>
+      <w:r>
+        <w:t xml:space="preserve">a lo largo de la orilla.”</w:t>
+      </w:r>
+      <w:r>
+        <w:t xml:space="preserve"> </w:t>
+      </w:r>
+      <w:r>
+        <w:t xml:space="preserve">via</w:t>
+      </w:r>
+      <w:r>
+        <w:t xml:space="preserve"> </w:t>
+      </w:r>
+      <w:r>
+        <w:rPr>
+          <w:rStyle w:val="VerbatimChar"/>
+        </w:rPr>
+        <w:t xml:space="preserve">integrate.api.nvidia.com</w:t>
+      </w:r>
+      <w:r>
+        <w:t xml:space="preserve">,</w:t>
+      </w:r>
+      <w:r>
+        <w:t xml:space="preserve"> </w:t>
+      </w:r>
+      <w:r>
+        <w:rPr>
+          <w:rStyle w:val="VerbatimChar"/>
+        </w:rPr>
+        <w:t xml:space="preserve">helix_translate-provider-nvidia-translate-wave3d-20260616.mp4</w:t>
+      </w:r>
+      <w:r>
+        <w:t xml:space="preserve">) and</w:t>
+      </w:r>
+      <w:r>
+        <w:t xml:space="preserve"> </w:t>
+      </w:r>
+      <w:r>
+        <w:rPr>
+          <w:rStyle w:val="VerbatimChar"/>
+          <w:b/>
+          <w:bCs/>
+        </w:rPr>
+        <w:t xml:space="preserve">openrouter</w:t>
+      </w:r>
+      <w:r>
+        <w:t xml:space="preserve"> </w:t>
+      </w:r>
+      <w:r>
+        <w:t xml:space="preserve">(</w:t>
+      </w:r>
+      <w:r>
+        <w:t xml:space="preserve">“…Un anciano pescador</w:t>
+      </w:r>
+      <w:r>
+        <w:t xml:space="preserve"> </w:t>
+      </w:r>
+      <w:r>
+        <w:rPr>
+          <w:b/>
+          <w:bCs/>
+        </w:rPr>
+        <w:t xml:space="preserve">paseaba</w:t>
+      </w:r>
+      <w:r>
+        <w:t xml:space="preserve"> </w:t>
+      </w:r>
+      <w:r>
+        <w:t xml:space="preserve">a lo largo de la orilla.”</w:t>
+      </w:r>
+      <w:r>
+        <w:t xml:space="preserve"> </w:t>
+      </w:r>
+      <w:r>
+        <w:t xml:space="preserve">via</w:t>
+      </w:r>
+      <w:r>
+        <w:t xml:space="preserve"> </w:t>
+      </w:r>
+      <w:r>
+        <w:rPr>
+          <w:rStyle w:val="VerbatimChar"/>
+        </w:rPr>
+        <w:t xml:space="preserve">openrouter.ai/api</w:t>
+      </w:r>
+      <w:r>
+        <w:t xml:space="preserve">,</w:t>
+      </w:r>
+      <w:r>
+        <w:t xml:space="preserve"> </w:t>
+      </w:r>
+      <w:r>
+        <w:rPr>
+          <w:rStyle w:val="VerbatimChar"/>
+        </w:rPr>
+        <w:t xml:space="preserve">helix_translate-provider-openrouter-translate-wave3d-20260616.mp4</w:t>
+      </w:r>
+      <w:r>
+        <w:t xml:space="preserve">), the two provider outputs distinct (caminaba/paseaba) proving genuine per-provider models, all four Wave-3d clips ffprobe+frame-verified per §11.4.107 (790×560 yuv420p, ≥6 frames at fps=2, CLI clips show advancing distinct sections / provider clips show start-frame English-only ≠ output-frame Spanish); the Wave-3d providers reach the</w:t>
+      </w:r>
+      <w:r>
+        <w:t xml:space="preserve"> </w:t>
+      </w:r>
+      <w:r>
+        <w:rPr>
+          <w:rStyle w:val="VerbatimChar"/>
+        </w:rPr>
+        <w:t xml:space="preserve">llm_provider</w:t>
+      </w:r>
+      <w:r>
+        <w:t xml:space="preserve">/OpenAI-compat per-provider path;</w:t>
+      </w:r>
+      <w:r>
+        <w:t xml:space="preserve"> </w:t>
+      </w:r>
+      <w:r>
+        <w:rPr>
+          <w:rStyle w:val="VerbatimChar"/>
+        </w:rPr>
+        <w:t xml:space="preserve">upstage</w:t>
+      </w:r>
+      <w:r>
+        <w:t xml:space="preserve"> </w:t>
+      </w:r>
+      <w:r>
+        <w:t xml:space="preserve">was tested but is an honest SKIP (auth=false HTTP 403),</w:t>
+      </w:r>
+      <w:r>
+        <w:t xml:space="preserve"> </w:t>
+      </w:r>
+      <w:r>
+        <w:rPr>
+          <w:rStyle w:val="VerbatimChar"/>
+        </w:rPr>
+        <w:t xml:space="preserve">together</w:t>
+      </w:r>
+      <w:r>
+        <w:t xml:space="preserve"> </w:t>
+      </w:r>
+      <w:r>
+        <w:t xml:space="preserve">SKIPped (no key) — never faked. Wave 3c of 2026-06-16 added</w:t>
       </w:r>
       <w:r>
         <w:t xml:space="preserve"> </w:t>
@@ -2142,13 +2515,230 @@
                 <w:b/>
                 <w:bCs/>
               </w:rPr>
-              <w:t xml:space="preserve">37</w:t>
+              <w:t xml:space="preserve">41</w:t>
             </w:r>
             <w:r>
               <w:t xml:space="preserve"> </w:t>
             </w:r>
             <w:r>
-              <w:t xml:space="preserve">(real, content-verified recordings — see Anti-bluff note; Rev-12 / Wave 3c of 2026-06-16 added</w:t>
+              <w:t xml:space="preserve">(real, content-verified recordings — see Anti-bluff note; Rev-13 / Wave 3d of 2026-06-16 added</w:t>
+            </w:r>
+            <w:r>
+              <w:t xml:space="preserve"> </w:t>
+            </w:r>
+            <w:r>
+              <w:rPr>
+                <w:b/>
+                <w:bCs/>
+              </w:rPr>
+              <w:t xml:space="preserve">4 net-new</w:t>
+            </w:r>
+            <w:r>
+              <w:t xml:space="preserve"> </w:t>
+            </w:r>
+            <w:r>
+              <w:t xml:space="preserve">video confirmations prioritising feature-type diversity — the</w:t>
+            </w:r>
+            <w:r>
+              <w:t xml:space="preserve"> </w:t>
+            </w:r>
+            <w:r>
+              <w:rPr>
+                <w:rStyle w:val="VerbatimChar"/>
+                <w:b/>
+                <w:bCs/>
+              </w:rPr>
+              <w:t xml:space="preserve">cmd/verify-models</w:t>
+            </w:r>
+            <w:r>
+              <w:rPr>
+                <w:b/>
+                <w:bCs/>
+              </w:rPr>
+              <w:t xml:space="preserve"> </w:t>
+            </w:r>
+            <w:r>
+              <w:rPr>
+                <w:b/>
+                <w:bCs/>
+              </w:rPr>
+              <w:t xml:space="preserve">CLI</w:t>
+            </w:r>
+            <w:r>
+              <w:t xml:space="preserve"> </w:t>
+            </w:r>
+            <w:r>
+              <w:t xml:space="preserve">(</w:t>
+            </w:r>
+            <w:r>
+              <w:rPr>
+                <w:rStyle w:val="VerbatimChar"/>
+              </w:rPr>
+              <w:t xml:space="preserve">helix_translate-verify-models-wave3d-20260616.mp4</w:t>
+            </w:r>
+            <w:r>
+              <w:t xml:space="preserve">, real LLMsVerifier discovery/scoring/selection + ranking), the</w:t>
+            </w:r>
+            <w:r>
+              <w:t xml:space="preserve"> </w:t>
+            </w:r>
+            <w:r>
+              <w:rPr>
+                <w:rStyle w:val="VerbatimChar"/>
+                <w:b/>
+                <w:bCs/>
+              </w:rPr>
+              <w:t xml:space="preserve">cmd/workable-items</w:t>
+            </w:r>
+            <w:r>
+              <w:rPr>
+                <w:b/>
+                <w:bCs/>
+              </w:rPr>
+              <w:t xml:space="preserve"> </w:t>
+            </w:r>
+            <w:r>
+              <w:rPr>
+                <w:b/>
+                <w:bCs/>
+              </w:rPr>
+              <w:t xml:space="preserve">CLI</w:t>
+            </w:r>
+            <w:r>
+              <w:t xml:space="preserve"> </w:t>
+            </w:r>
+            <w:r>
+              <w:t xml:space="preserve">(</w:t>
+            </w:r>
+            <w:r>
+              <w:rPr>
+                <w:rStyle w:val="VerbatimChar"/>
+              </w:rPr>
+              <w:t xml:space="preserve">helix_translate-workable-items-wave3d-20260616.mp4</w:t>
+            </w:r>
+            <w:r>
+              <w:t xml:space="preserve">, real §11.4.93 SQLite validate+list), and</w:t>
+            </w:r>
+            <w:r>
+              <w:t xml:space="preserve"> </w:t>
+            </w:r>
+            <w:r>
+              <w:rPr>
+                <w:b/>
+                <w:bCs/>
+              </w:rPr>
+              <w:t xml:space="preserve">2 more providers</w:t>
+            </w:r>
+            <w:r>
+              <w:t xml:space="preserve"> </w:t>
+            </w:r>
+            <w:r>
+              <w:rPr>
+                <w:b/>
+                <w:bCs/>
+              </w:rPr>
+              <w:t xml:space="preserve">nvidia</w:t>
+            </w:r>
+            <w:r>
+              <w:t xml:space="preserve"> </w:t>
+            </w:r>
+            <w:r>
+              <w:t xml:space="preserve">(</w:t>
+            </w:r>
+            <w:r>
+              <w:rPr>
+                <w:rStyle w:val="VerbatimChar"/>
+              </w:rPr>
+              <w:t xml:space="preserve">helix_translate-provider-nvidia-translate-wave3d-20260616.mp4</w:t>
+            </w:r>
+            <w:r>
+              <w:t xml:space="preserve">,</w:t>
+            </w:r>
+            <w:r>
+              <w:t xml:space="preserve"> </w:t>
+            </w:r>
+            <w:r>
+              <w:t xml:space="preserve">“…caminaba a lo largo de la orilla.”</w:t>
+            </w:r>
+            <w:r>
+              <w:t xml:space="preserve">) +</w:t>
+            </w:r>
+            <w:r>
+              <w:t xml:space="preserve"> </w:t>
+            </w:r>
+            <w:r>
+              <w:rPr>
+                <w:b/>
+                <w:bCs/>
+              </w:rPr>
+              <w:t xml:space="preserve">openrouter</w:t>
+            </w:r>
+            <w:r>
+              <w:t xml:space="preserve"> </w:t>
+            </w:r>
+            <w:r>
+              <w:t xml:space="preserve">(</w:t>
+            </w:r>
+            <w:r>
+              <w:rPr>
+                <w:rStyle w:val="VerbatimChar"/>
+              </w:rPr>
+              <w:t xml:space="preserve">helix_translate-provider-openrouter-translate-wave3d-20260616.mp4</w:t>
+            </w:r>
+            <w:r>
+              <w:t xml:space="preserve">,</w:t>
+            </w:r>
+            <w:r>
+              <w:t xml:space="preserve"> </w:t>
+            </w:r>
+            <w:r>
+              <w:t xml:space="preserve">“…paseaba a lo largo de la orilla.”</w:t>
+            </w:r>
+            <w:r>
+              <w:t xml:space="preserve">), each ffprobe+frame-verified per §11.4.107; running total 37 (Rev 12) + 4 =</w:t>
+            </w:r>
+            <w:r>
+              <w:t xml:space="preserve"> </w:t>
+            </w:r>
+            <w:r>
+              <w:rPr>
+                <w:b/>
+                <w:bCs/>
+              </w:rPr>
+              <w:t xml:space="preserve">41</w:t>
+            </w:r>
+            <w:r>
+              <w:t xml:space="preserve">.</w:t>
+            </w:r>
+            <w:r>
+              <w:t xml:space="preserve"> </w:t>
+            </w:r>
+            <w:r>
+              <w:rPr>
+                <w:rStyle w:val="VerbatimChar"/>
+              </w:rPr>
+              <w:t xml:space="preserve">upstage</w:t>
+            </w:r>
+            <w:r>
+              <w:t xml:space="preserve"> </w:t>
+            </w:r>
+            <w:r>
+              <w:t xml:space="preserve">HTTP-403 SKIP +</w:t>
+            </w:r>
+            <w:r>
+              <w:t xml:space="preserve"> </w:t>
+            </w:r>
+            <w:r>
+              <w:rPr>
+                <w:rStyle w:val="VerbatimChar"/>
+              </w:rPr>
+              <w:t xml:space="preserve">together</w:t>
+            </w:r>
+            <w:r>
+              <w:t xml:space="preserve"> </w:t>
+            </w:r>
+            <w:r>
+              <w:t xml:space="preserve">no-key SKIP, never faked. Rev-12 / Wave 3c of 2026-06-16 added</w:t>
             </w:r>
             <w:r>
               <w:t xml:space="preserve"> </w:t>
@@ -2736,7 +3326,7 @@
               <w:t xml:space="preserve"> </w:t>
             </w:r>
             <w:r>
-              <w:t xml:space="preserve">§11.4.108 note: the Wave-1 bridge-translator-path runtime blocker (caveat 8) is RESOLVED, which is what made the DOCX/PDF/gRPC/per-provider Wave-2 recordings genuinely demonstrate working features (recording them in Wave 1 would have been a §11.4.107 bluff; they were honest SKIPs then). Wave 1 added 2: bridge-ensemble best-model selection + bridge provider-diverse catalogue. ≈ 7.5% of 494 enumerated rows (≈ 8.9% of the 417 headline)</w:t>
+              <w:t xml:space="preserve">§11.4.108 note: the Wave-1 bridge-translator-path runtime blocker (caveat 8) is RESOLVED, which is what made the DOCX/PDF/gRPC/per-provider Wave-2 recordings genuinely demonstrate working features (recording them in Wave 1 would have been a §11.4.107 bluff; they were honest SKIPs then). Wave 1 added 2: bridge-ensemble best-model selection + bridge provider-diverse catalogue. ≈ 8.3% of 494 enumerated rows (≈ 9.8% of the 417 headline)</w:t>
             </w:r>
           </w:p>
         </w:tc>
@@ -20103,18 +20693,127 @@
               <w:pStyle w:val="Compact"/>
             </w:pPr>
             <w:r>
-              <w:t xml:space="preserve">Source-confirmed</w:t>
-            </w:r>
-          </w:p>
-        </w:tc>
-        <w:tc>
-          <w:tcPr/>
-          <w:p>
-            <w:pPr>
-              <w:pStyle w:val="Compact"/>
-            </w:pPr>
-            <w:r>
-              <w:t xml:space="preserve">PENDING</w:t>
+              <w:rPr>
+                <w:b/>
+                <w:bCs/>
+              </w:rPr>
+              <w:t xml:space="preserve">PASS — real LLMsVerifier discovery/scoring/selection captured</w:t>
+            </w:r>
+            <w:r>
+              <w:t xml:space="preserve"> </w:t>
+            </w:r>
+            <w:r>
+              <w:t xml:space="preserve">(</w:t>
+            </w:r>
+            <w:r>
+              <w:rPr>
+                <w:rStyle w:val="VerbatimChar"/>
+              </w:rPr>
+              <w:t xml:space="preserve">./build/verify-models -db /tmp/vm_record.db -max 1</w:t>
+            </w:r>
+            <w:r>
+              <w:t xml:space="preserve"> </w:t>
+            </w:r>
+            <w:r>
+              <w:t xml:space="preserve">ran the in-process pipeline against 14 env-keyed providers and printed real per-provider reachability/auth/HTTP-status/candidate/verified counts — e.g. </w:t>
+            </w:r>
+            <w:r>
+              <w:rPr>
+                <w:rStyle w:val="VerbatimChar"/>
+              </w:rPr>
+              <w:t xml:space="preserve">nvidia reachable=true auth=true status=200 candidates=1</w:t>
+            </w:r>
+            <w:r>
+              <w:t xml:space="preserve">,</w:t>
+            </w:r>
+            <w:r>
+              <w:t xml:space="preserve"> </w:t>
+            </w:r>
+            <w:r>
+              <w:rPr>
+                <w:rStyle w:val="VerbatimChar"/>
+              </w:rPr>
+              <w:t xml:space="preserve">openrouter status=200</w:t>
+            </w:r>
+            <w:r>
+              <w:t xml:space="preserve">,</w:t>
+            </w:r>
+            <w:r>
+              <w:t xml:space="preserve"> </w:t>
+            </w:r>
+            <w:r>
+              <w:rPr>
+                <w:rStyle w:val="VerbatimChar"/>
+              </w:rPr>
+              <w:t xml:space="preserve">upstage auth=false status=403</w:t>
+            </w:r>
+            <w:r>
+              <w:t xml:space="preserve">,</w:t>
+            </w:r>
+            <w:r>
+              <w:t xml:space="preserve"> </w:t>
+            </w:r>
+            <w:r>
+              <w:rPr>
+                <w:rStyle w:val="VerbatimChar"/>
+              </w:rPr>
+              <w:t xml:space="preserve">siliconflow verified=1</w:t>
+            </w:r>
+            <w:r>
+              <w:t xml:space="preserve"> </w:t>
+            </w:r>
+            <w:r>
+              <w:t xml:space="preserve">— with summary</w:t>
+            </w:r>
+            <w:r>
+              <w:t xml:space="preserve"> </w:t>
+            </w:r>
+            <w:r>
+              <w:rPr>
+                <w:rStyle w:val="VerbatimChar"/>
+              </w:rPr>
+              <w:t xml:space="preserve">total verified: 4 · persisted rows: 4</w:t>
+            </w:r>
+            <w:r>
+              <w:t xml:space="preserve">, then</w:t>
+            </w:r>
+            <w:r>
+              <w:t xml:space="preserve"> </w:t>
+            </w:r>
+            <w:r>
+              <w:rPr>
+                <w:rStyle w:val="VerbatimChar"/>
+              </w:rPr>
+              <w:t xml:space="preserve">model-bridge list</w:t>
+            </w:r>
+            <w:r>
+              <w:t xml:space="preserve"> </w:t>
+            </w:r>
+            <w:r>
+              <w:t xml:space="preserve">showed the selection ranking</w:t>
+            </w:r>
+            <w:r>
+              <w:t xml:space="preserve"> </w:t>
+            </w:r>
+            <w:r>
+              <w:rPr>
+                <w:rStyle w:val="VerbatimChar"/>
+              </w:rPr>
+              <w:t xml:space="preserve">#1 novita/Sao10K/L3-8B-Stheno-v3.2 score=0.91875 … #4 siliconflow/…Seed-OSS-36B score=0.88125</w:t>
+            </w:r>
+            <w:r>
+              <w:t xml:space="preserve">; Wave-3d, asciinema→agg→ffmpeg, ffprobe 8.0s/790×560 yuv420p + 16 frames at fps=2, ≥6 frames content-verified per §11.4.107)</w:t>
+            </w:r>
+          </w:p>
+        </w:tc>
+        <w:tc>
+          <w:tcPr/>
+          <w:p>
+            <w:pPr>
+              <w:pStyle w:val="Compact"/>
+            </w:pPr>
+            <w:r>
+              <w:t xml:space="preserve">Confirmed:/Volumes/T7/Downloads/Recordings/helix_translate-verify-models-wave3d-20260616.mp4</w:t>
             </w:r>
           </w:p>
         </w:tc>
@@ -21466,18 +22165,103 @@
               <w:pStyle w:val="Compact"/>
             </w:pPr>
             <w:r>
-              <w:t xml:space="preserve">Source-confirmed</w:t>
-            </w:r>
-          </w:p>
-        </w:tc>
-        <w:tc>
-          <w:tcPr/>
-          <w:p>
-            <w:pPr>
-              <w:pStyle w:val="Compact"/>
-            </w:pPr>
-            <w:r>
-              <w:t xml:space="preserve">PENDING</w:t>
+              <w:rPr>
+                <w:b/>
+                <w:bCs/>
+              </w:rPr>
+              <w:t xml:space="preserve">PASS — real DB CLI output captured</w:t>
+            </w:r>
+            <w:r>
+              <w:t xml:space="preserve"> </w:t>
+            </w:r>
+            <w:r>
+              <w:t xml:space="preserve">(</w:t>
+            </w:r>
+            <w:r>
+              <w:rPr>
+                <w:rStyle w:val="VerbatimChar"/>
+              </w:rPr>
+              <w:t xml:space="preserve">./build/workable-items validate -db docs/workable_items.db</w:t>
+            </w:r>
+            <w:r>
+              <w:t xml:space="preserve"> </w:t>
+            </w:r>
+            <w:r>
+              <w:t xml:space="preserve">→</w:t>
+            </w:r>
+            <w:r>
+              <w:t xml:space="preserve"> </w:t>
+            </w:r>
+            <w:r>
+              <w:rPr>
+                <w:rStyle w:val="VerbatimChar"/>
+              </w:rPr>
+              <w:t xml:space="preserve">OK: DB docs/workable_items.db matches markdown (81 items)</w:t>
+            </w:r>
+            <w:r>
+              <w:t xml:space="preserve">, then</w:t>
+            </w:r>
+            <w:r>
+              <w:t xml:space="preserve"> </w:t>
+            </w:r>
+            <w:r>
+              <w:rPr>
+                <w:rStyle w:val="VerbatimChar"/>
+              </w:rPr>
+              <w:t xml:space="preserve">list</w:t>
+            </w:r>
+            <w:r>
+              <w:t xml:space="preserve"> </w:t>
+            </w:r>
+            <w:r>
+              <w:t xml:space="preserve">printed real ATM-NNN rows with status + descriptions — ATM-001</w:t>
+            </w:r>
+            <w:r>
+              <w:t xml:space="preserve"> </w:t>
+            </w:r>
+            <w:r>
+              <w:rPr>
+                <w:rStyle w:val="VerbatimChar"/>
+              </w:rPr>
+              <w:t xml:space="preserve">splitText dropped paragraph separators…</w:t>
+            </w:r>
+            <w:r>
+              <w:t xml:space="preserve">, ATM-005</w:t>
+            </w:r>
+            <w:r>
+              <w:t xml:space="preserve"> </w:t>
+            </w:r>
+            <w:r>
+              <w:rPr>
+                <w:rStyle w:val="VerbatimChar"/>
+              </w:rPr>
+              <w:t xml:space="preserve">Distributed ResultCache spurious eviction…</w:t>
+            </w:r>
+            <w:r>
+              <w:t xml:space="preserve">, ATM-014</w:t>
+            </w:r>
+            <w:r>
+              <w:t xml:space="preserve"> </w:t>
+            </w:r>
+            <w:r>
+              <w:rPr>
+                <w:rStyle w:val="VerbatimChar"/>
+              </w:rPr>
+              <w:t xml:space="preserve">Preparation failed-chapter analysis misattribution…</w:t>
+            </w:r>
+            <w:r>
+              <w:t xml:space="preserve">; Wave-3d, asciinema→agg→ffmpeg, ffprobe 5.0s/790×560 yuv420p + 10 frames at fps=2, early validate-OK frame ≠ late list frame proving live/advancing per §11.4.107)</w:t>
+            </w:r>
+          </w:p>
+        </w:tc>
+        <w:tc>
+          <w:tcPr/>
+          <w:p>
+            <w:pPr>
+              <w:pStyle w:val="Compact"/>
+            </w:pPr>
+            <w:r>
+              <w:t xml:space="preserve">Confirmed:/Volumes/T7/Downloads/Recordings/helix_translate-workable-items-wave3d-20260616.mp4</w:t>
             </w:r>
           </w:p>
         </w:tc>
@@ -56725,18 +57509,215 @@
               <w:t xml:space="preserve"> </w:t>
             </w:r>
             <w:r>
-              <w:t xml:space="preserve">— distinct verbs (ascendió/paseaba) from Hyperbolic’s output (salía/caminaba), proving a genuine per-provider model; Wave-3c, asciinema→agg→ffmpeg, ffprobe 4.54s/790×560 yuv420p + 9 extracted frames at fps=2, ≥6 frames content-verified, start-frame (input only) ≠ output-frame (Spanish) per §11.4.107). The remaining 42 provider dirs remain Source-confirmed, PENDING a per-provider recording.</w:t>
-            </w:r>
-          </w:p>
-        </w:tc>
-        <w:tc>
-          <w:tcPr/>
-          <w:p>
-            <w:pPr>
-              <w:pStyle w:val="Compact"/>
-            </w:pPr>
-            <w:r>
-              <w:t xml:space="preserve">Confirmed (fireworks):/Volumes/T7/Downloads/Recordings/helix_translate-provider-fireworks-translate-wave3c-20260616.mp4</w:t>
+              <w:t xml:space="preserve">— distinct verbs (ascendió/paseaba) from Hyperbolic’s output (salía/caminaba), proving a genuine per-provider model; Wave-3c, asciinema→agg→ffmpeg, ffprobe 4.54s/790×560 yuv420p + 9 extracted frames at fps=2, ≥6 frames content-verified, start-frame (input only) ≠ output-frame (Spanish) per §11.4.107).</w:t>
+            </w:r>
+            <w:r>
+              <w:t xml:space="preserve"> </w:t>
+            </w:r>
+            <w:r>
+              <w:rPr>
+                <w:b/>
+                <w:bCs/>
+              </w:rPr>
+              <w:t xml:space="preserve">Wave-3d added 2 net-new:</w:t>
+            </w:r>
+            <w:r>
+              <w:rPr>
+                <w:b/>
+                <w:bCs/>
+              </w:rPr>
+              <w:t xml:space="preserve"> </w:t>
+            </w:r>
+            <w:r>
+              <w:rPr>
+                <w:rStyle w:val="VerbatimChar"/>
+                <w:b/>
+                <w:bCs/>
+              </w:rPr>
+              <w:t xml:space="preserve">nvidia</w:t>
+            </w:r>
+            <w:r>
+              <w:rPr>
+                <w:b/>
+                <w:bCs/>
+              </w:rPr>
+              <w:t xml:space="preserve"> </w:t>
+            </w:r>
+            <w:r>
+              <w:rPr>
+                <w:b/>
+                <w:bCs/>
+              </w:rPr>
+              <w:t xml:space="preserve">+</w:t>
+            </w:r>
+            <w:r>
+              <w:rPr>
+                <w:b/>
+                <w:bCs/>
+              </w:rPr>
+              <w:t xml:space="preserve"> </w:t>
+            </w:r>
+            <w:r>
+              <w:rPr>
+                <w:rStyle w:val="VerbatimChar"/>
+                <w:b/>
+                <w:bCs/>
+              </w:rPr>
+              <w:t xml:space="preserve">openrouter</w:t>
+            </w:r>
+            <w:r>
+              <w:t xml:space="preserve"> </w:t>
+            </w:r>
+            <w:r>
+              <w:t xml:space="preserve">—</w:t>
+            </w:r>
+            <w:r>
+              <w:t xml:space="preserve"> </w:t>
+            </w:r>
+            <w:r>
+              <w:rPr>
+                <w:rStyle w:val="VerbatimChar"/>
+              </w:rPr>
+              <w:t xml:space="preserve">nvidia</w:t>
+            </w:r>
+            <w:r>
+              <w:t xml:space="preserve"> </w:t>
+            </w:r>
+            <w:r>
+              <w:t xml:space="preserve">(reached via unified-translator</w:t>
+            </w:r>
+            <w:r>
+              <w:t xml:space="preserve"> </w:t>
+            </w:r>
+            <w:r>
+              <w:rPr>
+                <w:rStyle w:val="VerbatimChar"/>
+              </w:rPr>
+              <w:t xml:space="preserve">-provider openai -base-url https://integrate.api.nvidia.com/v1 -model meta/llama-3.1-8b-instruct</w:t>
+            </w:r>
+            <w:r>
+              <w:t xml:space="preserve">):</w:t>
+            </w:r>
+            <w:r>
+              <w:t xml:space="preserve"> </w:t>
+            </w:r>
+            <w:r>
+              <w:t xml:space="preserve">“At dawn, the sun rose over the quiet village. An old fisherman walked along the shore.”</w:t>
+            </w:r>
+            <w:r>
+              <w:t xml:space="preserve"> </w:t>
+            </w:r>
+            <w:r>
+              <w:t xml:space="preserve">→</w:t>
+            </w:r>
+            <w:r>
+              <w:t xml:space="preserve"> </w:t>
+            </w:r>
+            <w:r>
+              <w:t xml:space="preserve">“Al amanecer, el sol se alzó sobre el tranquilo pueblo. Un anciano pescador</w:t>
+            </w:r>
+            <w:r>
+              <w:t xml:space="preserve"> </w:t>
+            </w:r>
+            <w:r>
+              <w:rPr>
+                <w:b/>
+                <w:bCs/>
+              </w:rPr>
+              <w:t xml:space="preserve">caminaba</w:t>
+            </w:r>
+            <w:r>
+              <w:t xml:space="preserve"> </w:t>
+            </w:r>
+            <w:r>
+              <w:t xml:space="preserve">a lo largo de la orilla.”</w:t>
+            </w:r>
+            <w:r>
+              <w:t xml:space="preserve"> </w:t>
+            </w:r>
+            <w:r>
+              <w:t xml:space="preserve">(</w:t>
+            </w:r>
+            <w:r>
+              <w:rPr>
+                <w:rStyle w:val="VerbatimChar"/>
+              </w:rPr>
+              <w:t xml:space="preserve">helix_translate-provider-nvidia-translate-wave3d-20260616.mp4</w:t>
+            </w:r>
+            <w:r>
+              <w:t xml:space="preserve">, ffprobe 6.5s/790×560 yuv420p + 13 frames at fps=2);</w:t>
+            </w:r>
+            <w:r>
+              <w:t xml:space="preserve"> </w:t>
+            </w:r>
+            <w:r>
+              <w:rPr>
+                <w:rStyle w:val="VerbatimChar"/>
+              </w:rPr>
+              <w:t xml:space="preserve">openrouter</w:t>
+            </w:r>
+            <w:r>
+              <w:t xml:space="preserve"> </w:t>
+            </w:r>
+            <w:r>
+              <w:t xml:space="preserve">(</w:t>
+            </w:r>
+            <w:r>
+              <w:rPr>
+                <w:rStyle w:val="VerbatimChar"/>
+              </w:rPr>
+              <w:t xml:space="preserve">-base-url https://openrouter.ai/api/v1 -model meta-llama/llama-3.1-8b-instruct</w:t>
+            </w:r>
+            <w:r>
+              <w:t xml:space="preserve">): same EN source →</w:t>
+            </w:r>
+            <w:r>
+              <w:t xml:space="preserve"> </w:t>
+            </w:r>
+            <w:r>
+              <w:t xml:space="preserve">“Al amanecer, el sol se alzó sobre el tranquilo pueblo. Un anciano pescador</w:t>
+            </w:r>
+            <w:r>
+              <w:t xml:space="preserve"> </w:t>
+            </w:r>
+            <w:r>
+              <w:rPr>
+                <w:b/>
+                <w:bCs/>
+              </w:rPr>
+              <w:t xml:space="preserve">paseaba</w:t>
+            </w:r>
+            <w:r>
+              <w:t xml:space="preserve"> </w:t>
+            </w:r>
+            <w:r>
+              <w:t xml:space="preserve">a lo largo de la orilla.”</w:t>
+            </w:r>
+            <w:r>
+              <w:t xml:space="preserve"> </w:t>
+            </w:r>
+            <w:r>
+              <w:t xml:space="preserve">(</w:t>
+            </w:r>
+            <w:r>
+              <w:rPr>
+                <w:rStyle w:val="VerbatimChar"/>
+              </w:rPr>
+              <w:t xml:space="preserve">helix_translate-provider-openrouter-translate-wave3d-20260616.mp4</w:t>
+            </w:r>
+            <w:r>
+              <w:t xml:space="preserve">, ffprobe 5.5s/790×560 yuv420p + 11 frames at fps=2) — distinct verbs (caminaba/paseaba) prove genuine per-provider models, each start-frame (English only) ≠ output-frame (Spanish) per §11.4.107, ≥6 frames content-verified. The remaining 40 provider dirs remain Source-confirmed, PENDING a per-provider recording.</w:t>
+            </w:r>
+          </w:p>
+        </w:tc>
+        <w:tc>
+          <w:tcPr/>
+          <w:p>
+            <w:pPr>
+              <w:pStyle w:val="Compact"/>
+            </w:pPr>
+            <w:r>
+              <w:t xml:space="preserve">Confirmed (fireworks/nvidia/openrouter):/Volumes/T7/Downloads/Recordings/helix_translate-provider-fireworks-translate-wave3c-20260616.mp4 · /Volumes/T7/Downloads/Recordings/helix_translate-provider-nvidia-translate-wave3d-20260616.mp4 · /Volumes/T7/Downloads/Recordings/helix_translate-provider-openrouter-translate-wave3d-20260616.mp4</w:t>
             </w:r>
           </w:p>
         </w:tc>

</xml_diff>

<commit_message>
docs(features §11.4.153): wave-3f — finalize wave-3e (epub/fb2/script/format-detect) + 2 net-new (EPUB→EPUB, TXT→TXT), frame+artifact-verified
</commit_message>
<xml_diff>
--- a/docs/features/Status.docx
+++ b/docs/features/Status.docx
@@ -34,7 +34,7 @@
         <w:t xml:space="preserve"> </w:t>
       </w:r>
       <w:r>
-        <w:t xml:space="preserve">13</w:t>
+        <w:t xml:space="preserve">14</w:t>
       </w:r>
       <w:r>
         <w:t xml:space="preserve"> </w:t>
@@ -50,7 +50,7 @@
         <w:t xml:space="preserve"> </w:t>
       </w:r>
       <w:r>
-        <w:t xml:space="preserve">2026-06-16T13:45:00Z</w:t>
+        <w:t xml:space="preserve">2026-06-16T14:30:00Z</w:t>
       </w:r>
       <w:r>
         <w:t xml:space="preserve"> </w:t>
@@ -192,13 +192,286 @@
           <w:b/>
           <w:bCs/>
         </w:rPr>
-        <w:t xml:space="preserve">41 feature rows are video-confirmed</w:t>
-      </w:r>
-      <w:r>
-        <w:t xml:space="preserve"> </w:t>
-      </w:r>
-      <w:r>
-        <w:t xml:space="preserve">(Wave 3d of 2026-06-16 added</w:t>
+        <w:t xml:space="preserve">43 feature rows are video-confirmed</w:t>
+      </w:r>
+      <w:r>
+        <w:t xml:space="preserve"> </w:t>
+      </w:r>
+      <w:r>
+        <w:t xml:space="preserve">(Wave 3f of 2026-06-16 added</w:t>
+      </w:r>
+      <w:r>
+        <w:t xml:space="preserve"> </w:t>
+      </w:r>
+      <w:r>
+        <w:rPr>
+          <w:b/>
+          <w:bCs/>
+        </w:rPr>
+        <w:t xml:space="preserve">2 net-new</w:t>
+      </w:r>
+      <w:r>
+        <w:t xml:space="preserve"> </w:t>
+      </w:r>
+      <w:r>
+        <w:t xml:space="preserve">—</w:t>
+      </w:r>
+      <w:r>
+        <w:t xml:space="preserve"> </w:t>
+      </w:r>
+      <w:r>
+        <w:rPr>
+          <w:b/>
+          <w:bCs/>
+        </w:rPr>
+        <w:t xml:space="preserve">EPUB→EPUB conversion</w:t>
+      </w:r>
+      <w:r>
+        <w:t xml:space="preserve"> </w:t>
+      </w:r>
+      <w:r>
+        <w:t xml:space="preserve">(</w:t>
+      </w:r>
+      <w:r>
+        <w:rPr>
+          <w:rStyle w:val="VerbatimChar"/>
+        </w:rPr>
+        <w:t xml:space="preserve">helix_translate-epub-output-wave3e-20260616.mp4</w:t>
+      </w:r>
+      <w:r>
+        <w:t xml:space="preserve">: EN .epub → real deepseek run → OUTPUT EPUB carries real Spanish</w:t>
+      </w:r>
+      <w:r>
+        <w:t xml:space="preserve"> </w:t>
+      </w:r>
+      <w:r>
+        <w:t xml:space="preserve">“La Antigua Farola la vieja farola se alzaba sola en la rocosa costa…”</w:t>
+      </w:r>
+      <w:r>
+        <w:t xml:space="preserve">) and</w:t>
+      </w:r>
+      <w:r>
+        <w:t xml:space="preserve"> </w:t>
+      </w:r>
+      <w:r>
+        <w:rPr>
+          <w:b/>
+          <w:bCs/>
+        </w:rPr>
+        <w:t xml:space="preserve">TXT→TXT translation</w:t>
+      </w:r>
+      <w:r>
+        <w:t xml:space="preserve"> </w:t>
+      </w:r>
+      <w:r>
+        <w:t xml:space="preserve">(</w:t>
+      </w:r>
+      <w:r>
+        <w:rPr>
+          <w:rStyle w:val="VerbatimChar"/>
+        </w:rPr>
+        <w:t xml:space="preserve">helix_translate-txt-translation-wave3f-20260616.mp4</w:t>
+      </w:r>
+      <w:r>
+        <w:t xml:space="preserve">: EN .txt → real deepseek run → ES .txt</w:t>
+      </w:r>
+      <w:r>
+        <w:t xml:space="preserve"> </w:t>
+      </w:r>
+      <w:r>
+        <w:t xml:space="preserve">“El río fluía tranquilamente a través del valle verde. Los pájaros cantaban bajo la luz de la mañana.”</w:t>
+      </w:r>
+      <w:r>
+        <w:t xml:space="preserve">), each ffprobe+frame-verified per §11.4.107 (790×560 yuv420p, ≥6 frames, start-frame English-only ≠ output-frame Spanish); Wave 3f also</w:t>
+      </w:r>
+      <w:r>
+        <w:t xml:space="preserve"> </w:t>
+      </w:r>
+      <w:r>
+        <w:rPr>
+          <w:b/>
+          <w:bCs/>
+        </w:rPr>
+        <w:t xml:space="preserve">re-confirmed</w:t>
+      </w:r>
+      <w:r>
+        <w:t xml:space="preserve"> </w:t>
+      </w:r>
+      <w:r>
+        <w:t xml:space="preserve">(NOT double-counted) the already-confirmed</w:t>
+      </w:r>
+      <w:r>
+        <w:t xml:space="preserve"> </w:t>
+      </w:r>
+      <w:r>
+        <w:rPr>
+          <w:b/>
+          <w:bCs/>
+        </w:rPr>
+        <w:t xml:space="preserve">FB2→FB2</w:t>
+      </w:r>
+      <w:r>
+        <w:t xml:space="preserve"> </w:t>
+      </w:r>
+      <w:r>
+        <w:t xml:space="preserve">(</w:t>
+      </w:r>
+      <w:r>
+        <w:rPr>
+          <w:rStyle w:val="VerbatimChar"/>
+        </w:rPr>
+        <w:t xml:space="preserve">helix_translate-fb2-convert-wave3e-20260616.mp4</w:t>
+      </w:r>
+      <w:r>
+        <w:t xml:space="preserve">, namespace preserved + real Spanish),</w:t>
+      </w:r>
+      <w:r>
+        <w:t xml:space="preserve"> </w:t>
+      </w:r>
+      <w:r>
+        <w:rPr>
+          <w:b/>
+          <w:bCs/>
+        </w:rPr>
+        <w:t xml:space="preserve">format-detection</w:t>
+      </w:r>
+      <w:r>
+        <w:t xml:space="preserve"> </w:t>
+      </w:r>
+      <w:r>
+        <w:t xml:space="preserve">(</w:t>
+      </w:r>
+      <w:r>
+        <w:rPr>
+          <w:rStyle w:val="VerbatimChar"/>
+        </w:rPr>
+        <w:t xml:space="preserve">helix_translate-format-detect-wave3e-20260616.mp4</w:t>
+      </w:r>
+      <w:r>
+        <w:t xml:space="preserve">, extensionless</w:t>
+      </w:r>
+      <w:r>
+        <w:t xml:space="preserve"> </w:t>
+      </w:r>
+      <w:r>
+        <w:rPr>
+          <w:rStyle w:val="VerbatimChar"/>
+        </w:rPr>
+        <w:t xml:space="preserve">.dat</w:t>
+      </w:r>
+      <w:r>
+        <w:t xml:space="preserve"> </w:t>
+      </w:r>
+      <w:r>
+        <w:t xml:space="preserve">detected-by-content),</w:t>
+      </w:r>
+      <w:r>
+        <w:t xml:space="preserve"> </w:t>
+      </w:r>
+      <w:r>
+        <w:rPr>
+          <w:rStyle w:val="VerbatimChar"/>
+          <w:b/>
+          <w:bCs/>
+        </w:rPr>
+        <w:t xml:space="preserve">-script</w:t>
+      </w:r>
+      <w:r>
+        <w:rPr>
+          <w:b/>
+          <w:bCs/>
+        </w:rPr>
+        <w:t xml:space="preserve"> </w:t>
+      </w:r>
+      <w:r>
+        <w:rPr>
+          <w:b/>
+          <w:bCs/>
+        </w:rPr>
+        <w:t xml:space="preserve">Cyrillic↔Latin</w:t>
+      </w:r>
+      <w:r>
+        <w:t xml:space="preserve"> </w:t>
+      </w:r>
+      <w:r>
+        <w:t xml:space="preserve">(</w:t>
+      </w:r>
+      <w:r>
+        <w:rPr>
+          <w:rStyle w:val="VerbatimChar"/>
+        </w:rPr>
+        <w:t xml:space="preserve">helix_translate-script-conversion-wave3e-20260616.mp4</w:t>
+      </w:r>
+      <w:r>
+        <w:t xml:space="preserve">, RUN A latin</w:t>
+      </w:r>
+      <w:r>
+        <w:t xml:space="preserve"> </w:t>
+      </w:r>
+      <w:r>
+        <w:t xml:space="preserve">“Ovo je testni…”</w:t>
+      </w:r>
+      <w:r>
+        <w:t xml:space="preserve"> </w:t>
+      </w:r>
+      <w:r>
+        <w:t xml:space="preserve">≠ RUN B cyrillic</w:t>
+      </w:r>
+      <w:r>
+        <w:t xml:space="preserve"> </w:t>
+      </w:r>
+      <w:r>
+        <w:t xml:space="preserve">“Систем треба…”</w:t>
+      </w:r>
+      <w:r>
+        <w:t xml:space="preserve">) and</w:t>
+      </w:r>
+      <w:r>
+        <w:t xml:space="preserve"> </w:t>
+      </w:r>
+      <w:r>
+        <w:rPr>
+          <w:b/>
+          <w:bCs/>
+        </w:rPr>
+        <w:t xml:space="preserve">markdown-translator EPUB↔MD round-trip</w:t>
+      </w:r>
+      <w:r>
+        <w:t xml:space="preserve"> </w:t>
+      </w:r>
+      <w:r>
+        <w:t xml:space="preserve">(</w:t>
+      </w:r>
+      <w:r>
+        <w:rPr>
+          <w:rStyle w:val="VerbatimChar"/>
+        </w:rPr>
+        <w:t xml:space="preserve">helix_translate-markdown-roundtrip-wave3f-20260616.mp4</w:t>
+      </w:r>
+      <w:r>
+        <w:t xml:space="preserve">,</w:t>
+      </w:r>
+      <w:r>
+        <w:t xml:space="preserve"> </w:t>
+      </w:r>
+      <w:r>
+        <w:t xml:space="preserve">“# El Faro Viejo / El viejo faro se alzaba solitario en la costa rocosa.”</w:t>
+      </w:r>
+      <w:r>
+        <w:t xml:space="preserve">) rows with fresh frame-verified clips; running total 41 (Rev 13) + 2 =</w:t>
+      </w:r>
+      <w:r>
+        <w:t xml:space="preserve"> </w:t>
+      </w:r>
+      <w:r>
+        <w:rPr>
+          <w:b/>
+          <w:bCs/>
+        </w:rPr>
+        <w:t xml:space="preserve">43</w:t>
+      </w:r>
+      <w:r>
+        <w:t xml:space="preserve">. Wave 3d of 2026-06-16 added</w:t>
       </w:r>
       <w:r>
         <w:t xml:space="preserve"> </w:t>
@@ -1921,13 +2194,40 @@
                 <w:b/>
                 <w:bCs/>
               </w:rPr>
-              <w:t xml:space="preserve">494</w:t>
+              <w:t xml:space="preserve">496</w:t>
             </w:r>
             <w:r>
               <w:t xml:space="preserve"> </w:t>
             </w:r>
             <w:r>
-              <w:t xml:space="preserve">(Rev 9 = 493 Rev 8 + 1 new unified-translator</w:t>
+              <w:t xml:space="preserve">(Rev 14 = 494 Rev 13 + 2 new unified-translator rows added Wave 3f for the net-new videos:</w:t>
+            </w:r>
+            <w:r>
+              <w:t xml:space="preserve"> </w:t>
+            </w:r>
+            <w:r>
+              <w:rPr>
+                <w:rStyle w:val="VerbatimChar"/>
+              </w:rPr>
+              <w:t xml:space="preserve">EPUB→EPUB conversion</w:t>
+            </w:r>
+            <w:r>
+              <w:t xml:space="preserve"> </w:t>
+            </w:r>
+            <w:r>
+              <w:t xml:space="preserve">+</w:t>
+            </w:r>
+            <w:r>
+              <w:t xml:space="preserve"> </w:t>
+            </w:r>
+            <w:r>
+              <w:rPr>
+                <w:rStyle w:val="VerbatimChar"/>
+              </w:rPr>
+              <w:t xml:space="preserve">TXT→TXT translation</w:t>
+            </w:r>
+            <w:r>
+              <w:t xml:space="preserve">; Rev 9 = 493 Rev 8 + 1 new unified-translator</w:t>
             </w:r>
             <w:r>
               <w:t xml:space="preserve"> </w:t>
@@ -1942,7 +2242,7 @@
               <w:t xml:space="preserve"> </w:t>
             </w:r>
             <w:r>
-              <w:t xml:space="preserve">row added this wave for the Wave-2 html-to-md video; §11.4.6 — re-derive with</w:t>
+              <w:t xml:space="preserve">row added that wave for the Wave-2 html-to-md video; §11.4.6 — re-derive with</w:t>
             </w:r>
             <w:r>
               <w:t xml:space="preserve"> </w:t>
@@ -2107,7 +2407,7 @@
               <w:pStyle w:val="Compact"/>
             </w:pPr>
             <w:r>
-              <w:t xml:space="preserve">443 (Rev 9: 442 Rev 8 + 1 new unified-translator HTML→Markdown conversion row; Rev 8 was 435 Rev 7 + 7 new pkg/bridge ensemble-seam rows; was 471 Rev 6, −36 flipped to Obsolete Rev 7 — local-runtime + SSH-local features removed in bridge phase-2 R-2..R-4)</w:t>
+              <w:t xml:space="preserve">445 (Rev 14: 443 Rev 13 + 2 new unified-translator rows EPUB→EPUB conversion + TXT→TXT translation, both Implemented + Wired + Wave-3f video-confirmed; Rev 9: 442 Rev 8 + 1 new unified-translator HTML→Markdown conversion row; Rev 8 was 435 Rev 7 + 7 new pkg/bridge ensemble-seam rows; was 471 Rev 6, −36 flipped to Obsolete Rev 7 — local-runtime + SSH-local features removed in bridge phase-2 R-2..R-4)</w:t>
             </w:r>
           </w:p>
         </w:tc>
@@ -2515,13 +2815,107 @@
                 <w:b/>
                 <w:bCs/>
               </w:rPr>
-              <w:t xml:space="preserve">41</w:t>
+              <w:t xml:space="preserve">43</w:t>
             </w:r>
             <w:r>
               <w:t xml:space="preserve"> </w:t>
             </w:r>
             <w:r>
-              <w:t xml:space="preserve">(real, content-verified recordings — see Anti-bluff note; Rev-13 / Wave 3d of 2026-06-16 added</w:t>
+              <w:t xml:space="preserve">(real, content-verified recordings — see Anti-bluff note; Rev-14 / Wave 3f of 2026-06-16 added</w:t>
+            </w:r>
+            <w:r>
+              <w:t xml:space="preserve"> </w:t>
+            </w:r>
+            <w:r>
+              <w:rPr>
+                <w:b/>
+                <w:bCs/>
+              </w:rPr>
+              <w:t xml:space="preserve">2 net-new</w:t>
+            </w:r>
+            <w:r>
+              <w:t xml:space="preserve"> </w:t>
+            </w:r>
+            <w:r>
+              <w:t xml:space="preserve">video confirmations prioritising feature-type diversity —</w:t>
+            </w:r>
+            <w:r>
+              <w:t xml:space="preserve"> </w:t>
+            </w:r>
+            <w:r>
+              <w:rPr>
+                <w:b/>
+                <w:bCs/>
+              </w:rPr>
+              <w:t xml:space="preserve">EPUB→EPUB conversion</w:t>
+            </w:r>
+            <w:r>
+              <w:t xml:space="preserve"> </w:t>
+            </w:r>
+            <w:r>
+              <w:t xml:space="preserve">(</w:t>
+            </w:r>
+            <w:r>
+              <w:rPr>
+                <w:rStyle w:val="VerbatimChar"/>
+              </w:rPr>
+              <w:t xml:space="preserve">helix_translate-epub-output-wave3e-20260616.mp4</w:t>
+            </w:r>
+            <w:r>
+              <w:t xml:space="preserve">, EN .epub → real Spanish EPUB) and</w:t>
+            </w:r>
+            <w:r>
+              <w:t xml:space="preserve"> </w:t>
+            </w:r>
+            <w:r>
+              <w:rPr>
+                <w:b/>
+                <w:bCs/>
+              </w:rPr>
+              <w:t xml:space="preserve">TXT→TXT translation</w:t>
+            </w:r>
+            <w:r>
+              <w:t xml:space="preserve"> </w:t>
+            </w:r>
+            <w:r>
+              <w:t xml:space="preserve">(</w:t>
+            </w:r>
+            <w:r>
+              <w:rPr>
+                <w:rStyle w:val="VerbatimChar"/>
+              </w:rPr>
+              <w:t xml:space="preserve">helix_translate-txt-translation-wave3f-20260616.mp4</w:t>
+            </w:r>
+            <w:r>
+              <w:t xml:space="preserve">, EN .txt → real Spanish .txt), each ffprobe+frame-verified per §11.4.107; Wave 3f also re-confirmed (NOT double-counted) FB2→FB2 / format-detection /</w:t>
+            </w:r>
+            <w:r>
+              <w:t xml:space="preserve"> </w:t>
+            </w:r>
+            <w:r>
+              <w:rPr>
+                <w:rStyle w:val="VerbatimChar"/>
+              </w:rPr>
+              <w:t xml:space="preserve">-script</w:t>
+            </w:r>
+            <w:r>
+              <w:t xml:space="preserve"> </w:t>
+            </w:r>
+            <w:r>
+              <w:t xml:space="preserve">Cyrillic↔Latin / markdown EPUB↔MD round-trip with fresh frame-verified clips; running total 41 (Rev 13) + 2 =</w:t>
+            </w:r>
+            <w:r>
+              <w:t xml:space="preserve"> </w:t>
+            </w:r>
+            <w:r>
+              <w:rPr>
+                <w:b/>
+                <w:bCs/>
+              </w:rPr>
+              <w:t xml:space="preserve">43</w:t>
+            </w:r>
+            <w:r>
+              <w:t xml:space="preserve">. Rev-13 / Wave 3d of 2026-06-16 added</w:t>
             </w:r>
             <w:r>
               <w:t xml:space="preserve"> </w:t>
@@ -10888,16 +11282,43 @@
               </w:rPr>
               <w:t xml:space="preserve">PASS — EPUB↔MD round-trip captured</w:t>
             </w:r>
-          </w:p>
-        </w:tc>
-        <w:tc>
-          <w:tcPr/>
-          <w:p>
-            <w:pPr>
-              <w:pStyle w:val="Compact"/>
-            </w:pPr>
-            <w:r>
-              <w:t xml:space="preserve">Confirmed:/Volumes/T7/Downloads/Recordings/helixtranslate-markdown-roundtrip-20260615.mp4</w:t>
+            <w:r>
+              <w:t xml:space="preserve"> </w:t>
+            </w:r>
+            <w:r>
+              <w:t xml:space="preserve">(Wave 3f re-confirm: EPUB→source MD</w:t>
+            </w:r>
+            <w:r>
+              <w:t xml:space="preserve"> </w:t>
+            </w:r>
+            <w:r>
+              <w:t xml:space="preserve">“# The Old Lighthouse / The old lighthouse stood alone…”</w:t>
+            </w:r>
+            <w:r>
+              <w:t xml:space="preserve"> </w:t>
+            </w:r>
+            <w:r>
+              <w:t xml:space="preserve">→ translated MD</w:t>
+            </w:r>
+            <w:r>
+              <w:t xml:space="preserve"> </w:t>
+            </w:r>
+            <w:r>
+              <w:t xml:space="preserve">“# El Faro Viejo / El viejo faro se alzaba solitario en la costa rocosa.”</w:t>
+            </w:r>
+            <w:r>
+              <w:t xml:space="preserve">, real deepseek round-trip, frame-verified §11.4.107)</w:t>
+            </w:r>
+          </w:p>
+        </w:tc>
+        <w:tc>
+          <w:tcPr/>
+          <w:p>
+            <w:pPr>
+              <w:pStyle w:val="Compact"/>
+            </w:pPr>
+            <w:r>
+              <w:t xml:space="preserve">Confirmed:/Volumes/T7/Downloads/Recordings/helixtranslate-markdown-roundtrip-20260615.mp4 (Wave-3f re-confirm: /Volumes/T7/Downloads/Recordings/helix_translate-markdown-roundtrip-wave3f-20260616.mp4)</w:t>
             </w:r>
           </w:p>
         </w:tc>
@@ -16759,16 +17180,46 @@
               </w:rPr>
               <w:t xml:space="preserve">PASS — captured</w:t>
             </w:r>
-          </w:p>
-        </w:tc>
-        <w:tc>
-          <w:tcPr/>
-          <w:p>
-            <w:pPr>
-              <w:pStyle w:val="Compact"/>
-            </w:pPr>
-            <w:r>
-              <w:t xml:space="preserve">Confirmed:/Volumes/T7/Downloads/Recordings/helixtranslate-cli-fb2-to-fb2-deepseek_20260615-172006.mp4</w:t>
+            <w:r>
+              <w:t xml:space="preserve"> </w:t>
+            </w:r>
+            <w:r>
+              <w:t xml:space="preserve">(Wave 3f re-confirm: FB2 namespace</w:t>
+            </w:r>
+            <w:r>
+              <w:t xml:space="preserve"> </w:t>
+            </w:r>
+            <w:r>
+              <w:rPr>
+                <w:rStyle w:val="VerbatimChar"/>
+              </w:rPr>
+              <w:t xml:space="preserve">http://www.gribuser.ru/xml/fictionbook/2.0</w:t>
+            </w:r>
+            <w:r>
+              <w:t xml:space="preserve"> </w:t>
+            </w:r>
+            <w:r>
+              <w:t xml:space="preserve">PRESERVED + real Spanish</w:t>
+            </w:r>
+            <w:r>
+              <w:t xml:space="preserve"> </w:t>
+            </w:r>
+            <w:r>
+              <w:t xml:space="preserve">“Este es un párrafo de prueba…”</w:t>
+            </w:r>
+            <w:r>
+              <w:t xml:space="preserve">, frame-verified §11.4.107)</w:t>
+            </w:r>
+          </w:p>
+        </w:tc>
+        <w:tc>
+          <w:tcPr/>
+          <w:p>
+            <w:pPr>
+              <w:pStyle w:val="Compact"/>
+            </w:pPr>
+            <w:r>
+              <w:t xml:space="preserve">Confirmed:/Volumes/T7/Downloads/Recordings/helixtranslate-cli-fb2-to-fb2-deepseek_20260615-172006.mp4 (Wave-3f re-confirm: /Volumes/T7/Downloads/Recordings/helix_translate-fb2-convert-wave3e-20260616.mp4)</w:t>
             </w:r>
           </w:p>
         </w:tc>
@@ -16897,7 +17348,7 @@
               <w:pStyle w:val="Compact"/>
             </w:pPr>
             <w:r>
-              <w:t xml:space="preserve">Format detection</w:t>
+              <w:t xml:space="preserve">EPUB→EPUB conversion</w:t>
             </w:r>
           </w:p>
         </w:tc>
@@ -16941,7 +17392,7 @@
               <w:pStyle w:val="Compact"/>
             </w:pPr>
             <w:r>
-              <w:t xml:space="preserve">Input-format auto-detection on real input</w:t>
+              <w:t xml:space="preserve">EPUB parse → DeepSeek translate → EPUB writer (round-trip, real translated text in produced .epub)</w:t>
             </w:r>
           </w:p>
         </w:tc>
@@ -16969,16 +17420,31 @@
               </w:rPr>
               <w:t xml:space="preserve">PASS — captured</w:t>
             </w:r>
-          </w:p>
-        </w:tc>
-        <w:tc>
-          <w:tcPr/>
-          <w:p>
-            <w:pPr>
-              <w:pStyle w:val="Compact"/>
-            </w:pPr>
-            <w:r>
-              <w:t xml:space="preserve">Confirmed:/Volumes/T7/Downloads/Recordings/helixtranslate-cli-format-detection_20260615-164729.mp4</w:t>
+            <w:r>
+              <w:t xml:space="preserve"> </w:t>
+            </w:r>
+            <w:r>
+              <w:t xml:space="preserve">(Wave 3f net-new: EN .epub input → real deepseek run → OUTPUT EPUB carries real Spanish</w:t>
+            </w:r>
+            <w:r>
+              <w:t xml:space="preserve"> </w:t>
+            </w:r>
+            <w:r>
+              <w:t xml:space="preserve">“La Antigua Farola la vieja farola se alzaba sola en la rocosa costa…”</w:t>
+            </w:r>
+            <w:r>
+              <w:t xml:space="preserve">, frame-verified §11.4.107 — start frame English-only ≠ output frame Spanish)</w:t>
+            </w:r>
+          </w:p>
+        </w:tc>
+        <w:tc>
+          <w:tcPr/>
+          <w:p>
+            <w:pPr>
+              <w:pStyle w:val="Compact"/>
+            </w:pPr>
+            <w:r>
+              <w:t xml:space="preserve">Confirmed:/Volumes/T7/Downloads/Recordings/helix_translate-epub-output-wave3e-20260616.mp4</w:t>
             </w:r>
           </w:p>
         </w:tc>
@@ -17002,7 +17468,7 @@
               <w:pStyle w:val="Compact"/>
             </w:pPr>
             <w:r>
-              <w:t xml:space="preserve">help/version output</w:t>
+              <w:t xml:space="preserve">TXT→TXT translation</w:t>
             </w:r>
           </w:p>
         </w:tc>
@@ -17046,25 +17512,7 @@
               <w:pStyle w:val="Compact"/>
             </w:pPr>
             <w:r>
-              <w:rPr>
-                <w:rStyle w:val="VerbatimChar"/>
-              </w:rPr>
-              <w:t xml:space="preserve">-help</w:t>
-            </w:r>
-            <w:r>
-              <w:t xml:space="preserve">/</w:t>
-            </w:r>
-            <w:r>
-              <w:rPr>
-                <w:rStyle w:val="VerbatimChar"/>
-              </w:rPr>
-              <w:t xml:space="preserve">-version</w:t>
-            </w:r>
-            <w:r>
-              <w:t xml:space="preserve"> </w:t>
-            </w:r>
-            <w:r>
-              <w:t xml:space="preserve">usage banner</w:t>
+              <w:t xml:space="preserve">Plain-text parse → DeepSeek translate → TXT writer (real translated text, no format conversion)</w:t>
             </w:r>
           </w:p>
         </w:tc>
@@ -17092,16 +17540,43 @@
               </w:rPr>
               <w:t xml:space="preserve">PASS — captured</w:t>
             </w:r>
-          </w:p>
-        </w:tc>
-        <w:tc>
-          <w:tcPr/>
-          <w:p>
-            <w:pPr>
-              <w:pStyle w:val="Compact"/>
-            </w:pPr>
-            <w:r>
-              <w:t xml:space="preserve">Confirmed:/Volumes/T7/Downloads/Recordings/helixtranslate-cli-help_20260615-164729.mp4</w:t>
+            <w:r>
+              <w:t xml:space="preserve"> </w:t>
+            </w:r>
+            <w:r>
+              <w:t xml:space="preserve">(Wave 3f net-new: EN .txt</w:t>
+            </w:r>
+            <w:r>
+              <w:t xml:space="preserve"> </w:t>
+            </w:r>
+            <w:r>
+              <w:t xml:space="preserve">“The river flowed quietly through the green valley…”</w:t>
+            </w:r>
+            <w:r>
+              <w:t xml:space="preserve"> </w:t>
+            </w:r>
+            <w:r>
+              <w:t xml:space="preserve">→ real deepseek run → ES .txt</w:t>
+            </w:r>
+            <w:r>
+              <w:t xml:space="preserve"> </w:t>
+            </w:r>
+            <w:r>
+              <w:t xml:space="preserve">“El río fluía tranquilamente a través del valle verde. Los pájaros cantaban bajo la luz de la mañana.”</w:t>
+            </w:r>
+            <w:r>
+              <w:t xml:space="preserve">, frame-verified §11.4.107)</w:t>
+            </w:r>
+          </w:p>
+        </w:tc>
+        <w:tc>
+          <w:tcPr/>
+          <w:p>
+            <w:pPr>
+              <w:pStyle w:val="Compact"/>
+            </w:pPr>
+            <w:r>
+              <w:t xml:space="preserve">Confirmed:/Volumes/T7/Downloads/Recordings/helix_translate-txt-translation-wave3f-20260616.mp4</w:t>
             </w:r>
           </w:p>
         </w:tc>
@@ -17125,10 +17600,7 @@
               <w:pStyle w:val="Compact"/>
             </w:pPr>
             <w:r>
-              <w:rPr>
-                <w:rStyle w:val="VerbatimChar"/>
-              </w:rPr>
-              <w:t xml:space="preserve">-i/-input</w:t>
+              <w:t xml:space="preserve">Format detection</w:t>
             </w:r>
           </w:p>
         </w:tc>
@@ -17172,429 +17644,7 @@
               <w:pStyle w:val="Compact"/>
             </w:pPr>
             <w:r>
-              <w:t xml:space="preserve">Input ebook</w:t>
-            </w:r>
-          </w:p>
-        </w:tc>
-        <w:tc>
-          <w:tcPr/>
-          <w:p>
-            <w:pPr>
-              <w:pStyle w:val="Compact"/>
-            </w:pPr>
-            <w:r>
-              <w:t xml:space="preserve">Not-inventoried</w:t>
-            </w:r>
-          </w:p>
-        </w:tc>
-        <w:tc>
-          <w:tcPr/>
-          <w:p>
-            <w:pPr>
-              <w:pStyle w:val="Compact"/>
-            </w:pPr>
-            <w:r>
-              <w:t xml:space="preserve">Source-confirmed</w:t>
-            </w:r>
-          </w:p>
-        </w:tc>
-        <w:tc>
-          <w:tcPr/>
-          <w:p>
-            <w:pPr>
-              <w:pStyle w:val="Compact"/>
-            </w:pPr>
-            <w:r>
-              <w:t xml:space="preserve">N/A</w:t>
-            </w:r>
-          </w:p>
-        </w:tc>
-      </w:tr>
-      <w:tr>
-        <w:tc>
-          <w:tcPr/>
-          <w:p>
-            <w:pPr>
-              <w:pStyle w:val="Compact"/>
-            </w:pPr>
-            <w:r>
-              <w:t xml:space="preserve">unified-translator</w:t>
-            </w:r>
-          </w:p>
-        </w:tc>
-        <w:tc>
-          <w:tcPr/>
-          <w:p>
-            <w:pPr>
-              <w:pStyle w:val="Compact"/>
-            </w:pPr>
-            <w:r>
-              <w:rPr>
-                <w:rStyle w:val="VerbatimChar"/>
-              </w:rPr>
-              <w:t xml:space="preserve">-o/-output</w:t>
-            </w:r>
-          </w:p>
-        </w:tc>
-        <w:tc>
-          <w:tcPr/>
-          <w:p>
-            <w:pPr>
-              <w:pStyle w:val="Compact"/>
-            </w:pPr>
-            <w:r>
-              <w:t xml:space="preserve">CLI</w:t>
-            </w:r>
-          </w:p>
-        </w:tc>
-        <w:tc>
-          <w:tcPr/>
-          <w:p>
-            <w:pPr>
-              <w:pStyle w:val="Compact"/>
-            </w:pPr>
-            <w:r>
-              <w:t xml:space="preserve">Implemented</w:t>
-            </w:r>
-          </w:p>
-        </w:tc>
-        <w:tc>
-          <w:tcPr/>
-          <w:p>
-            <w:pPr>
-              <w:pStyle w:val="Compact"/>
-            </w:pPr>
-            <w:r>
-              <w:t xml:space="preserve">Wired</w:t>
-            </w:r>
-          </w:p>
-        </w:tc>
-        <w:tc>
-          <w:tcPr/>
-          <w:p>
-            <w:pPr>
-              <w:pStyle w:val="Compact"/>
-            </w:pPr>
-            <w:r>
-              <w:t xml:space="preserve">Output file (auto if empty)</w:t>
-            </w:r>
-          </w:p>
-        </w:tc>
-        <w:tc>
-          <w:tcPr/>
-          <w:p>
-            <w:pPr>
-              <w:pStyle w:val="Compact"/>
-            </w:pPr>
-            <w:r>
-              <w:t xml:space="preserve">Not-inventoried</w:t>
-            </w:r>
-          </w:p>
-        </w:tc>
-        <w:tc>
-          <w:tcPr/>
-          <w:p>
-            <w:pPr>
-              <w:pStyle w:val="Compact"/>
-            </w:pPr>
-            <w:r>
-              <w:t xml:space="preserve">Source-confirmed</w:t>
-            </w:r>
-          </w:p>
-        </w:tc>
-        <w:tc>
-          <w:tcPr/>
-          <w:p>
-            <w:pPr>
-              <w:pStyle w:val="Compact"/>
-            </w:pPr>
-            <w:r>
-              <w:t xml:space="preserve">N/A</w:t>
-            </w:r>
-          </w:p>
-        </w:tc>
-      </w:tr>
-      <w:tr>
-        <w:tc>
-          <w:tcPr/>
-          <w:p>
-            <w:pPr>
-              <w:pStyle w:val="Compact"/>
-            </w:pPr>
-            <w:r>
-              <w:t xml:space="preserve">unified-translator</w:t>
-            </w:r>
-          </w:p>
-        </w:tc>
-        <w:tc>
-          <w:tcPr/>
-          <w:p>
-            <w:pPr>
-              <w:pStyle w:val="Compact"/>
-            </w:pPr>
-            <w:r>
-              <w:rPr>
-                <w:rStyle w:val="VerbatimChar"/>
-              </w:rPr>
-              <w:t xml:space="preserve">-source-lang</w:t>
-            </w:r>
-          </w:p>
-        </w:tc>
-        <w:tc>
-          <w:tcPr/>
-          <w:p>
-            <w:pPr>
-              <w:pStyle w:val="Compact"/>
-            </w:pPr>
-            <w:r>
-              <w:t xml:space="preserve">CLI</w:t>
-            </w:r>
-          </w:p>
-        </w:tc>
-        <w:tc>
-          <w:tcPr/>
-          <w:p>
-            <w:pPr>
-              <w:pStyle w:val="Compact"/>
-            </w:pPr>
-            <w:r>
-              <w:t xml:space="preserve">Implemented</w:t>
-            </w:r>
-          </w:p>
-        </w:tc>
-        <w:tc>
-          <w:tcPr/>
-          <w:p>
-            <w:pPr>
-              <w:pStyle w:val="Compact"/>
-            </w:pPr>
-            <w:r>
-              <w:t xml:space="preserve">Wired</w:t>
-            </w:r>
-          </w:p>
-        </w:tc>
-        <w:tc>
-          <w:tcPr/>
-          <w:p>
-            <w:pPr>
-              <w:pStyle w:val="Compact"/>
-            </w:pPr>
-            <w:r>
-              <w:t xml:space="preserve">Source language</w:t>
-            </w:r>
-          </w:p>
-        </w:tc>
-        <w:tc>
-          <w:tcPr/>
-          <w:p>
-            <w:pPr>
-              <w:pStyle w:val="Compact"/>
-            </w:pPr>
-            <w:r>
-              <w:t xml:space="preserve">Not-inventoried</w:t>
-            </w:r>
-          </w:p>
-        </w:tc>
-        <w:tc>
-          <w:tcPr/>
-          <w:p>
-            <w:pPr>
-              <w:pStyle w:val="Compact"/>
-            </w:pPr>
-            <w:r>
-              <w:t xml:space="preserve">Source-confirmed</w:t>
-            </w:r>
-          </w:p>
-        </w:tc>
-        <w:tc>
-          <w:tcPr/>
-          <w:p>
-            <w:pPr>
-              <w:pStyle w:val="Compact"/>
-            </w:pPr>
-            <w:r>
-              <w:t xml:space="preserve">N/A</w:t>
-            </w:r>
-          </w:p>
-        </w:tc>
-      </w:tr>
-      <w:tr>
-        <w:tc>
-          <w:tcPr/>
-          <w:p>
-            <w:pPr>
-              <w:pStyle w:val="Compact"/>
-            </w:pPr>
-            <w:r>
-              <w:t xml:space="preserve">unified-translator</w:t>
-            </w:r>
-          </w:p>
-        </w:tc>
-        <w:tc>
-          <w:tcPr/>
-          <w:p>
-            <w:pPr>
-              <w:pStyle w:val="Compact"/>
-            </w:pPr>
-            <w:r>
-              <w:rPr>
-                <w:rStyle w:val="VerbatimChar"/>
-              </w:rPr>
-              <w:t xml:space="preserve">-target-lang</w:t>
-            </w:r>
-          </w:p>
-        </w:tc>
-        <w:tc>
-          <w:tcPr/>
-          <w:p>
-            <w:pPr>
-              <w:pStyle w:val="Compact"/>
-            </w:pPr>
-            <w:r>
-              <w:t xml:space="preserve">CLI</w:t>
-            </w:r>
-          </w:p>
-        </w:tc>
-        <w:tc>
-          <w:tcPr/>
-          <w:p>
-            <w:pPr>
-              <w:pStyle w:val="Compact"/>
-            </w:pPr>
-            <w:r>
-              <w:t xml:space="preserve">Implemented</w:t>
-            </w:r>
-          </w:p>
-        </w:tc>
-        <w:tc>
-          <w:tcPr/>
-          <w:p>
-            <w:pPr>
-              <w:pStyle w:val="Compact"/>
-            </w:pPr>
-            <w:r>
-              <w:t xml:space="preserve">Wired</w:t>
-            </w:r>
-          </w:p>
-        </w:tc>
-        <w:tc>
-          <w:tcPr/>
-          <w:p>
-            <w:pPr>
-              <w:pStyle w:val="Compact"/>
-            </w:pPr>
-            <w:r>
-              <w:t xml:space="preserve">Target language</w:t>
-            </w:r>
-          </w:p>
-        </w:tc>
-        <w:tc>
-          <w:tcPr/>
-          <w:p>
-            <w:pPr>
-              <w:pStyle w:val="Compact"/>
-            </w:pPr>
-            <w:r>
-              <w:t xml:space="preserve">Not-inventoried</w:t>
-            </w:r>
-          </w:p>
-        </w:tc>
-        <w:tc>
-          <w:tcPr/>
-          <w:p>
-            <w:pPr>
-              <w:pStyle w:val="Compact"/>
-            </w:pPr>
-            <w:r>
-              <w:t xml:space="preserve">Source-confirmed</w:t>
-            </w:r>
-          </w:p>
-        </w:tc>
-        <w:tc>
-          <w:tcPr/>
-          <w:p>
-            <w:pPr>
-              <w:pStyle w:val="Compact"/>
-            </w:pPr>
-            <w:r>
-              <w:t xml:space="preserve">N/A</w:t>
-            </w:r>
-          </w:p>
-        </w:tc>
-      </w:tr>
-      <w:tr>
-        <w:tc>
-          <w:tcPr/>
-          <w:p>
-            <w:pPr>
-              <w:pStyle w:val="Compact"/>
-            </w:pPr>
-            <w:r>
-              <w:t xml:space="preserve">unified-translator</w:t>
-            </w:r>
-          </w:p>
-        </w:tc>
-        <w:tc>
-          <w:tcPr/>
-          <w:p>
-            <w:pPr>
-              <w:pStyle w:val="Compact"/>
-            </w:pPr>
-            <w:r>
-              <w:rPr>
-                <w:rStyle w:val="VerbatimChar"/>
-              </w:rPr>
-              <w:t xml:space="preserve">-script</w:t>
-            </w:r>
-            <w:r>
-              <w:t xml:space="preserve"> </w:t>
-            </w:r>
-            <w:r>
-              <w:t xml:space="preserve">(Serbian Cyrillic↔Latin)</w:t>
-            </w:r>
-          </w:p>
-        </w:tc>
-        <w:tc>
-          <w:tcPr/>
-          <w:p>
-            <w:pPr>
-              <w:pStyle w:val="Compact"/>
-            </w:pPr>
-            <w:r>
-              <w:t xml:space="preserve">CLI</w:t>
-            </w:r>
-          </w:p>
-        </w:tc>
-        <w:tc>
-          <w:tcPr/>
-          <w:p>
-            <w:pPr>
-              <w:pStyle w:val="Compact"/>
-            </w:pPr>
-            <w:r>
-              <w:t xml:space="preserve">Implemented</w:t>
-            </w:r>
-          </w:p>
-        </w:tc>
-        <w:tc>
-          <w:tcPr/>
-          <w:p>
-            <w:pPr>
-              <w:pStyle w:val="Compact"/>
-            </w:pPr>
-            <w:r>
-              <w:t xml:space="preserve">Wired</w:t>
-            </w:r>
-          </w:p>
-        </w:tc>
-        <w:tc>
-          <w:tcPr/>
-          <w:p>
-            <w:pPr>
-              <w:pStyle w:val="Compact"/>
-            </w:pPr>
-            <w:r>
-              <w:t xml:space="preserve">Target script (cyrillic/latin) script normalization on real run</w:t>
+              <w:t xml:space="preserve">Input-format auto-detection on real input</w:t>
             </w:r>
           </w:p>
         </w:tc>
@@ -17622,16 +17672,738 @@
               </w:rPr>
               <w:t xml:space="preserve">PASS — captured</w:t>
             </w:r>
-          </w:p>
-        </w:tc>
-        <w:tc>
-          <w:tcPr/>
-          <w:p>
-            <w:pPr>
-              <w:pStyle w:val="Compact"/>
-            </w:pPr>
-            <w:r>
-              <w:t xml:space="preserve">Confirmed:/Volumes/T7/Downloads/Recordings/helixtranslate-cli-serbian-script-cyrillic-latin_20260615-171843.mp4</w:t>
+            <w:r>
+              <w:t xml:space="preserve"> </w:t>
+            </w:r>
+            <w:r>
+              <w:t xml:space="preserve">(Wave 3f re-confirm: extensionless</w:t>
+            </w:r>
+            <w:r>
+              <w:t xml:space="preserve"> </w:t>
+            </w:r>
+            <w:r>
+              <w:rPr>
+                <w:rStyle w:val="VerbatimChar"/>
+              </w:rPr>
+              <w:t xml:space="preserve">mystery_input.dat</w:t>
+            </w:r>
+            <w:r>
+              <w:t xml:space="preserve"> </w:t>
+            </w:r>
+            <w:r>
+              <w:t xml:space="preserve">with FB2 XML inside → detected-by-content → real Spanish output, frame-verified §11.4.107)</w:t>
+            </w:r>
+          </w:p>
+        </w:tc>
+        <w:tc>
+          <w:tcPr/>
+          <w:p>
+            <w:pPr>
+              <w:pStyle w:val="Compact"/>
+            </w:pPr>
+            <w:r>
+              <w:t xml:space="preserve">Confirmed:/Volumes/T7/Downloads/Recordings/helixtranslate-cli-format-detection_20260615-164729.mp4 (Wave-3f re-confirm: /Volumes/T7/Downloads/Recordings/helix_translate-format-detect-wave3e-20260616.mp4)</w:t>
+            </w:r>
+          </w:p>
+        </w:tc>
+      </w:tr>
+      <w:tr>
+        <w:tc>
+          <w:tcPr/>
+          <w:p>
+            <w:pPr>
+              <w:pStyle w:val="Compact"/>
+            </w:pPr>
+            <w:r>
+              <w:t xml:space="preserve">unified-translator</w:t>
+            </w:r>
+          </w:p>
+        </w:tc>
+        <w:tc>
+          <w:tcPr/>
+          <w:p>
+            <w:pPr>
+              <w:pStyle w:val="Compact"/>
+            </w:pPr>
+            <w:r>
+              <w:t xml:space="preserve">help/version output</w:t>
+            </w:r>
+          </w:p>
+        </w:tc>
+        <w:tc>
+          <w:tcPr/>
+          <w:p>
+            <w:pPr>
+              <w:pStyle w:val="Compact"/>
+            </w:pPr>
+            <w:r>
+              <w:t xml:space="preserve">CLI</w:t>
+            </w:r>
+          </w:p>
+        </w:tc>
+        <w:tc>
+          <w:tcPr/>
+          <w:p>
+            <w:pPr>
+              <w:pStyle w:val="Compact"/>
+            </w:pPr>
+            <w:r>
+              <w:t xml:space="preserve">Implemented</w:t>
+            </w:r>
+          </w:p>
+        </w:tc>
+        <w:tc>
+          <w:tcPr/>
+          <w:p>
+            <w:pPr>
+              <w:pStyle w:val="Compact"/>
+            </w:pPr>
+            <w:r>
+              <w:t xml:space="preserve">Wired</w:t>
+            </w:r>
+          </w:p>
+        </w:tc>
+        <w:tc>
+          <w:tcPr/>
+          <w:p>
+            <w:pPr>
+              <w:pStyle w:val="Compact"/>
+            </w:pPr>
+            <w:r>
+              <w:rPr>
+                <w:rStyle w:val="VerbatimChar"/>
+              </w:rPr>
+              <w:t xml:space="preserve">-help</w:t>
+            </w:r>
+            <w:r>
+              <w:t xml:space="preserve">/</w:t>
+            </w:r>
+            <w:r>
+              <w:rPr>
+                <w:rStyle w:val="VerbatimChar"/>
+              </w:rPr>
+              <w:t xml:space="preserve">-version</w:t>
+            </w:r>
+            <w:r>
+              <w:t xml:space="preserve"> </w:t>
+            </w:r>
+            <w:r>
+              <w:t xml:space="preserve">usage banner</w:t>
+            </w:r>
+          </w:p>
+        </w:tc>
+        <w:tc>
+          <w:tcPr/>
+          <w:p>
+            <w:pPr>
+              <w:pStyle w:val="Compact"/>
+            </w:pPr>
+            <w:r>
+              <w:t xml:space="preserve">Not-inventoried</w:t>
+            </w:r>
+          </w:p>
+        </w:tc>
+        <w:tc>
+          <w:tcPr/>
+          <w:p>
+            <w:pPr>
+              <w:pStyle w:val="Compact"/>
+            </w:pPr>
+            <w:r>
+              <w:rPr>
+                <w:b/>
+                <w:bCs/>
+              </w:rPr>
+              <w:t xml:space="preserve">PASS — captured</w:t>
+            </w:r>
+          </w:p>
+        </w:tc>
+        <w:tc>
+          <w:tcPr/>
+          <w:p>
+            <w:pPr>
+              <w:pStyle w:val="Compact"/>
+            </w:pPr>
+            <w:r>
+              <w:t xml:space="preserve">Confirmed:/Volumes/T7/Downloads/Recordings/helixtranslate-cli-help_20260615-164729.mp4</w:t>
+            </w:r>
+          </w:p>
+        </w:tc>
+      </w:tr>
+      <w:tr>
+        <w:tc>
+          <w:tcPr/>
+          <w:p>
+            <w:pPr>
+              <w:pStyle w:val="Compact"/>
+            </w:pPr>
+            <w:r>
+              <w:t xml:space="preserve">unified-translator</w:t>
+            </w:r>
+          </w:p>
+        </w:tc>
+        <w:tc>
+          <w:tcPr/>
+          <w:p>
+            <w:pPr>
+              <w:pStyle w:val="Compact"/>
+            </w:pPr>
+            <w:r>
+              <w:rPr>
+                <w:rStyle w:val="VerbatimChar"/>
+              </w:rPr>
+              <w:t xml:space="preserve">-i/-input</w:t>
+            </w:r>
+          </w:p>
+        </w:tc>
+        <w:tc>
+          <w:tcPr/>
+          <w:p>
+            <w:pPr>
+              <w:pStyle w:val="Compact"/>
+            </w:pPr>
+            <w:r>
+              <w:t xml:space="preserve">CLI</w:t>
+            </w:r>
+          </w:p>
+        </w:tc>
+        <w:tc>
+          <w:tcPr/>
+          <w:p>
+            <w:pPr>
+              <w:pStyle w:val="Compact"/>
+            </w:pPr>
+            <w:r>
+              <w:t xml:space="preserve">Implemented</w:t>
+            </w:r>
+          </w:p>
+        </w:tc>
+        <w:tc>
+          <w:tcPr/>
+          <w:p>
+            <w:pPr>
+              <w:pStyle w:val="Compact"/>
+            </w:pPr>
+            <w:r>
+              <w:t xml:space="preserve">Wired</w:t>
+            </w:r>
+          </w:p>
+        </w:tc>
+        <w:tc>
+          <w:tcPr/>
+          <w:p>
+            <w:pPr>
+              <w:pStyle w:val="Compact"/>
+            </w:pPr>
+            <w:r>
+              <w:t xml:space="preserve">Input ebook</w:t>
+            </w:r>
+          </w:p>
+        </w:tc>
+        <w:tc>
+          <w:tcPr/>
+          <w:p>
+            <w:pPr>
+              <w:pStyle w:val="Compact"/>
+            </w:pPr>
+            <w:r>
+              <w:t xml:space="preserve">Not-inventoried</w:t>
+            </w:r>
+          </w:p>
+        </w:tc>
+        <w:tc>
+          <w:tcPr/>
+          <w:p>
+            <w:pPr>
+              <w:pStyle w:val="Compact"/>
+            </w:pPr>
+            <w:r>
+              <w:t xml:space="preserve">Source-confirmed</w:t>
+            </w:r>
+          </w:p>
+        </w:tc>
+        <w:tc>
+          <w:tcPr/>
+          <w:p>
+            <w:pPr>
+              <w:pStyle w:val="Compact"/>
+            </w:pPr>
+            <w:r>
+              <w:t xml:space="preserve">N/A</w:t>
+            </w:r>
+          </w:p>
+        </w:tc>
+      </w:tr>
+      <w:tr>
+        <w:tc>
+          <w:tcPr/>
+          <w:p>
+            <w:pPr>
+              <w:pStyle w:val="Compact"/>
+            </w:pPr>
+            <w:r>
+              <w:t xml:space="preserve">unified-translator</w:t>
+            </w:r>
+          </w:p>
+        </w:tc>
+        <w:tc>
+          <w:tcPr/>
+          <w:p>
+            <w:pPr>
+              <w:pStyle w:val="Compact"/>
+            </w:pPr>
+            <w:r>
+              <w:rPr>
+                <w:rStyle w:val="VerbatimChar"/>
+              </w:rPr>
+              <w:t xml:space="preserve">-o/-output</w:t>
+            </w:r>
+          </w:p>
+        </w:tc>
+        <w:tc>
+          <w:tcPr/>
+          <w:p>
+            <w:pPr>
+              <w:pStyle w:val="Compact"/>
+            </w:pPr>
+            <w:r>
+              <w:t xml:space="preserve">CLI</w:t>
+            </w:r>
+          </w:p>
+        </w:tc>
+        <w:tc>
+          <w:tcPr/>
+          <w:p>
+            <w:pPr>
+              <w:pStyle w:val="Compact"/>
+            </w:pPr>
+            <w:r>
+              <w:t xml:space="preserve">Implemented</w:t>
+            </w:r>
+          </w:p>
+        </w:tc>
+        <w:tc>
+          <w:tcPr/>
+          <w:p>
+            <w:pPr>
+              <w:pStyle w:val="Compact"/>
+            </w:pPr>
+            <w:r>
+              <w:t xml:space="preserve">Wired</w:t>
+            </w:r>
+          </w:p>
+        </w:tc>
+        <w:tc>
+          <w:tcPr/>
+          <w:p>
+            <w:pPr>
+              <w:pStyle w:val="Compact"/>
+            </w:pPr>
+            <w:r>
+              <w:t xml:space="preserve">Output file (auto if empty)</w:t>
+            </w:r>
+          </w:p>
+        </w:tc>
+        <w:tc>
+          <w:tcPr/>
+          <w:p>
+            <w:pPr>
+              <w:pStyle w:val="Compact"/>
+            </w:pPr>
+            <w:r>
+              <w:t xml:space="preserve">Not-inventoried</w:t>
+            </w:r>
+          </w:p>
+        </w:tc>
+        <w:tc>
+          <w:tcPr/>
+          <w:p>
+            <w:pPr>
+              <w:pStyle w:val="Compact"/>
+            </w:pPr>
+            <w:r>
+              <w:t xml:space="preserve">Source-confirmed</w:t>
+            </w:r>
+          </w:p>
+        </w:tc>
+        <w:tc>
+          <w:tcPr/>
+          <w:p>
+            <w:pPr>
+              <w:pStyle w:val="Compact"/>
+            </w:pPr>
+            <w:r>
+              <w:t xml:space="preserve">N/A</w:t>
+            </w:r>
+          </w:p>
+        </w:tc>
+      </w:tr>
+      <w:tr>
+        <w:tc>
+          <w:tcPr/>
+          <w:p>
+            <w:pPr>
+              <w:pStyle w:val="Compact"/>
+            </w:pPr>
+            <w:r>
+              <w:t xml:space="preserve">unified-translator</w:t>
+            </w:r>
+          </w:p>
+        </w:tc>
+        <w:tc>
+          <w:tcPr/>
+          <w:p>
+            <w:pPr>
+              <w:pStyle w:val="Compact"/>
+            </w:pPr>
+            <w:r>
+              <w:rPr>
+                <w:rStyle w:val="VerbatimChar"/>
+              </w:rPr>
+              <w:t xml:space="preserve">-source-lang</w:t>
+            </w:r>
+          </w:p>
+        </w:tc>
+        <w:tc>
+          <w:tcPr/>
+          <w:p>
+            <w:pPr>
+              <w:pStyle w:val="Compact"/>
+            </w:pPr>
+            <w:r>
+              <w:t xml:space="preserve">CLI</w:t>
+            </w:r>
+          </w:p>
+        </w:tc>
+        <w:tc>
+          <w:tcPr/>
+          <w:p>
+            <w:pPr>
+              <w:pStyle w:val="Compact"/>
+            </w:pPr>
+            <w:r>
+              <w:t xml:space="preserve">Implemented</w:t>
+            </w:r>
+          </w:p>
+        </w:tc>
+        <w:tc>
+          <w:tcPr/>
+          <w:p>
+            <w:pPr>
+              <w:pStyle w:val="Compact"/>
+            </w:pPr>
+            <w:r>
+              <w:t xml:space="preserve">Wired</w:t>
+            </w:r>
+          </w:p>
+        </w:tc>
+        <w:tc>
+          <w:tcPr/>
+          <w:p>
+            <w:pPr>
+              <w:pStyle w:val="Compact"/>
+            </w:pPr>
+            <w:r>
+              <w:t xml:space="preserve">Source language</w:t>
+            </w:r>
+          </w:p>
+        </w:tc>
+        <w:tc>
+          <w:tcPr/>
+          <w:p>
+            <w:pPr>
+              <w:pStyle w:val="Compact"/>
+            </w:pPr>
+            <w:r>
+              <w:t xml:space="preserve">Not-inventoried</w:t>
+            </w:r>
+          </w:p>
+        </w:tc>
+        <w:tc>
+          <w:tcPr/>
+          <w:p>
+            <w:pPr>
+              <w:pStyle w:val="Compact"/>
+            </w:pPr>
+            <w:r>
+              <w:t xml:space="preserve">Source-confirmed</w:t>
+            </w:r>
+          </w:p>
+        </w:tc>
+        <w:tc>
+          <w:tcPr/>
+          <w:p>
+            <w:pPr>
+              <w:pStyle w:val="Compact"/>
+            </w:pPr>
+            <w:r>
+              <w:t xml:space="preserve">N/A</w:t>
+            </w:r>
+          </w:p>
+        </w:tc>
+      </w:tr>
+      <w:tr>
+        <w:tc>
+          <w:tcPr/>
+          <w:p>
+            <w:pPr>
+              <w:pStyle w:val="Compact"/>
+            </w:pPr>
+            <w:r>
+              <w:t xml:space="preserve">unified-translator</w:t>
+            </w:r>
+          </w:p>
+        </w:tc>
+        <w:tc>
+          <w:tcPr/>
+          <w:p>
+            <w:pPr>
+              <w:pStyle w:val="Compact"/>
+            </w:pPr>
+            <w:r>
+              <w:rPr>
+                <w:rStyle w:val="VerbatimChar"/>
+              </w:rPr>
+              <w:t xml:space="preserve">-target-lang</w:t>
+            </w:r>
+          </w:p>
+        </w:tc>
+        <w:tc>
+          <w:tcPr/>
+          <w:p>
+            <w:pPr>
+              <w:pStyle w:val="Compact"/>
+            </w:pPr>
+            <w:r>
+              <w:t xml:space="preserve">CLI</w:t>
+            </w:r>
+          </w:p>
+        </w:tc>
+        <w:tc>
+          <w:tcPr/>
+          <w:p>
+            <w:pPr>
+              <w:pStyle w:val="Compact"/>
+            </w:pPr>
+            <w:r>
+              <w:t xml:space="preserve">Implemented</w:t>
+            </w:r>
+          </w:p>
+        </w:tc>
+        <w:tc>
+          <w:tcPr/>
+          <w:p>
+            <w:pPr>
+              <w:pStyle w:val="Compact"/>
+            </w:pPr>
+            <w:r>
+              <w:t xml:space="preserve">Wired</w:t>
+            </w:r>
+          </w:p>
+        </w:tc>
+        <w:tc>
+          <w:tcPr/>
+          <w:p>
+            <w:pPr>
+              <w:pStyle w:val="Compact"/>
+            </w:pPr>
+            <w:r>
+              <w:t xml:space="preserve">Target language</w:t>
+            </w:r>
+          </w:p>
+        </w:tc>
+        <w:tc>
+          <w:tcPr/>
+          <w:p>
+            <w:pPr>
+              <w:pStyle w:val="Compact"/>
+            </w:pPr>
+            <w:r>
+              <w:t xml:space="preserve">Not-inventoried</w:t>
+            </w:r>
+          </w:p>
+        </w:tc>
+        <w:tc>
+          <w:tcPr/>
+          <w:p>
+            <w:pPr>
+              <w:pStyle w:val="Compact"/>
+            </w:pPr>
+            <w:r>
+              <w:t xml:space="preserve">Source-confirmed</w:t>
+            </w:r>
+          </w:p>
+        </w:tc>
+        <w:tc>
+          <w:tcPr/>
+          <w:p>
+            <w:pPr>
+              <w:pStyle w:val="Compact"/>
+            </w:pPr>
+            <w:r>
+              <w:t xml:space="preserve">N/A</w:t>
+            </w:r>
+          </w:p>
+        </w:tc>
+      </w:tr>
+      <w:tr>
+        <w:tc>
+          <w:tcPr/>
+          <w:p>
+            <w:pPr>
+              <w:pStyle w:val="Compact"/>
+            </w:pPr>
+            <w:r>
+              <w:t xml:space="preserve">unified-translator</w:t>
+            </w:r>
+          </w:p>
+        </w:tc>
+        <w:tc>
+          <w:tcPr/>
+          <w:p>
+            <w:pPr>
+              <w:pStyle w:val="Compact"/>
+            </w:pPr>
+            <w:r>
+              <w:rPr>
+                <w:rStyle w:val="VerbatimChar"/>
+              </w:rPr>
+              <w:t xml:space="preserve">-script</w:t>
+            </w:r>
+            <w:r>
+              <w:t xml:space="preserve"> </w:t>
+            </w:r>
+            <w:r>
+              <w:t xml:space="preserve">(Serbian Cyrillic↔Latin)</w:t>
+            </w:r>
+          </w:p>
+        </w:tc>
+        <w:tc>
+          <w:tcPr/>
+          <w:p>
+            <w:pPr>
+              <w:pStyle w:val="Compact"/>
+            </w:pPr>
+            <w:r>
+              <w:t xml:space="preserve">CLI</w:t>
+            </w:r>
+          </w:p>
+        </w:tc>
+        <w:tc>
+          <w:tcPr/>
+          <w:p>
+            <w:pPr>
+              <w:pStyle w:val="Compact"/>
+            </w:pPr>
+            <w:r>
+              <w:t xml:space="preserve">Implemented</w:t>
+            </w:r>
+          </w:p>
+        </w:tc>
+        <w:tc>
+          <w:tcPr/>
+          <w:p>
+            <w:pPr>
+              <w:pStyle w:val="Compact"/>
+            </w:pPr>
+            <w:r>
+              <w:t xml:space="preserve">Wired</w:t>
+            </w:r>
+          </w:p>
+        </w:tc>
+        <w:tc>
+          <w:tcPr/>
+          <w:p>
+            <w:pPr>
+              <w:pStyle w:val="Compact"/>
+            </w:pPr>
+            <w:r>
+              <w:t xml:space="preserve">Target script (cyrillic/latin) script normalization on real run</w:t>
+            </w:r>
+          </w:p>
+        </w:tc>
+        <w:tc>
+          <w:tcPr/>
+          <w:p>
+            <w:pPr>
+              <w:pStyle w:val="Compact"/>
+            </w:pPr>
+            <w:r>
+              <w:t xml:space="preserve">Not-inventoried</w:t>
+            </w:r>
+          </w:p>
+        </w:tc>
+        <w:tc>
+          <w:tcPr/>
+          <w:p>
+            <w:pPr>
+              <w:pStyle w:val="Compact"/>
+            </w:pPr>
+            <w:r>
+              <w:rPr>
+                <w:b/>
+                <w:bCs/>
+              </w:rPr>
+              <w:t xml:space="preserve">PASS — captured</w:t>
+            </w:r>
+            <w:r>
+              <w:t xml:space="preserve"> </w:t>
+            </w:r>
+            <w:r>
+              <w:t xml:space="preserve">(Wave 3f re-confirm: RUN A</w:t>
+            </w:r>
+            <w:r>
+              <w:t xml:space="preserve"> </w:t>
+            </w:r>
+            <w:r>
+              <w:rPr>
+                <w:rStyle w:val="VerbatimChar"/>
+              </w:rPr>
+              <w:t xml:space="preserve">-script latin</w:t>
+            </w:r>
+            <w:r>
+              <w:t xml:space="preserve"> </w:t>
+            </w:r>
+            <w:r>
+              <w:t xml:space="preserve">“Ovo je testni paragraf…”</w:t>
+            </w:r>
+            <w:r>
+              <w:t xml:space="preserve"> </w:t>
+            </w:r>
+            <w:r>
+              <w:t xml:space="preserve">≠ RUN B</w:t>
+            </w:r>
+            <w:r>
+              <w:t xml:space="preserve"> </w:t>
+            </w:r>
+            <w:r>
+              <w:rPr>
+                <w:rStyle w:val="VerbatimChar"/>
+              </w:rPr>
+              <w:t xml:space="preserve">-script cyrillic</w:t>
+            </w:r>
+            <w:r>
+              <w:t xml:space="preserve"> </w:t>
+            </w:r>
+            <w:r>
+              <w:t xml:space="preserve">“Систем треба да преводи…”</w:t>
+            </w:r>
+            <w:r>
+              <w:t xml:space="preserve"> </w:t>
+            </w:r>
+            <w:r>
+              <w:t xml:space="preserve">— same text, genuinely different script, frame-verified §11.4.107)</w:t>
+            </w:r>
+          </w:p>
+        </w:tc>
+        <w:tc>
+          <w:tcPr/>
+          <w:p>
+            <w:pPr>
+              <w:pStyle w:val="Compact"/>
+            </w:pPr>
+            <w:r>
+              <w:t xml:space="preserve">Confirmed:/Volumes/T7/Downloads/Recordings/helixtranslate-cli-serbian-script-cyrillic-latin_20260615-171843.mp4 (Wave-3f re-confirm: /Volumes/T7/Downloads/Recordings/helix_translate-script-conversion-wave3e-20260616.mp4)</w:t>
             </w:r>
           </w:p>
         </w:tc>

</xml_diff>